<commit_message>
statusreport-4; strona tytulowa; konceptualny i implementacyjny diagram klas
</commit_message>
<xml_diff>
--- a/docs/ProjectDocumentation.docx
+++ b/docs/ProjectDocumentation.docx
@@ -4,6 +4,7 @@
   <w:body>
     <w:p>
       <w:pPr>
+        <w:jc w:val="center"/>
         <w:rPr>
           <w:rFonts w:eastAsiaTheme="minorEastAsia"/>
           <w:b/>
@@ -15,7 +16,543 @@
           <w:rFonts w:eastAsiaTheme="minorEastAsia"/>
           <w:b/>
           <w:bCs/>
-        </w:rPr>
+          <w:noProof/>
+          <w:sz w:val="36"/>
+          <w:szCs w:val="36"/>
+        </w:rPr>
+        <w:drawing>
+          <wp:inline distT="0" distB="0" distL="0" distR="0" wp14:anchorId="1F96C184" wp14:editId="758AA28B">
+            <wp:extent cx="1746250" cy="1746250"/>
+            <wp:effectExtent l="0" t="0" r="6350" b="6350"/>
+            <wp:docPr id="1103682423" name="Obraz 4"/>
+            <wp:cNvGraphicFramePr>
+              <a:graphicFrameLocks xmlns:a="http://schemas.openxmlformats.org/drawingml/2006/main" noChangeAspect="1"/>
+            </wp:cNvGraphicFramePr>
+            <a:graphic xmlns:a="http://schemas.openxmlformats.org/drawingml/2006/main">
+              <a:graphicData uri="http://schemas.openxmlformats.org/drawingml/2006/picture">
+                <pic:pic xmlns:pic="http://schemas.openxmlformats.org/drawingml/2006/picture">
+                  <pic:nvPicPr>
+                    <pic:cNvPr id="0" name="Picture 8"/>
+                    <pic:cNvPicPr>
+                      <a:picLocks noChangeAspect="1" noChangeArrowheads="1"/>
+                    </pic:cNvPicPr>
+                  </pic:nvPicPr>
+                  <pic:blipFill>
+                    <a:blip r:embed="rId5" cstate="print">
+                      <a:extLst>
+                        <a:ext uri="{28A0092B-C50C-407E-A947-70E740481C1C}">
+                          <a14:useLocalDpi xmlns:a14="http://schemas.microsoft.com/office/drawing/2010/main" val="0"/>
+                        </a:ext>
+                      </a:extLst>
+                    </a:blip>
+                    <a:srcRect/>
+                    <a:stretch>
+                      <a:fillRect/>
+                    </a:stretch>
+                  </pic:blipFill>
+                  <pic:spPr bwMode="auto">
+                    <a:xfrm>
+                      <a:off x="0" y="0"/>
+                      <a:ext cx="1746250" cy="1746250"/>
+                    </a:xfrm>
+                    <a:prstGeom prst="rect">
+                      <a:avLst/>
+                    </a:prstGeom>
+                    <a:noFill/>
+                    <a:ln>
+                      <a:noFill/>
+                    </a:ln>
+                  </pic:spPr>
+                </pic:pic>
+              </a:graphicData>
+            </a:graphic>
+          </wp:inline>
+        </w:drawing>
+      </w:r>
+    </w:p>
+    <w:p>
+      <w:pPr>
+        <w:jc w:val="center"/>
+        <w:rPr>
+          <w:rFonts w:eastAsiaTheme="minorEastAsia"/>
+          <w:b/>
+          <w:bCs/>
+          <w:sz w:val="28"/>
+          <w:szCs w:val="28"/>
+        </w:rPr>
+      </w:pPr>
+      <w:r>
+        <w:rPr>
+          <w:rFonts w:eastAsiaTheme="minorEastAsia"/>
+          <w:b/>
+          <w:bCs/>
+          <w:sz w:val="28"/>
+          <w:szCs w:val="28"/>
+        </w:rPr>
+        <w:t>Uniwersytet Warmińsko-Mazurski w Olsztynie</w:t>
+      </w:r>
+    </w:p>
+    <w:p>
+      <w:pPr>
+        <w:jc w:val="center"/>
+        <w:rPr>
+          <w:rFonts w:eastAsiaTheme="minorEastAsia"/>
+          <w:b/>
+          <w:bCs/>
+          <w:sz w:val="28"/>
+          <w:szCs w:val="28"/>
+        </w:rPr>
+      </w:pPr>
+      <w:r>
+        <w:rPr>
+          <w:rFonts w:eastAsiaTheme="minorEastAsia"/>
+          <w:b/>
+          <w:bCs/>
+          <w:sz w:val="28"/>
+          <w:szCs w:val="28"/>
+        </w:rPr>
+        <w:t>Wydział Matematyki i Informatyki</w:t>
+      </w:r>
+    </w:p>
+    <w:p>
+      <w:pPr>
+        <w:jc w:val="center"/>
+        <w:rPr>
+          <w:rFonts w:eastAsiaTheme="minorEastAsia"/>
+          <w:b/>
+          <w:bCs/>
+          <w:sz w:val="28"/>
+          <w:szCs w:val="28"/>
+        </w:rPr>
+      </w:pPr>
+      <w:r>
+        <w:rPr>
+          <w:rFonts w:eastAsiaTheme="minorEastAsia"/>
+          <w:b/>
+          <w:bCs/>
+          <w:sz w:val="28"/>
+          <w:szCs w:val="28"/>
+        </w:rPr>
+        <w:t>Kierunek Informatyka</w:t>
+      </w:r>
+    </w:p>
+    <w:p>
+      <w:pPr>
+        <w:jc w:val="center"/>
+        <w:rPr>
+          <w:rFonts w:eastAsiaTheme="minorEastAsia"/>
+          <w:b/>
+          <w:bCs/>
+        </w:rPr>
+      </w:pPr>
+    </w:p>
+    <w:p>
+      <w:pPr>
+        <w:jc w:val="center"/>
+        <w:rPr>
+          <w:rFonts w:ascii="Roboto" w:eastAsiaTheme="minorEastAsia" w:hAnsi="Roboto"/>
+          <w:b/>
+          <w:bCs/>
+          <w:sz w:val="44"/>
+          <w:szCs w:val="44"/>
+        </w:rPr>
+      </w:pPr>
+      <w:r>
+        <w:rPr>
+          <w:rFonts w:ascii="Roboto" w:eastAsiaTheme="minorEastAsia" w:hAnsi="Roboto"/>
+          <w:b/>
+          <w:bCs/>
+          <w:sz w:val="44"/>
+          <w:szCs w:val="44"/>
+        </w:rPr>
+        <w:t>Projekt Systemu Informatycznego „TurboRower”</w:t>
+      </w:r>
+    </w:p>
+    <w:p>
+      <w:pPr>
+        <w:jc w:val="center"/>
+        <w:rPr>
+          <w:rFonts w:eastAsiaTheme="minorEastAsia"/>
+          <w:i/>
+          <w:iCs/>
+        </w:rPr>
+      </w:pPr>
+      <w:r>
+        <w:rPr>
+          <w:rFonts w:eastAsiaTheme="minorEastAsia"/>
+          <w:i/>
+          <w:iCs/>
+          <w:noProof/>
+        </w:rPr>
+        <mc:AlternateContent>
+          <mc:Choice Requires="wps">
+            <w:drawing>
+              <wp:anchor distT="0" distB="0" distL="114300" distR="114300" simplePos="0" relativeHeight="251665408" behindDoc="0" locked="0" layoutInCell="1" allowOverlap="1" wp14:anchorId="628A942C" wp14:editId="7963488D">
+                <wp:simplePos x="0" y="0"/>
+                <wp:positionH relativeFrom="column">
+                  <wp:posOffset>-552450</wp:posOffset>
+                </wp:positionH>
+                <wp:positionV relativeFrom="paragraph">
+                  <wp:posOffset>265430</wp:posOffset>
+                </wp:positionV>
+                <wp:extent cx="6813550" cy="0"/>
+                <wp:effectExtent l="0" t="0" r="0" b="0"/>
+                <wp:wrapNone/>
+                <wp:docPr id="1266790085" name="Łącznik prosty 5"/>
+                <wp:cNvGraphicFramePr/>
+                <a:graphic xmlns:a="http://schemas.openxmlformats.org/drawingml/2006/main">
+                  <a:graphicData uri="http://schemas.microsoft.com/office/word/2010/wordprocessingShape">
+                    <wps:wsp>
+                      <wps:cNvCnPr/>
+                      <wps:spPr>
+                        <a:xfrm>
+                          <a:off x="0" y="0"/>
+                          <a:ext cx="6813550" cy="0"/>
+                        </a:xfrm>
+                        <a:prstGeom prst="line">
+                          <a:avLst/>
+                        </a:prstGeom>
+                        <a:ln>
+                          <a:solidFill>
+                            <a:schemeClr val="tx1">
+                              <a:lumMod val="65000"/>
+                              <a:lumOff val="35000"/>
+                            </a:schemeClr>
+                          </a:solidFill>
+                        </a:ln>
+                      </wps:spPr>
+                      <wps:style>
+                        <a:lnRef idx="1">
+                          <a:schemeClr val="dk1"/>
+                        </a:lnRef>
+                        <a:fillRef idx="0">
+                          <a:schemeClr val="dk1"/>
+                        </a:fillRef>
+                        <a:effectRef idx="0">
+                          <a:schemeClr val="dk1"/>
+                        </a:effectRef>
+                        <a:fontRef idx="minor">
+                          <a:schemeClr val="tx1"/>
+                        </a:fontRef>
+                      </wps:style>
+                      <wps:bodyPr/>
+                    </wps:wsp>
+                  </a:graphicData>
+                </a:graphic>
+              </wp:anchor>
+            </w:drawing>
+          </mc:Choice>
+          <mc:Fallback>
+            <w:pict>
+              <v:line w14:anchorId="68D2DEBB" id="Łącznik prosty 5" o:spid="_x0000_s1026" style="position:absolute;z-index:251665408;visibility:visible;mso-wrap-style:square;mso-wrap-distance-left:9pt;mso-wrap-distance-top:0;mso-wrap-distance-right:9pt;mso-wrap-distance-bottom:0;mso-position-horizontal:absolute;mso-position-horizontal-relative:text;mso-position-vertical:absolute;mso-position-vertical-relative:text" from="-43.5pt,20.9pt" to="493pt,20.9pt" o:gfxdata="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" strokecolor="#5a5a5a [2109]" strokeweight=".5pt">
+                <v:stroke joinstyle="miter"/>
+              </v:line>
+            </w:pict>
+          </mc:Fallback>
+        </mc:AlternateContent>
+      </w:r>
+      <w:r>
+        <w:rPr>
+          <w:rFonts w:eastAsiaTheme="minorEastAsia"/>
+          <w:i/>
+          <w:iCs/>
+        </w:rPr>
+        <w:t>System zarządzania siecią hulajnóg i rowerów miejskich</w:t>
+      </w:r>
+    </w:p>
+    <w:p>
+      <w:pPr>
+        <w:jc w:val="center"/>
+        <w:rPr>
+          <w:rFonts w:eastAsiaTheme="minorEastAsia"/>
+          <w:i/>
+          <w:iCs/>
+        </w:rPr>
+      </w:pPr>
+    </w:p>
+    <w:p>
+      <w:pPr>
+        <w:jc w:val="center"/>
+        <w:rPr>
+          <w:rFonts w:eastAsiaTheme="minorEastAsia"/>
+          <w:i/>
+          <w:iCs/>
+        </w:rPr>
+      </w:pPr>
+    </w:p>
+    <w:p>
+      <w:pPr>
+        <w:jc w:val="center"/>
+        <w:rPr>
+          <w:rFonts w:eastAsiaTheme="minorEastAsia"/>
+          <w:i/>
+          <w:iCs/>
+        </w:rPr>
+      </w:pPr>
+    </w:p>
+    <w:p>
+      <w:pPr>
+        <w:jc w:val="center"/>
+        <w:rPr>
+          <w:rFonts w:eastAsiaTheme="minorEastAsia"/>
+          <w:i/>
+          <w:iCs/>
+        </w:rPr>
+      </w:pPr>
+    </w:p>
+    <w:p>
+      <w:pPr>
+        <w:jc w:val="center"/>
+        <w:rPr>
+          <w:rFonts w:eastAsiaTheme="minorEastAsia"/>
+          <w:i/>
+          <w:iCs/>
+        </w:rPr>
+      </w:pPr>
+    </w:p>
+    <w:p>
+      <w:pPr>
+        <w:jc w:val="center"/>
+        <w:rPr>
+          <w:rFonts w:eastAsiaTheme="minorEastAsia"/>
+          <w:i/>
+          <w:iCs/>
+        </w:rPr>
+      </w:pPr>
+    </w:p>
+    <w:p>
+      <w:pPr>
+        <w:rPr>
+          <w:rFonts w:eastAsiaTheme="minorEastAsia"/>
+          <w:i/>
+          <w:iCs/>
+        </w:rPr>
+      </w:pPr>
+    </w:p>
+    <w:p>
+      <w:pPr>
+        <w:rPr>
+          <w:rFonts w:eastAsiaTheme="minorEastAsia"/>
+          <w:b/>
+          <w:bCs/>
+        </w:rPr>
+      </w:pPr>
+    </w:p>
+    <w:p>
+      <w:pPr>
+        <w:rPr>
+          <w:rFonts w:eastAsiaTheme="minorEastAsia"/>
+          <w:b/>
+          <w:bCs/>
+        </w:rPr>
+      </w:pPr>
+    </w:p>
+    <w:p>
+      <w:pPr>
+        <w:rPr>
+          <w:rFonts w:eastAsiaTheme="minorEastAsia"/>
+          <w:b/>
+          <w:bCs/>
+        </w:rPr>
+      </w:pPr>
+    </w:p>
+    <w:tbl>
+      <w:tblPr>
+        <w:tblStyle w:val="Tabela-Siatka"/>
+        <w:tblpPr w:leftFromText="142" w:rightFromText="142" w:vertAnchor="page" w:horzAnchor="margin" w:tblpXSpec="right" w:tblpY="13761"/>
+        <w:tblOverlap w:val="never"/>
+        <w:tblW w:w="0" w:type="auto"/>
+        <w:tblBorders>
+          <w:top w:val="none" w:sz="0" w:space="0" w:color="auto"/>
+          <w:left w:val="none" w:sz="0" w:space="0" w:color="auto"/>
+          <w:bottom w:val="none" w:sz="0" w:space="0" w:color="auto"/>
+          <w:right w:val="none" w:sz="0" w:space="0" w:color="auto"/>
+          <w:insideH w:val="none" w:sz="0" w:space="0" w:color="auto"/>
+          <w:insideV w:val="none" w:sz="0" w:space="0" w:color="auto"/>
+        </w:tblBorders>
+        <w:tblLook w:val="04A0" w:firstRow="1" w:lastRow="0" w:firstColumn="1" w:lastColumn="0" w:noHBand="0" w:noVBand="1"/>
+      </w:tblPr>
+      <w:tblGrid>
+        <w:gridCol w:w="1859"/>
+        <w:gridCol w:w="1114"/>
+      </w:tblGrid>
+      <w:tr>
+        <w:tc>
+          <w:tcPr>
+            <w:tcW w:w="1859" w:type="dxa"/>
+          </w:tcPr>
+          <w:p>
+            <w:pPr>
+              <w:rPr>
+                <w:rFonts w:eastAsiaTheme="minorEastAsia"/>
+              </w:rPr>
+            </w:pPr>
+            <w:r>
+              <w:rPr>
+                <w:rFonts w:eastAsiaTheme="minorEastAsia"/>
+              </w:rPr>
+              <w:t>Damian Elsner</w:t>
+            </w:r>
+          </w:p>
+        </w:tc>
+        <w:tc>
+          <w:tcPr>
+            <w:tcW w:w="1114" w:type="dxa"/>
+          </w:tcPr>
+          <w:p>
+            <w:pPr>
+              <w:rPr>
+                <w:rFonts w:eastAsiaTheme="minorEastAsia"/>
+              </w:rPr>
+            </w:pPr>
+            <w:r>
+              <w:rPr>
+                <w:rFonts w:eastAsiaTheme="minorEastAsia"/>
+              </w:rPr>
+              <w:t>180587</w:t>
+            </w:r>
+          </w:p>
+        </w:tc>
+      </w:tr>
+      <w:tr>
+        <w:tc>
+          <w:tcPr>
+            <w:tcW w:w="1859" w:type="dxa"/>
+          </w:tcPr>
+          <w:p>
+            <w:pPr>
+              <w:rPr>
+                <w:rFonts w:eastAsiaTheme="minorEastAsia"/>
+              </w:rPr>
+            </w:pPr>
+            <w:r>
+              <w:rPr>
+                <w:rFonts w:eastAsiaTheme="minorEastAsia"/>
+              </w:rPr>
+              <w:t>Adrian Dunal</w:t>
+            </w:r>
+          </w:p>
+        </w:tc>
+        <w:tc>
+          <w:tcPr>
+            <w:tcW w:w="1114" w:type="dxa"/>
+          </w:tcPr>
+          <w:p>
+            <w:pPr>
+              <w:rPr>
+                <w:rFonts w:eastAsiaTheme="minorEastAsia"/>
+              </w:rPr>
+            </w:pPr>
+            <w:r>
+              <w:rPr>
+                <w:rFonts w:eastAsiaTheme="minorEastAsia"/>
+              </w:rPr>
+              <w:t>180585</w:t>
+            </w:r>
+          </w:p>
+        </w:tc>
+      </w:tr>
+      <w:tr>
+        <w:tc>
+          <w:tcPr>
+            <w:tcW w:w="1859" w:type="dxa"/>
+          </w:tcPr>
+          <w:p>
+            <w:pPr>
+              <w:rPr>
+                <w:rFonts w:eastAsiaTheme="minorEastAsia"/>
+              </w:rPr>
+            </w:pPr>
+            <w:r>
+              <w:rPr>
+                <w:rFonts w:eastAsiaTheme="minorEastAsia"/>
+              </w:rPr>
+              <w:t>Maria Radzka</w:t>
+            </w:r>
+          </w:p>
+        </w:tc>
+        <w:tc>
+          <w:tcPr>
+            <w:tcW w:w="1114" w:type="dxa"/>
+          </w:tcPr>
+          <w:p>
+            <w:pPr>
+              <w:rPr>
+                <w:rFonts w:eastAsiaTheme="minorEastAsia"/>
+              </w:rPr>
+            </w:pPr>
+            <w:r>
+              <w:rPr>
+                <w:rFonts w:eastAsiaTheme="minorEastAsia"/>
+              </w:rPr>
+              <w:t>180???</w:t>
+            </w:r>
+          </w:p>
+        </w:tc>
+      </w:tr>
+    </w:tbl>
+    <w:p>
+      <w:pPr>
+        <w:rPr>
+          <w:rFonts w:eastAsiaTheme="minorEastAsia"/>
+          <w:b/>
+          <w:bCs/>
+        </w:rPr>
+      </w:pPr>
+    </w:p>
+    <w:p>
+      <w:pPr>
+        <w:jc w:val="center"/>
+        <w:rPr>
+          <w:rFonts w:eastAsiaTheme="minorEastAsia"/>
+          <w:b/>
+          <w:bCs/>
+        </w:rPr>
+      </w:pPr>
+    </w:p>
+    <w:p>
+      <w:pPr>
+        <w:jc w:val="center"/>
+        <w:rPr>
+          <w:rFonts w:eastAsiaTheme="minorEastAsia"/>
+          <w:b/>
+          <w:bCs/>
+        </w:rPr>
+      </w:pPr>
+    </w:p>
+    <w:p>
+      <w:pPr>
+        <w:jc w:val="center"/>
+        <w:rPr>
+          <w:rFonts w:eastAsiaTheme="minorEastAsia"/>
+          <w:b/>
+          <w:bCs/>
+        </w:rPr>
+      </w:pPr>
+      <w:r>
+        <w:rPr>
+          <w:rFonts w:eastAsiaTheme="minorEastAsia"/>
+          <w:b/>
+          <w:bCs/>
+        </w:rPr>
+        <w:t>Olsztyn 2026</w:t>
+      </w:r>
+    </w:p>
+    <w:p>
+      <w:pPr>
+        <w:rPr>
+          <w:rFonts w:eastAsiaTheme="minorEastAsia"/>
+          <w:b/>
+          <w:bCs/>
+        </w:rPr>
+      </w:pPr>
+      <w:r>
+        <w:rPr>
+          <w:rFonts w:eastAsiaTheme="minorEastAsia"/>
+          <w:b/>
+          <w:bCs/>
+        </w:rPr>
+        <w:lastRenderedPageBreak/>
         <w:t>Dziedzina:</w:t>
       </w:r>
       <w:r>
@@ -325,7 +862,7 @@
               <w:rPr>
                 <w:rFonts w:eastAsiaTheme="minorEastAsia"/>
               </w:rPr>
-              <w:t>Pojazd</w:t>
+              <w:t>Dostawca usługi loT</w:t>
             </w:r>
           </w:p>
         </w:tc>
@@ -547,19 +1084,7 @@
               <w:rPr>
                 <w:rFonts w:eastAsiaTheme="minorEastAsia"/>
               </w:rPr>
-              <w:t>Numer seryjny, adres</w:t>
-            </w:r>
-            <w:r>
-              <w:rPr>
-                <w:rFonts w:eastAsiaTheme="minorEastAsia"/>
-              </w:rPr>
-              <w:t xml:space="preserve"> </w:t>
-            </w:r>
-            <w:r>
-              <w:rPr>
-                <w:rFonts w:eastAsiaTheme="minorEastAsia"/>
-              </w:rPr>
-              <w:t>(GPS), typ usterki</w:t>
+              <w:t>Numer seryjny, adres (GPS), typ usterki</w:t>
             </w:r>
           </w:p>
         </w:tc>
@@ -601,19 +1126,7 @@
               <w:rPr>
                 <w:rFonts w:eastAsiaTheme="minorEastAsia"/>
               </w:rPr>
-              <w:t>Zarząd Dróg Miejskich</w:t>
-            </w:r>
-            <w:r>
-              <w:rPr>
-                <w:rFonts w:eastAsiaTheme="minorEastAsia"/>
-              </w:rPr>
-              <w:t xml:space="preserve"> </w:t>
-            </w:r>
-            <w:r>
-              <w:rPr>
-                <w:rFonts w:eastAsiaTheme="minorEastAsia"/>
-              </w:rPr>
-              <w:t>(pośrednio)</w:t>
+              <w:t>Zarząd Dróg Miejskich (pośrednio)</w:t>
             </w:r>
           </w:p>
         </w:tc>
@@ -915,19 +1428,7 @@
         <w:rPr>
           <w:rFonts w:eastAsiaTheme="minorEastAsia"/>
         </w:rPr>
-        <w:t xml:space="preserve"> </w:t>
-      </w:r>
-      <w:r>
-        <w:rPr>
-          <w:rFonts w:eastAsiaTheme="minorEastAsia"/>
-        </w:rPr>
-        <w:t>-</w:t>
-      </w:r>
-      <w:r>
-        <w:rPr>
-          <w:rFonts w:eastAsiaTheme="minorEastAsia"/>
-        </w:rPr>
-        <w:t xml:space="preserve"> osoba fizyczna korzystająca z aplikacji mobilnej do wypożyczenia pojazdu</w:t>
+        <w:t xml:space="preserve"> - osoba fizyczna korzystająca z aplikacji mobilnej do wypożyczenia pojazdu</w:t>
       </w:r>
     </w:p>
     <w:p>
@@ -943,25 +1444,25 @@
           <w:b/>
           <w:bCs/>
         </w:rPr>
-        <w:t>Pojazd</w:t>
+        <w:t>Dostawca usługi loT</w:t>
       </w:r>
       <w:r>
         <w:rPr>
           <w:rFonts w:eastAsiaTheme="minorEastAsia"/>
         </w:rPr>
-        <w:t xml:space="preserve"> </w:t>
+        <w:t xml:space="preserve"> - </w:t>
       </w:r>
       <w:r>
         <w:rPr>
           <w:rFonts w:eastAsiaTheme="minorEastAsia"/>
         </w:rPr>
-        <w:t>-</w:t>
+        <w:t>z</w:t>
       </w:r>
       <w:r>
         <w:rPr>
           <w:rFonts w:eastAsiaTheme="minorEastAsia"/>
         </w:rPr>
-        <w:t xml:space="preserve"> hulajnoga elektryczna lub rower wyposażony w moduł GPS i komunikację GSM</w:t>
+        <w:t>ewnętrzny system/partner dostarczający dane telemetryczne (GPS, stan baterii) oraz infrastrukturę komunikacyjną (GSM) między pojazdem a systemem centralnym.</w:t>
       </w:r>
     </w:p>
     <w:p>
@@ -983,19 +1484,7 @@
         <w:rPr>
           <w:rFonts w:eastAsiaTheme="minorEastAsia"/>
         </w:rPr>
-        <w:t xml:space="preserve"> </w:t>
-      </w:r>
-      <w:r>
-        <w:rPr>
-          <w:rFonts w:eastAsiaTheme="minorEastAsia"/>
-        </w:rPr>
-        <w:t>-</w:t>
-      </w:r>
-      <w:r>
-        <w:rPr>
-          <w:rFonts w:eastAsiaTheme="minorEastAsia"/>
-        </w:rPr>
-        <w:t xml:space="preserve"> pracownicy odpowiedzialni za ładowanie i serwis techniczny w terenie</w:t>
+        <w:t xml:space="preserve"> - pracownicy odpowiedzialni za ładowanie i serwis techniczny w terenie</w:t>
       </w:r>
     </w:p>
     <w:p>
@@ -1017,19 +1506,7 @@
         <w:rPr>
           <w:rFonts w:eastAsiaTheme="minorEastAsia"/>
         </w:rPr>
-        <w:t xml:space="preserve"> </w:t>
-      </w:r>
-      <w:r>
-        <w:rPr>
-          <w:rFonts w:eastAsiaTheme="minorEastAsia"/>
-        </w:rPr>
-        <w:t>-</w:t>
-      </w:r>
-      <w:r>
-        <w:rPr>
-          <w:rFonts w:eastAsiaTheme="minorEastAsia"/>
-        </w:rPr>
-        <w:t xml:space="preserve"> obszar na mapie z przypisanymi regułami (np. zakaz zakończenia przejazdu)</w:t>
+        <w:t xml:space="preserve"> - obszar na mapie z przypisanymi regułami (np. zakaz zakończenia przejazdu)</w:t>
       </w:r>
     </w:p>
     <w:p>
@@ -1051,37 +1528,7 @@
         <w:rPr>
           <w:rFonts w:eastAsiaTheme="minorEastAsia"/>
         </w:rPr>
-        <w:t xml:space="preserve"> </w:t>
-      </w:r>
-      <w:r>
-        <w:rPr>
-          <w:rFonts w:eastAsiaTheme="minorEastAsia"/>
-        </w:rPr>
-        <w:t>-</w:t>
-      </w:r>
-      <w:r>
-        <w:rPr>
-          <w:rFonts w:eastAsiaTheme="minorEastAsia"/>
-        </w:rPr>
-        <w:t xml:space="preserve"> system zewnętrzny (np.</w:t>
-      </w:r>
-      <w:r>
-        <w:rPr>
-          <w:rFonts w:eastAsiaTheme="minorEastAsia"/>
-        </w:rPr>
-        <w:t xml:space="preserve"> </w:t>
-      </w:r>
-      <w:r>
-        <w:rPr>
-          <w:rFonts w:eastAsiaTheme="minorEastAsia"/>
-        </w:rPr>
-        <w:t>Przelewy24</w:t>
-      </w:r>
-      <w:r>
-        <w:rPr>
-          <w:rFonts w:eastAsiaTheme="minorEastAsia"/>
-        </w:rPr>
-        <w:t>, PayU) realizujący transakcje</w:t>
+        <w:t xml:space="preserve"> - system zewnętrzny (np. Przelewy24, PayU) realizujący transakcje</w:t>
       </w:r>
     </w:p>
     <w:p>
@@ -1103,19 +1550,7 @@
         <w:rPr>
           <w:rFonts w:eastAsiaTheme="minorEastAsia"/>
         </w:rPr>
-        <w:t xml:space="preserve"> </w:t>
-      </w:r>
-      <w:r>
-        <w:rPr>
-          <w:rFonts w:eastAsiaTheme="minorEastAsia"/>
-        </w:rPr>
-        <w:t>-</w:t>
-      </w:r>
-      <w:r>
-        <w:rPr>
-          <w:rFonts w:eastAsiaTheme="minorEastAsia"/>
-        </w:rPr>
-        <w:t xml:space="preserve"> zbiór reguł cenowych (opłata startowa, koszt minuty, koszt subskrypcji)</w:t>
+        <w:t xml:space="preserve"> - zbiór reguł cenowych (opłata startowa, koszt minuty, koszt subskrypcji)</w:t>
       </w:r>
     </w:p>
     <w:p>
@@ -1137,19 +1572,7 @@
         <w:rPr>
           <w:rFonts w:eastAsiaTheme="minorEastAsia"/>
         </w:rPr>
-        <w:t xml:space="preserve"> </w:t>
-      </w:r>
-      <w:r>
-        <w:rPr>
-          <w:rFonts w:eastAsiaTheme="minorEastAsia"/>
-        </w:rPr>
-        <w:t>-</w:t>
-      </w:r>
-      <w:r>
-        <w:rPr>
-          <w:rFonts w:eastAsiaTheme="minorEastAsia"/>
-        </w:rPr>
-        <w:t xml:space="preserve"> automatyczny komunikat o konieczności interwencji przy danym pojeździe</w:t>
+        <w:t xml:space="preserve"> - automatyczny komunikat o konieczności interwencji przy danym pojeździe</w:t>
       </w:r>
     </w:p>
     <w:p>
@@ -1161,21 +1584,22 @@
       </w:pPr>
       <w:r>
         <w:rPr>
+          <w:rFonts w:eastAsiaTheme="minorEastAsia"/>
           <w:noProof/>
         </w:rPr>
         <w:drawing>
-          <wp:anchor distT="0" distB="0" distL="114300" distR="114300" simplePos="0" relativeHeight="251658240" behindDoc="1" locked="0" layoutInCell="1" allowOverlap="1" wp14:anchorId="192224C3" wp14:editId="4F9E17DD">
+          <wp:anchor distT="0" distB="0" distL="114300" distR="114300" simplePos="0" relativeHeight="251663360" behindDoc="0" locked="0" layoutInCell="1" allowOverlap="1" wp14:anchorId="70E350FD" wp14:editId="5BA6FF35">
             <wp:simplePos x="0" y="0"/>
             <wp:positionH relativeFrom="margin">
               <wp:align>center</wp:align>
             </wp:positionH>
             <wp:positionV relativeFrom="paragraph">
-              <wp:posOffset>410845</wp:posOffset>
+              <wp:posOffset>402590</wp:posOffset>
             </wp:positionV>
-            <wp:extent cx="4800600" cy="2317224"/>
-            <wp:effectExtent l="0" t="0" r="0" b="6985"/>
+            <wp:extent cx="4635500" cy="2366716"/>
+            <wp:effectExtent l="0" t="0" r="0" b="0"/>
             <wp:wrapNone/>
-            <wp:docPr id="391198871" name="drawing"/>
+            <wp:docPr id="1958793583" name="Obraz 2"/>
             <wp:cNvGraphicFramePr>
               <a:graphicFrameLocks xmlns:a="http://schemas.openxmlformats.org/drawingml/2006/main" noChangeAspect="1"/>
             </wp:cNvGraphicFramePr>
@@ -1183,30 +1607,36 @@
               <a:graphicData uri="http://schemas.openxmlformats.org/drawingml/2006/picture">
                 <pic:pic xmlns:pic="http://schemas.openxmlformats.org/drawingml/2006/picture">
                   <pic:nvPicPr>
-                    <pic:cNvPr id="173673041" name="Picture 173673041"/>
-                    <pic:cNvPicPr/>
+                    <pic:cNvPr id="0" name="Picture 6"/>
+                    <pic:cNvPicPr>
+                      <a:picLocks noChangeAspect="1" noChangeArrowheads="1"/>
+                    </pic:cNvPicPr>
                   </pic:nvPicPr>
                   <pic:blipFill>
-                    <a:blip r:embed="rId5">
+                    <a:blip r:embed="rId6">
                       <a:extLst>
                         <a:ext uri="{28A0092B-C50C-407E-A947-70E740481C1C}">
                           <a14:useLocalDpi xmlns:a14="http://schemas.microsoft.com/office/drawing/2010/main" val="0"/>
                         </a:ext>
                       </a:extLst>
                     </a:blip>
-                    <a:srcRect l="12254"/>
+                    <a:srcRect/>
                     <a:stretch>
                       <a:fillRect/>
                     </a:stretch>
                   </pic:blipFill>
-                  <pic:spPr>
+                  <pic:spPr bwMode="auto">
                     <a:xfrm>
                       <a:off x="0" y="0"/>
-                      <a:ext cx="4800600" cy="2317224"/>
+                      <a:ext cx="4635500" cy="2366716"/>
                     </a:xfrm>
                     <a:prstGeom prst="rect">
                       <a:avLst/>
                     </a:prstGeom>
+                    <a:noFill/>
+                    <a:ln>
+                      <a:noFill/>
+                    </a:ln>
                   </pic:spPr>
                 </pic:pic>
               </a:graphicData>
@@ -1232,19 +1662,7 @@
         <w:rPr>
           <w:rFonts w:eastAsiaTheme="minorEastAsia"/>
         </w:rPr>
-        <w:t xml:space="preserve"> </w:t>
-      </w:r>
-      <w:r>
-        <w:rPr>
-          <w:rFonts w:eastAsiaTheme="minorEastAsia"/>
-        </w:rPr>
-        <w:t>-</w:t>
-      </w:r>
-      <w:r>
-        <w:rPr>
-          <w:rFonts w:eastAsiaTheme="minorEastAsia"/>
-        </w:rPr>
-        <w:t xml:space="preserve"> informacja o sprawności hamulców, oświetlenia i modułów elektronicznych</w:t>
+        <w:t xml:space="preserve"> - informacja o sprawności hamulców, oświetlenia i modułów elektronicznych</w:t>
       </w:r>
     </w:p>
     <w:p>
@@ -1282,14 +1700,6 @@
     <w:p>
       <w:pPr>
         <w:spacing w:after="0" w:line="276" w:lineRule="auto"/>
-        <w:rPr>
-          <w:rFonts w:eastAsiaTheme="minorEastAsia"/>
-        </w:rPr>
-      </w:pPr>
-    </w:p>
-    <w:p>
-      <w:pPr>
-        <w:spacing w:after="299"/>
         <w:rPr>
           <w:rFonts w:eastAsiaTheme="minorEastAsia"/>
         </w:rPr>
@@ -1317,7 +1727,6 @@
           <w:sz w:val="28"/>
           <w:szCs w:val="28"/>
         </w:rPr>
-        <w:lastRenderedPageBreak/>
         <w:t>Opis wymagań na poziomie wizji systemu – TurboRower</w:t>
       </w:r>
     </w:p>
@@ -1343,18 +1752,7 @@
           <w:sz w:val="24"/>
           <w:szCs w:val="24"/>
         </w:rPr>
-        <w:t>Dziedzina problemu</w:t>
-      </w:r>
-      <w:r>
-        <w:rPr>
-          <w:rFonts w:asciiTheme="minorHAnsi" w:eastAsiaTheme="minorEastAsia" w:hAnsiTheme="minorHAnsi" w:cstheme="minorBidi"/>
-          <w:b/>
-          <w:bCs/>
-          <w:color w:val="auto"/>
-          <w:sz w:val="24"/>
-          <w:szCs w:val="24"/>
-        </w:rPr>
-        <w:t xml:space="preserve">:  </w:t>
+        <w:t xml:space="preserve">Dziedzina problemu:  </w:t>
       </w:r>
       <w:r>
         <w:rPr>
@@ -1810,14 +2208,6 @@
     </w:p>
     <w:p>
       <w:pPr>
-        <w:spacing w:before="240" w:after="240"/>
-        <w:rPr>
-          <w:rFonts w:eastAsiaTheme="minorEastAsia"/>
-        </w:rPr>
-      </w:pPr>
-    </w:p>
-    <w:p>
-      <w:pPr>
         <w:pStyle w:val="Nagwek2"/>
         <w:spacing w:before="0" w:after="299"/>
         <w:rPr>
@@ -1944,13 +2334,7 @@
         <w:rPr>
           <w:rFonts w:eastAsiaTheme="minorEastAsia"/>
         </w:rPr>
-        <w:t xml:space="preserve"> Definiowanie obszarów z ograniczeniami</w:t>
-      </w:r>
-      <w:r>
-        <w:rPr>
-          <w:rFonts w:eastAsiaTheme="minorEastAsia"/>
-        </w:rPr>
-        <w:t>.</w:t>
+        <w:t xml:space="preserve"> Definiowanie obszarów z ograniczeniami.</w:t>
       </w:r>
     </w:p>
     <w:p>
@@ -2064,13 +2448,27 @@
           <w:b/>
           <w:bCs/>
         </w:rPr>
-        <w:t>Pojazd:</w:t>
+        <w:t>Dostawca usługi loT</w:t>
       </w:r>
       <w:r>
         <w:rPr>
           <w:rFonts w:eastAsiaTheme="minorEastAsia"/>
-        </w:rPr>
-        <w:t xml:space="preserve"> Hulajnoga lub rower z modułem GPS i GSM.</w:t>
+          <w:b/>
+          <w:bCs/>
+        </w:rPr>
+        <w:t>:</w:t>
+      </w:r>
+      <w:r>
+        <w:rPr>
+          <w:rFonts w:eastAsiaTheme="minorEastAsia"/>
+        </w:rPr>
+        <w:t xml:space="preserve"> </w:t>
+      </w:r>
+      <w:r>
+        <w:rPr>
+          <w:rFonts w:eastAsiaTheme="minorEastAsia"/>
+        </w:rPr>
+        <w:t>podmiot zewnętrzny lub platforma technologiczna odpowiedzialna za transmisję danych z urządzeń pomiarowych. Dostarcza do systemu informacje w czasie rzeczywistym (telemetrię) oraz umożliwia zdalne sterowanie funkcjami pojazdu (np. blokada silnika).</w:t>
       </w:r>
     </w:p>
     <w:p>
@@ -2374,7 +2772,15 @@
           <w:b/>
           <w:bCs/>
         </w:rPr>
-        <w:t>Pojazd:</w:t>
+        <w:t>Dostawca usługi loT</w:t>
+      </w:r>
+      <w:r>
+        <w:rPr>
+          <w:rFonts w:eastAsiaTheme="minorEastAsia"/>
+          <w:b/>
+          <w:bCs/>
+        </w:rPr>
+        <w:t>:</w:t>
       </w:r>
       <w:r>
         <w:rPr>
@@ -2425,35 +2831,21 @@
       <w:r>
         <w:rPr>
           <w:rFonts w:eastAsiaTheme="minorEastAsia"/>
-          <w:b/>
-          <w:bCs/>
-        </w:rPr>
-        <w:t>Operator Płatności:</w:t>
-      </w:r>
-      <w:r>
-        <w:rPr>
-          <w:rFonts w:eastAsiaTheme="minorEastAsia"/>
-        </w:rPr>
-        <w:t xml:space="preserve"> Realizuje transakcje finansowe.</w:t>
-      </w:r>
-    </w:p>
-    <w:p>
-      <w:pPr>
-        <w:spacing w:before="240" w:after="240"/>
-        <w:rPr>
-          <w:rFonts w:eastAsiaTheme="minorEastAsia"/>
-        </w:rPr>
-      </w:pPr>
-      <w:r>
-        <w:rPr>
-          <w:rFonts w:eastAsiaTheme="minorEastAsia"/>
           <w:noProof/>
         </w:rPr>
         <w:drawing>
-          <wp:inline distT="0" distB="0" distL="0" distR="0" wp14:anchorId="3717A770" wp14:editId="793FC380">
-            <wp:extent cx="5727700" cy="4025900"/>
-            <wp:effectExtent l="0" t="0" r="6350" b="0"/>
-            <wp:docPr id="2013236356" name="Obraz 1"/>
+          <wp:anchor distT="0" distB="0" distL="114300" distR="114300" simplePos="0" relativeHeight="251664384" behindDoc="0" locked="0" layoutInCell="1" allowOverlap="1" wp14:anchorId="3099737D" wp14:editId="09F05715">
+            <wp:simplePos x="0" y="0"/>
+            <wp:positionH relativeFrom="margin">
+              <wp:align>center</wp:align>
+            </wp:positionH>
+            <wp:positionV relativeFrom="paragraph">
+              <wp:posOffset>566420</wp:posOffset>
+            </wp:positionV>
+            <wp:extent cx="5238750" cy="2846705"/>
+            <wp:effectExtent l="0" t="0" r="0" b="0"/>
+            <wp:wrapSquare wrapText="bothSides"/>
+            <wp:docPr id="1889993712" name="Obraz 3"/>
             <wp:cNvGraphicFramePr>
               <a:graphicFrameLocks xmlns:a="http://schemas.openxmlformats.org/drawingml/2006/main" noChangeAspect="1"/>
             </wp:cNvGraphicFramePr>
@@ -2461,13 +2853,13 @@
               <a:graphicData uri="http://schemas.openxmlformats.org/drawingml/2006/picture">
                 <pic:pic xmlns:pic="http://schemas.openxmlformats.org/drawingml/2006/picture">
                   <pic:nvPicPr>
-                    <pic:cNvPr id="0" name="Picture 1"/>
+                    <pic:cNvPr id="0" name="Picture 7"/>
                     <pic:cNvPicPr>
                       <a:picLocks noChangeAspect="1" noChangeArrowheads="1"/>
                     </pic:cNvPicPr>
                   </pic:nvPicPr>
                   <pic:blipFill>
-                    <a:blip r:embed="rId6" cstate="print">
+                    <a:blip r:embed="rId7">
                       <a:extLst>
                         <a:ext uri="{28A0092B-C50C-407E-A947-70E740481C1C}">
                           <a14:useLocalDpi xmlns:a14="http://schemas.microsoft.com/office/drawing/2010/main" val="0"/>
@@ -2482,7 +2874,7 @@
                   <pic:spPr bwMode="auto">
                     <a:xfrm>
                       <a:off x="0" y="0"/>
-                      <a:ext cx="5727700" cy="4025900"/>
+                      <a:ext cx="5238750" cy="2846705"/>
                     </a:xfrm>
                     <a:prstGeom prst="rect">
                       <a:avLst/>
@@ -2495,9 +2887,61 @@
                 </pic:pic>
               </a:graphicData>
             </a:graphic>
-          </wp:inline>
+            <wp14:sizeRelH relativeFrom="margin">
+              <wp14:pctWidth>0</wp14:pctWidth>
+            </wp14:sizeRelH>
+            <wp14:sizeRelV relativeFrom="margin">
+              <wp14:pctHeight>0</wp14:pctHeight>
+            </wp14:sizeRelV>
+          </wp:anchor>
         </w:drawing>
       </w:r>
+      <w:r>
+        <w:rPr>
+          <w:rFonts w:eastAsiaTheme="minorEastAsia"/>
+          <w:b/>
+          <w:bCs/>
+        </w:rPr>
+        <w:t>Operator Płatności:</w:t>
+      </w:r>
+      <w:r>
+        <w:rPr>
+          <w:rFonts w:eastAsiaTheme="minorEastAsia"/>
+        </w:rPr>
+        <w:t xml:space="preserve"> Realizuje transakcje finansowe.</w:t>
+      </w:r>
+    </w:p>
+    <w:p>
+      <w:pPr>
+        <w:spacing w:before="240" w:after="240"/>
+        <w:rPr>
+          <w:rFonts w:eastAsiaTheme="minorEastAsia"/>
+        </w:rPr>
+      </w:pPr>
+    </w:p>
+    <w:p>
+      <w:pPr>
+        <w:spacing w:before="240" w:after="240"/>
+        <w:rPr>
+          <w:rFonts w:eastAsiaTheme="minorEastAsia"/>
+        </w:rPr>
+      </w:pPr>
+    </w:p>
+    <w:p>
+      <w:pPr>
+        <w:spacing w:before="240" w:after="240"/>
+        <w:rPr>
+          <w:rFonts w:eastAsiaTheme="minorEastAsia"/>
+        </w:rPr>
+      </w:pPr>
+    </w:p>
+    <w:p>
+      <w:pPr>
+        <w:spacing w:before="240" w:after="240"/>
+        <w:rPr>
+          <w:rFonts w:eastAsiaTheme="minorEastAsia"/>
+        </w:rPr>
+      </w:pPr>
     </w:p>
     <w:p>
       <w:pPr>
@@ -2568,19 +3012,7 @@
         <w:rPr>
           <w:rFonts w:eastAsiaTheme="minorEastAsia"/>
         </w:rPr>
-        <w:t xml:space="preserve">Diagram systemowy </w:t>
-      </w:r>
-      <w:r>
-        <w:rPr>
-          <w:rFonts w:eastAsiaTheme="minorEastAsia"/>
-        </w:rPr>
-        <w:t xml:space="preserve">opisuje </w:t>
-      </w:r>
-      <w:r>
-        <w:rPr>
-          <w:rFonts w:eastAsiaTheme="minorEastAsia"/>
-        </w:rPr>
-        <w:t>funkcje wewnątrz systemu oraz relacje między nimi.</w:t>
+        <w:t>Diagram systemowy opisuje funkcje wewnątrz systemu oraz relacje między nimi.</w:t>
       </w:r>
     </w:p>
     <w:p>
@@ -2798,7 +3230,15 @@
           <w:b/>
           <w:bCs/>
         </w:rPr>
-        <w:t>Pojazd:</w:t>
+        <w:t>Dostawca usługi loT</w:t>
+      </w:r>
+      <w:r>
+        <w:rPr>
+          <w:rFonts w:eastAsiaTheme="minorEastAsia"/>
+          <w:b/>
+          <w:bCs/>
+        </w:rPr>
+        <w:t>:</w:t>
       </w:r>
     </w:p>
     <w:p>
@@ -2996,13 +3436,13 @@
           <w:noProof/>
         </w:rPr>
         <w:drawing>
-          <wp:anchor distT="0" distB="0" distL="114300" distR="114300" simplePos="0" relativeHeight="251663360" behindDoc="0" locked="0" layoutInCell="1" allowOverlap="1" wp14:anchorId="6CA00368" wp14:editId="58F428CB">
+          <wp:anchor distT="0" distB="0" distL="114300" distR="114300" simplePos="0" relativeHeight="251659264" behindDoc="0" locked="0" layoutInCell="1" allowOverlap="1" wp14:anchorId="64497DD8" wp14:editId="726DB0AA">
             <wp:simplePos x="0" y="0"/>
             <wp:positionH relativeFrom="margin">
               <wp:align>center</wp:align>
             </wp:positionH>
             <wp:positionV relativeFrom="paragraph">
-              <wp:posOffset>333375</wp:posOffset>
+              <wp:posOffset>333817</wp:posOffset>
             </wp:positionV>
             <wp:extent cx="5103495" cy="3511670"/>
             <wp:effectExtent l="0" t="0" r="1905" b="0"/>
@@ -3021,7 +3461,7 @@
                     </pic:cNvPicPr>
                   </pic:nvPicPr>
                   <pic:blipFill>
-                    <a:blip r:embed="rId7" cstate="print">
+                    <a:blip r:embed="rId8" cstate="print">
                       <a:extLst>
                         <a:ext uri="{28A0092B-C50C-407E-A947-70E740481C1C}">
                           <a14:useLocalDpi xmlns:a14="http://schemas.microsoft.com/office/drawing/2010/main" val="0"/>
@@ -3075,6 +3515,128 @@
     </w:p>
     <w:p>
       <w:pPr>
+        <w:spacing w:before="240" w:after="240" w:line="240" w:lineRule="auto"/>
+        <w:rPr>
+          <w:rFonts w:eastAsiaTheme="minorEastAsia"/>
+        </w:rPr>
+      </w:pPr>
+      <w:r>
+        <w:rPr>
+          <w:rStyle w:val="Nagwek1Znak"/>
+          <w:color w:val="auto"/>
+        </w:rPr>
+        <w:lastRenderedPageBreak/>
+        <w:t>Skład pojedynczego scenariusza:</w:t>
+      </w:r>
+      <w:r>
+        <w:rPr>
+          <w:rFonts w:eastAsiaTheme="minorEastAsia"/>
+        </w:rPr>
+        <w:br/>
+        <w:t>S(n).1. Nazwa</w:t>
+      </w:r>
+      <w:r>
+        <w:rPr>
+          <w:rFonts w:eastAsiaTheme="minorEastAsia"/>
+        </w:rPr>
+        <w:br/>
+        <w:t>S(n).2. Numer</w:t>
+      </w:r>
+      <w:r>
+        <w:rPr>
+          <w:rFonts w:eastAsiaTheme="minorEastAsia"/>
+        </w:rPr>
+        <w:br/>
+        <w:t>S(n).3. Twórca</w:t>
+      </w:r>
+      <w:r>
+        <w:rPr>
+          <w:rFonts w:eastAsiaTheme="minorEastAsia"/>
+        </w:rPr>
+        <w:br/>
+        <w:t>S(n).4. Poziom ważności</w:t>
+      </w:r>
+      <w:r>
+        <w:rPr>
+          <w:rFonts w:eastAsiaTheme="minorEastAsia"/>
+        </w:rPr>
+        <w:br/>
+        <w:t>S(n).5. Typ przypadku użycia</w:t>
+      </w:r>
+      <w:r>
+        <w:rPr>
+          <w:rFonts w:eastAsiaTheme="minorEastAsia"/>
+        </w:rPr>
+        <w:br/>
+        <w:t>S(n).6. Aktorzy</w:t>
+      </w:r>
+      <w:r>
+        <w:rPr>
+          <w:rFonts w:eastAsiaTheme="minorEastAsia"/>
+        </w:rPr>
+        <w:br/>
+        <w:t>S(n).7. Krótki opis</w:t>
+      </w:r>
+      <w:r>
+        <w:rPr>
+          <w:rFonts w:eastAsiaTheme="minorEastAsia"/>
+        </w:rPr>
+        <w:br/>
+        <w:t>S(n).8. Warunki wstępne</w:t>
+      </w:r>
+      <w:r>
+        <w:rPr>
+          <w:rFonts w:eastAsiaTheme="minorEastAsia"/>
+        </w:rPr>
+        <w:br/>
+        <w:t>S(n).9. Warunki końcowe</w:t>
+      </w:r>
+      <w:r>
+        <w:rPr>
+          <w:rFonts w:eastAsiaTheme="minorEastAsia"/>
+        </w:rPr>
+        <w:br/>
+        <w:t>S(n).10. Główny przepływ zdarzeń</w:t>
+      </w:r>
+      <w:r>
+        <w:rPr>
+          <w:rFonts w:eastAsiaTheme="minorEastAsia"/>
+        </w:rPr>
+        <w:br/>
+        <w:t>S(n).11. Alternatywne przepływy</w:t>
+      </w:r>
+      <w:r>
+        <w:rPr>
+          <w:rFonts w:eastAsiaTheme="minorEastAsia"/>
+        </w:rPr>
+        <w:br/>
+        <w:t>S(n).12. Wyjątki w przepływach</w:t>
+      </w:r>
+      <w:r>
+        <w:rPr>
+          <w:rFonts w:eastAsiaTheme="minorEastAsia"/>
+        </w:rPr>
+        <w:br/>
+        <w:t>S(n).13. Specjalne wymagania</w:t>
+      </w:r>
+      <w:r>
+        <w:rPr>
+          <w:rFonts w:eastAsiaTheme="minorEastAsia"/>
+        </w:rPr>
+        <w:br/>
+        <w:t>S(n).14. Notatki i kwestie</w:t>
+      </w:r>
+    </w:p>
+    <w:p>
+      <w:pPr>
+        <w:spacing w:before="240" w:after="240" w:line="240" w:lineRule="auto"/>
+        <w:rPr>
+          <w:rFonts w:eastAsiaTheme="minorEastAsia"/>
+        </w:rPr>
+      </w:pPr>
+    </w:p>
+    <w:p>
+      <w:pPr>
         <w:pStyle w:val="Nagwek2"/>
         <w:rPr>
           <w:b/>
@@ -3088,7 +3650,6 @@
           <w:bCs/>
           <w:color w:val="auto"/>
         </w:rPr>
-        <w:lastRenderedPageBreak/>
         <w:t>UC-01: Logowanie / Autoryzacja</w:t>
       </w:r>
     </w:p>
@@ -3926,6 +4487,7 @@
                 <w:sz w:val="20"/>
                 <w:szCs w:val="20"/>
               </w:rPr>
+              <w:lastRenderedPageBreak/>
               <w:t>Główny przepływ zdarzeń</w:t>
             </w:r>
           </w:p>
@@ -4330,7 +4892,6 @@
                 <w:sz w:val="20"/>
                 <w:szCs w:val="20"/>
               </w:rPr>
-              <w:lastRenderedPageBreak/>
               <w:t>4b. Konto zablokowane: System informuje o blokadzie konta przez administratora.</w:t>
             </w:r>
           </w:p>
@@ -4390,7 +4951,6 @@
                 <w:sz w:val="20"/>
                 <w:szCs w:val="20"/>
               </w:rPr>
-              <w:lastRenderedPageBreak/>
               <w:t>Specjalne wymagania</w:t>
             </w:r>
           </w:p>
@@ -4521,7 +5081,7 @@
           <w:noProof/>
         </w:rPr>
         <w:drawing>
-          <wp:inline distT="0" distB="0" distL="0" distR="0" wp14:anchorId="1D686165" wp14:editId="486D30C3">
+          <wp:inline distT="0" distB="0" distL="0" distR="0" wp14:anchorId="751F6ADB" wp14:editId="51535290">
             <wp:extent cx="5721350" cy="2984500"/>
             <wp:effectExtent l="0" t="0" r="0" b="6350"/>
             <wp:docPr id="1442175989" name="Obraz 1"/>
@@ -4538,7 +5098,7 @@
                     </pic:cNvPicPr>
                   </pic:nvPicPr>
                   <pic:blipFill>
-                    <a:blip r:embed="rId8" cstate="print">
+                    <a:blip r:embed="rId9" cstate="print">
                       <a:extLst>
                         <a:ext uri="{28A0092B-C50C-407E-A947-70E740481C1C}">
                           <a14:useLocalDpi xmlns:a14="http://schemas.microsoft.com/office/drawing/2010/main" val="0"/>
@@ -4586,6 +5146,7 @@
           <w:bCs/>
           <w:color w:val="auto"/>
         </w:rPr>
+        <w:lastRenderedPageBreak/>
         <w:t>UC-02: Rezerwacja pojazdu</w:t>
       </w:r>
     </w:p>
@@ -5027,7 +5588,6 @@
                 <w:sz w:val="20"/>
                 <w:szCs w:val="20"/>
               </w:rPr>
-              <w:lastRenderedPageBreak/>
               <w:t>Typ przypadku użycia</w:t>
             </w:r>
           </w:p>
@@ -5760,6 +6320,7 @@
                 <w:sz w:val="20"/>
                 <w:szCs w:val="20"/>
               </w:rPr>
+              <w:lastRenderedPageBreak/>
               <w:t>Specjalne wymagania</w:t>
             </w:r>
           </w:p>
@@ -5884,9 +6445,8 @@
         <w:rPr>
           <w:noProof/>
         </w:rPr>
-        <w:lastRenderedPageBreak/>
         <w:drawing>
-          <wp:inline distT="0" distB="0" distL="0" distR="0" wp14:anchorId="1FF49736" wp14:editId="0559BB74">
+          <wp:inline distT="0" distB="0" distL="0" distR="0" wp14:anchorId="049333A9" wp14:editId="1E31899A">
             <wp:extent cx="5461000" cy="3943350"/>
             <wp:effectExtent l="0" t="0" r="6350" b="0"/>
             <wp:docPr id="1760607127" name="Obraz 2"/>
@@ -5903,7 +6463,7 @@
                     </pic:cNvPicPr>
                   </pic:nvPicPr>
                   <pic:blipFill>
-                    <a:blip r:embed="rId9">
+                    <a:blip r:embed="rId10">
                       <a:extLst>
                         <a:ext uri="{28A0092B-C50C-407E-A947-70E740481C1C}">
                           <a14:useLocalDpi xmlns:a14="http://schemas.microsoft.com/office/drawing/2010/main" val="0"/>
@@ -6402,6 +6962,7 @@
                 <w:sz w:val="20"/>
                 <w:szCs w:val="20"/>
               </w:rPr>
+              <w:lastRenderedPageBreak/>
               <w:t>Typ przypadku użycia</w:t>
             </w:r>
           </w:p>
@@ -6514,7 +7075,14 @@
                 <w:sz w:val="20"/>
                 <w:szCs w:val="20"/>
               </w:rPr>
-              <w:t>Użytkownik, Pojazd</w:t>
+              <w:t xml:space="preserve">Użytkownik, </w:t>
+            </w:r>
+            <w:r>
+              <w:rPr>
+                <w:sz w:val="20"/>
+                <w:szCs w:val="20"/>
+              </w:rPr>
+              <w:t>Dostawca usługi loT</w:t>
             </w:r>
           </w:p>
         </w:tc>
@@ -6633,7 +7201,6 @@
                 <w:sz w:val="20"/>
                 <w:szCs w:val="20"/>
               </w:rPr>
-              <w:lastRenderedPageBreak/>
               <w:t>Warunki wstępne</w:t>
             </w:r>
           </w:p>
@@ -7278,8 +7845,9 @@
         <w:rPr>
           <w:noProof/>
         </w:rPr>
+        <w:lastRenderedPageBreak/>
         <w:drawing>
-          <wp:anchor distT="0" distB="0" distL="114300" distR="114300" simplePos="0" relativeHeight="251665408" behindDoc="0" locked="0" layoutInCell="1" allowOverlap="1" wp14:anchorId="5E78F388" wp14:editId="6123908E">
+          <wp:anchor distT="0" distB="0" distL="114300" distR="114300" simplePos="0" relativeHeight="251660288" behindDoc="0" locked="0" layoutInCell="1" allowOverlap="1" wp14:anchorId="6D789D0D" wp14:editId="472E0032">
             <wp:simplePos x="0" y="0"/>
             <wp:positionH relativeFrom="margin">
               <wp:align>center</wp:align>
@@ -7304,7 +7872,7 @@
                     </pic:cNvPicPr>
                   </pic:nvPicPr>
                   <pic:blipFill>
-                    <a:blip r:embed="rId10" cstate="print">
+                    <a:blip r:embed="rId11" cstate="print">
                       <a:extLst>
                         <a:ext uri="{28A0092B-C50C-407E-A947-70E740481C1C}">
                           <a14:useLocalDpi xmlns:a14="http://schemas.microsoft.com/office/drawing/2010/main" val="0"/>
@@ -7352,7 +7920,6 @@
           <w:bCs/>
           <w:color w:val="auto"/>
         </w:rPr>
-        <w:lastRenderedPageBreak/>
         <w:t>UC-04: Zgłoś usterkę</w:t>
       </w:r>
     </w:p>
@@ -8178,6 +8745,7 @@
                 <w:sz w:val="20"/>
                 <w:szCs w:val="20"/>
               </w:rPr>
+              <w:lastRenderedPageBreak/>
               <w:t>Główny przepływ zdarzeń</w:t>
             </w:r>
           </w:p>
@@ -8557,7 +9125,6 @@
                 <w:sz w:val="20"/>
                 <w:szCs w:val="20"/>
               </w:rPr>
-              <w:lastRenderedPageBreak/>
               <w:t>Notatki i kwestie</w:t>
             </w:r>
           </w:p>
@@ -8605,7 +9172,7 @@
           <w:noProof/>
         </w:rPr>
         <w:drawing>
-          <wp:anchor distT="0" distB="0" distL="114300" distR="114300" simplePos="0" relativeHeight="251666432" behindDoc="0" locked="0" layoutInCell="1" allowOverlap="1" wp14:anchorId="2C6D83DC" wp14:editId="00685476">
+          <wp:anchor distT="0" distB="0" distL="114300" distR="114300" simplePos="0" relativeHeight="251661312" behindDoc="0" locked="0" layoutInCell="1" allowOverlap="1" wp14:anchorId="4ACA5D66" wp14:editId="506DE6B9">
             <wp:simplePos x="0" y="0"/>
             <wp:positionH relativeFrom="margin">
               <wp:align>center</wp:align>
@@ -8630,7 +9197,7 @@
                     </pic:cNvPicPr>
                   </pic:nvPicPr>
                   <pic:blipFill>
-                    <a:blip r:embed="rId11" cstate="print">
+                    <a:blip r:embed="rId12" cstate="print">
                       <a:extLst>
                         <a:ext uri="{28A0092B-C50C-407E-A947-70E740481C1C}">
                           <a14:useLocalDpi xmlns:a14="http://schemas.microsoft.com/office/drawing/2010/main" val="0"/>
@@ -8856,6 +9423,7 @@
                 <w:sz w:val="20"/>
                 <w:szCs w:val="20"/>
               </w:rPr>
+              <w:lastRenderedPageBreak/>
               <w:t>Nazwa</w:t>
             </w:r>
           </w:p>
@@ -9276,7 +9844,14 @@
                 <w:sz w:val="20"/>
                 <w:szCs w:val="20"/>
               </w:rPr>
-              <w:t>Operator floty, Pojazd</w:t>
+              <w:t xml:space="preserve">Operator floty, </w:t>
+            </w:r>
+            <w:r>
+              <w:rPr>
+                <w:sz w:val="20"/>
+                <w:szCs w:val="20"/>
+              </w:rPr>
+              <w:t>Dostawca usługi loT</w:t>
             </w:r>
           </w:p>
         </w:tc>
@@ -9395,7 +9970,6 @@
                 <w:sz w:val="20"/>
                 <w:szCs w:val="20"/>
               </w:rPr>
-              <w:lastRenderedPageBreak/>
               <w:t>Warunki wstępne</w:t>
             </w:r>
           </w:p>
@@ -10017,8 +10591,9 @@
         <w:rPr>
           <w:noProof/>
         </w:rPr>
+        <w:lastRenderedPageBreak/>
         <w:drawing>
-          <wp:inline distT="0" distB="0" distL="0" distR="0" wp14:anchorId="3D7CD58F" wp14:editId="7919AC9C">
+          <wp:inline distT="0" distB="0" distL="0" distR="0" wp14:anchorId="23392ACA" wp14:editId="632B4A38">
             <wp:extent cx="5727700" cy="3041650"/>
             <wp:effectExtent l="0" t="0" r="6350" b="6350"/>
             <wp:docPr id="78083042" name="Obraz 5"/>
@@ -10035,7 +10610,7 @@
                     </pic:cNvPicPr>
                   </pic:nvPicPr>
                   <pic:blipFill>
-                    <a:blip r:embed="rId12">
+                    <a:blip r:embed="rId13">
                       <a:extLst>
                         <a:ext uri="{28A0092B-C50C-407E-A947-70E740481C1C}">
                           <a14:useLocalDpi xmlns:a14="http://schemas.microsoft.com/office/drawing/2010/main" val="0"/>
@@ -10083,7 +10658,6 @@
           <w:bCs/>
           <w:color w:val="auto"/>
         </w:rPr>
-        <w:lastRenderedPageBreak/>
         <w:t>UC-06: Rozliczenie transakcji</w:t>
       </w:r>
     </w:p>
@@ -10910,6 +11484,7 @@
                 <w:sz w:val="20"/>
                 <w:szCs w:val="20"/>
               </w:rPr>
+              <w:lastRenderedPageBreak/>
               <w:t>Główny przepływ zdarzeń</w:t>
             </w:r>
           </w:p>
@@ -11318,7 +11893,6 @@
                 <w:sz w:val="20"/>
                 <w:szCs w:val="20"/>
               </w:rPr>
-              <w:lastRenderedPageBreak/>
               <w:t>Notatki i kwestie</w:t>
             </w:r>
           </w:p>
@@ -11366,8 +11940,9 @@
         <w:rPr>
           <w:noProof/>
         </w:rPr>
+        <w:lastRenderedPageBreak/>
         <w:drawing>
-          <wp:inline distT="0" distB="0" distL="0" distR="0" wp14:anchorId="68FFC6D8" wp14:editId="377C3525">
+          <wp:inline distT="0" distB="0" distL="0" distR="0" wp14:anchorId="0ECB2116" wp14:editId="21C0FB32">
             <wp:extent cx="5721350" cy="4845050"/>
             <wp:effectExtent l="0" t="0" r="0" b="0"/>
             <wp:docPr id="1666936192" name="Obraz 6"/>
@@ -11384,7 +11959,7 @@
                     </pic:cNvPicPr>
                   </pic:nvPicPr>
                   <pic:blipFill>
-                    <a:blip r:embed="rId13" cstate="print">
+                    <a:blip r:embed="rId14" cstate="print">
                       <a:extLst>
                         <a:ext uri="{28A0092B-C50C-407E-A947-70E740481C1C}">
                           <a14:useLocalDpi xmlns:a14="http://schemas.microsoft.com/office/drawing/2010/main" val="0"/>
@@ -11872,7 +12447,6 @@
                 <w:sz w:val="20"/>
                 <w:szCs w:val="20"/>
               </w:rPr>
-              <w:lastRenderedPageBreak/>
               <w:t>Typ przypadku użycia</w:t>
             </w:r>
           </w:p>
@@ -11950,6 +12524,7 @@
                 <w:sz w:val="20"/>
                 <w:szCs w:val="20"/>
               </w:rPr>
+              <w:lastRenderedPageBreak/>
               <w:t>Aktorzy</w:t>
             </w:r>
           </w:p>
@@ -12699,9 +13274,8 @@
         <w:rPr>
           <w:noProof/>
         </w:rPr>
-        <w:lastRenderedPageBreak/>
         <w:drawing>
-          <wp:anchor distT="0" distB="0" distL="114300" distR="114300" simplePos="0" relativeHeight="251667456" behindDoc="0" locked="0" layoutInCell="1" allowOverlap="1" wp14:anchorId="330F9CC4" wp14:editId="48344C61">
+          <wp:anchor distT="0" distB="0" distL="114300" distR="114300" simplePos="0" relativeHeight="251662336" behindDoc="0" locked="0" layoutInCell="1" allowOverlap="1" wp14:anchorId="03717B78" wp14:editId="339A56F4">
             <wp:simplePos x="0" y="0"/>
             <wp:positionH relativeFrom="margin">
               <wp:align>center</wp:align>
@@ -12726,7 +13300,7 @@
                     </pic:cNvPicPr>
                   </pic:nvPicPr>
                   <pic:blipFill>
-                    <a:blip r:embed="rId14" cstate="print">
+                    <a:blip r:embed="rId15" cstate="print">
                       <a:extLst>
                         <a:ext uri="{28A0092B-C50C-407E-A947-70E740481C1C}">
                           <a14:useLocalDpi xmlns:a14="http://schemas.microsoft.com/office/drawing/2010/main" val="0"/>
@@ -13679,7 +14253,6 @@
                 <w:sz w:val="20"/>
                 <w:szCs w:val="20"/>
               </w:rPr>
-              <w:lastRenderedPageBreak/>
               <w:t>Główny przepływ zdarzeń</w:t>
             </w:r>
           </w:p>
@@ -14059,6 +14632,7 @@
                 <w:sz w:val="20"/>
                 <w:szCs w:val="20"/>
               </w:rPr>
+              <w:lastRenderedPageBreak/>
               <w:t>Notatki i kwestie</w:t>
             </w:r>
           </w:p>
@@ -14107,7 +14681,7 @@
           <w:noProof/>
         </w:rPr>
         <w:drawing>
-          <wp:inline distT="0" distB="0" distL="0" distR="0" wp14:anchorId="3DAABB4B" wp14:editId="59DFF167">
+          <wp:inline distT="0" distB="0" distL="0" distR="0" wp14:anchorId="4306967F" wp14:editId="6EC86764">
             <wp:extent cx="5727700" cy="4616450"/>
             <wp:effectExtent l="0" t="0" r="6350" b="0"/>
             <wp:docPr id="338549726" name="Obraz 8"/>
@@ -14124,7 +14698,7 @@
                     </pic:cNvPicPr>
                   </pic:nvPicPr>
                   <pic:blipFill>
-                    <a:blip r:embed="rId15">
+                    <a:blip r:embed="rId16">
                       <a:extLst>
                         <a:ext uri="{28A0092B-C50C-407E-A947-70E740481C1C}">
                           <a14:useLocalDpi xmlns:a14="http://schemas.microsoft.com/office/drawing/2010/main" val="0"/>
@@ -14158,13 +14732,145 @@
     </w:p>
     <w:p>
       <w:pPr>
+        <w:pStyle w:val="Nagwek1"/>
+        <w:rPr>
+          <w:color w:val="auto"/>
+        </w:rPr>
+      </w:pPr>
+      <w:r>
+        <w:rPr>
+          <w:color w:val="auto"/>
+        </w:rPr>
+        <w:lastRenderedPageBreak/>
+        <w:t>Konceptualny diagram klas</w:t>
+      </w:r>
+    </w:p>
+    <w:p>
+      <w:pPr>
         <w:spacing w:before="240" w:after="240"/>
         <w:rPr>
           <w:rFonts w:eastAsiaTheme="minorEastAsia"/>
         </w:rPr>
       </w:pPr>
+      <w:r>
+        <w:rPr>
+          <w:rFonts w:eastAsiaTheme="minorEastAsia"/>
+          <w:noProof/>
+        </w:rPr>
+        <w:drawing>
+          <wp:inline distT="0" distB="0" distL="0" distR="0" wp14:anchorId="19335EB1" wp14:editId="62C46D69">
+            <wp:extent cx="5731510" cy="4032885"/>
+            <wp:effectExtent l="0" t="0" r="2540" b="5715"/>
+            <wp:docPr id="727992353" name="Obraz 2"/>
+            <wp:cNvGraphicFramePr>
+              <a:graphicFrameLocks xmlns:a="http://schemas.openxmlformats.org/drawingml/2006/main" noChangeAspect="1"/>
+            </wp:cNvGraphicFramePr>
+            <a:graphic xmlns:a="http://schemas.openxmlformats.org/drawingml/2006/main">
+              <a:graphicData uri="http://schemas.openxmlformats.org/drawingml/2006/picture">
+                <pic:pic xmlns:pic="http://schemas.openxmlformats.org/drawingml/2006/picture">
+                  <pic:nvPicPr>
+                    <pic:cNvPr id="727992353" name="Obraz 727992353"/>
+                    <pic:cNvPicPr/>
+                  </pic:nvPicPr>
+                  <pic:blipFill>
+                    <a:blip r:embed="rId17" cstate="print">
+                      <a:extLst>
+                        <a:ext uri="{28A0092B-C50C-407E-A947-70E740481C1C}">
+                          <a14:useLocalDpi xmlns:a14="http://schemas.microsoft.com/office/drawing/2010/main" val="0"/>
+                        </a:ext>
+                      </a:extLst>
+                    </a:blip>
+                    <a:stretch>
+                      <a:fillRect/>
+                    </a:stretch>
+                  </pic:blipFill>
+                  <pic:spPr>
+                    <a:xfrm>
+                      <a:off x="0" y="0"/>
+                      <a:ext cx="5731510" cy="4032885"/>
+                    </a:xfrm>
+                    <a:prstGeom prst="rect">
+                      <a:avLst/>
+                    </a:prstGeom>
+                  </pic:spPr>
+                </pic:pic>
+              </a:graphicData>
+            </a:graphic>
+          </wp:inline>
+        </w:drawing>
+      </w:r>
+    </w:p>
+    <w:p>
+      <w:pPr>
+        <w:pStyle w:val="Nagwek1"/>
+        <w:rPr>
+          <w:color w:val="auto"/>
+        </w:rPr>
+      </w:pPr>
+      <w:r>
+        <w:rPr>
+          <w:color w:val="auto"/>
+        </w:rPr>
+        <w:t>Implementacyjny diagram klas</w:t>
+      </w:r>
+    </w:p>
+    <w:p>
+      <w:pPr>
+        <w:spacing w:before="240" w:after="240"/>
+        <w:rPr>
+          <w:rFonts w:eastAsiaTheme="minorEastAsia"/>
+        </w:rPr>
+      </w:pPr>
+      <w:r>
+        <w:rPr>
+          <w:rFonts w:eastAsiaTheme="minorEastAsia"/>
+          <w:noProof/>
+        </w:rPr>
+        <w:drawing>
+          <wp:inline distT="0" distB="0" distL="0" distR="0" wp14:anchorId="24A64F6E" wp14:editId="1B41F339">
+            <wp:extent cx="5731510" cy="3425190"/>
+            <wp:effectExtent l="0" t="0" r="2540" b="3810"/>
+            <wp:docPr id="1121119403" name="Obraz 6"/>
+            <wp:cNvGraphicFramePr>
+              <a:graphicFrameLocks xmlns:a="http://schemas.openxmlformats.org/drawingml/2006/main" noChangeAspect="1"/>
+            </wp:cNvGraphicFramePr>
+            <a:graphic xmlns:a="http://schemas.openxmlformats.org/drawingml/2006/main">
+              <a:graphicData uri="http://schemas.openxmlformats.org/drawingml/2006/picture">
+                <pic:pic xmlns:pic="http://schemas.openxmlformats.org/drawingml/2006/picture">
+                  <pic:nvPicPr>
+                    <pic:cNvPr id="1121119403" name="Obraz 1121119403"/>
+                    <pic:cNvPicPr/>
+                  </pic:nvPicPr>
+                  <pic:blipFill>
+                    <a:blip r:embed="rId18">
+                      <a:extLst>
+                        <a:ext uri="{28A0092B-C50C-407E-A947-70E740481C1C}">
+                          <a14:useLocalDpi xmlns:a14="http://schemas.microsoft.com/office/drawing/2010/main" val="0"/>
+                        </a:ext>
+                      </a:extLst>
+                    </a:blip>
+                    <a:stretch>
+                      <a:fillRect/>
+                    </a:stretch>
+                  </pic:blipFill>
+                  <pic:spPr>
+                    <a:xfrm>
+                      <a:off x="0" y="0"/>
+                      <a:ext cx="5731510" cy="3425190"/>
+                    </a:xfrm>
+                    <a:prstGeom prst="rect">
+                      <a:avLst/>
+                    </a:prstGeom>
+                  </pic:spPr>
+                </pic:pic>
+              </a:graphicData>
+            </a:graphic>
+          </wp:inline>
+        </w:drawing>
+      </w:r>
     </w:p>
     <w:sectPr>
+      <w:footerReference w:type="default" r:id="rId19"/>
       <w:pgSz w:w="11906" w:h="16838"/>
       <w:pgMar w:top="1440" w:right="1440" w:bottom="1440" w:left="1440" w:header="708" w:footer="708" w:gutter="0"/>
       <w:cols w:space="708"/>
@@ -14172,6 +14878,21 @@
     </w:sectPr>
   </w:body>
 </w:document>
+</file>
+
+<file path=word/footer1.xml><?xml version="1.0" encoding="utf-8"?>
+<w:ftr xmlns:wpc="http://schemas.microsoft.com/office/word/2010/wordprocessingCanvas" xmlns:cx="http://schemas.microsoft.com/office/drawing/2014/chartex" xmlns:cx1="http://schemas.microsoft.com/office/drawing/2015/9/8/chartex" xmlns:cx2="http://schemas.microsoft.com/office/drawing/2015/10/21/chartex" xmlns:cx3="http://schemas.microsoft.com/office/drawing/2016/5/9/chartex" xmlns:cx4="http://schemas.microsoft.com/office/drawing/2016/5/10/chartex" xmlns:cx5="http://schemas.microsoft.com/office/drawing/2016/5/11/chartex" xmlns:cx6="http://schemas.microsoft.com/office/drawing/2016/5/12/chartex" xmlns:cx7="http://schemas.microsoft.com/office/drawing/2016/5/13/chartex" xmlns:cx8="http://schemas.microsoft.com/office/drawing/2016/5/14/chartex" xmlns:mc="http://schemas.openxmlformats.org/markup-compatibility/2006" xmlns:aink="http://schemas.microsoft.com/office/drawing/2016/ink" xmlns:am3d="http://schemas.microsoft.com/office/drawing/2017/model3d" xmlns:o="urn:schemas-microsoft-com:office:office" xmlns:oel="http://schemas.microsoft.com/office/2019/extlst" xmlns:r="http://schemas.openxmlformats.org/officeDocument/2006/relationships" xmlns:m="http://schemas.openxmlformats.org/officeDocument/2006/math" xmlns:v="urn:schemas-microsoft-com:vml" xmlns:wp14="http://schemas.microsoft.com/office/word/2010/wordprocessingDrawing" xmlns:wp="http://schemas.openxmlformats.org/drawingml/2006/wordprocessingDrawing" xmlns:w10="urn:schemas-microsoft-com:office:word" xmlns:w="http://schemas.openxmlformats.org/wordprocessingml/2006/main" xmlns:w14="http://schemas.microsoft.com/office/word/2010/wordml" xmlns:w15="http://schemas.microsoft.com/office/word/2012/wordml" xmlns:w16cex="http://schemas.microsoft.com/office/word/2018/wordml/cex" xmlns:w16cid="http://schemas.microsoft.com/office/word/2016/wordml/cid" xmlns:w16="http://schemas.microsoft.com/office/word/2018/wordml" xmlns:w16du="http://schemas.microsoft.com/office/word/2023/wordml/word16du" xmlns:w16sdtdh="http://schemas.microsoft.com/office/word/2020/wordml/sdtdatahash" xmlns:w16sdtfl="http://schemas.microsoft.com/office/word/2024/wordml/sdtformatlock" xmlns:w16se="http://schemas.microsoft.com/office/word/2015/wordml/symex" xmlns:wpg="http://schemas.microsoft.com/office/word/2010/wordprocessingGroup" xmlns:wpi="http://schemas.microsoft.com/office/word/2010/wordprocessingInk" xmlns:wne="http://schemas.microsoft.com/office/word/2006/wordml" xmlns:wps="http://schemas.microsoft.com/office/word/2010/wordprocessingShape" mc:Ignorable="w14 w15 w16se w16cid w16 w16cex w16sdtdh w16sdtfl w16du wp14">
+  <w:p>
+    <w:pPr>
+      <w:pStyle w:val="Stopka"/>
+    </w:pPr>
+  </w:p>
+  <w:p>
+    <w:pPr>
+      <w:pStyle w:val="Stopka"/>
+    </w:pPr>
+  </w:p>
+</w:ftr>
 </file>
 
 <file path=word/numbering.xml><?xml version="1.0" encoding="utf-8"?>
@@ -18654,6 +19375,27 @@
     <w:name w:val="Normal"/>
     <w:qFormat/>
   </w:style>
+  <w:style w:type="paragraph" w:styleId="Nagwek1">
+    <w:name w:val="heading 1"/>
+    <w:basedOn w:val="Normalny"/>
+    <w:next w:val="Normalny"/>
+    <w:link w:val="Nagwek1Znak"/>
+    <w:uiPriority w:val="9"/>
+    <w:qFormat/>
+    <w:rsid w:val="00D64724"/>
+    <w:pPr>
+      <w:keepNext/>
+      <w:keepLines/>
+      <w:spacing w:before="240" w:after="0"/>
+      <w:outlineLvl w:val="0"/>
+    </w:pPr>
+    <w:rPr>
+      <w:rFonts w:asciiTheme="majorHAnsi" w:eastAsiaTheme="majorEastAsia" w:hAnsiTheme="majorHAnsi" w:cstheme="majorBidi"/>
+      <w:color w:val="0F4761" w:themeColor="accent1" w:themeShade="BF"/>
+      <w:sz w:val="32"/>
+      <w:szCs w:val="32"/>
+    </w:rPr>
+  </w:style>
   <w:style w:type="paragraph" w:styleId="Nagwek2">
     <w:name w:val="heading 2"/>
     <w:uiPriority w:val="9"/>
@@ -18728,6 +19470,41 @@
         <w:insideV w:val="single" w:sz="4" w:space="0" w:color="000000" w:themeColor="text1"/>
       </w:tblBorders>
     </w:tblPr>
+  </w:style>
+  <w:style w:type="character" w:customStyle="1" w:styleId="Nagwek1Znak">
+    <w:name w:val="Nagłówek 1 Znak"/>
+    <w:basedOn w:val="Domylnaczcionkaakapitu"/>
+    <w:link w:val="Nagwek1"/>
+    <w:uiPriority w:val="9"/>
+    <w:rsid w:val="00D64724"/>
+    <w:rPr>
+      <w:rFonts w:asciiTheme="majorHAnsi" w:eastAsiaTheme="majorEastAsia" w:hAnsiTheme="majorHAnsi" w:cstheme="majorBidi"/>
+      <w:color w:val="0F4761" w:themeColor="accent1" w:themeShade="BF"/>
+      <w:sz w:val="32"/>
+      <w:szCs w:val="32"/>
+    </w:rPr>
+  </w:style>
+  <w:style w:type="paragraph" w:styleId="Stopka">
+    <w:name w:val="footer"/>
+    <w:basedOn w:val="Normalny"/>
+    <w:link w:val="StopkaZnak"/>
+    <w:uiPriority w:val="99"/>
+    <w:unhideWhenUsed/>
+    <w:rsid w:val="00D64724"/>
+    <w:pPr>
+      <w:tabs>
+        <w:tab w:val="center" w:pos="4536"/>
+        <w:tab w:val="right" w:pos="9072"/>
+      </w:tabs>
+      <w:spacing w:after="0" w:line="240" w:lineRule="auto"/>
+    </w:pPr>
+  </w:style>
+  <w:style w:type="character" w:customStyle="1" w:styleId="StopkaZnak">
+    <w:name w:val="Stopka Znak"/>
+    <w:basedOn w:val="Domylnaczcionkaakapitu"/>
+    <w:link w:val="Stopka"/>
+    <w:uiPriority w:val="99"/>
+    <w:rsid w:val="00D64724"/>
   </w:style>
 </w:styles>
 </file>

</xml_diff>

<commit_message>
poprawione diagramy, updated changelog
</commit_message>
<xml_diff>
--- a/docs/ProjectDocumentation.docx
+++ b/docs/ProjectDocumentation.docx
@@ -38,7 +38,7 @@
                     </pic:cNvPicPr>
                   </pic:nvPicPr>
                   <pic:blipFill>
-                    <a:blip r:embed="rId5" cstate="print">
+                    <a:blip r:embed="rId7" cstate="print">
                       <a:extLst>
                         <a:ext uri="{28A0092B-C50C-407E-A947-70E740481C1C}">
                           <a14:useLocalDpi xmlns:a14="http://schemas.microsoft.com/office/drawing/2010/main" val="0"/>
@@ -485,7 +485,13 @@
               <w:rPr>
                 <w:rFonts w:eastAsiaTheme="minorEastAsia"/>
               </w:rPr>
-              <w:t>180???</w:t>
+              <w:t>180</w:t>
+            </w:r>
+            <w:r>
+              <w:rPr>
+                <w:rFonts w:eastAsiaTheme="minorEastAsia"/>
+              </w:rPr>
+              <w:t>634</w:t>
             </w:r>
           </w:p>
         </w:tc>
@@ -1613,7 +1619,7 @@
                     </pic:cNvPicPr>
                   </pic:nvPicPr>
                   <pic:blipFill>
-                    <a:blip r:embed="rId6">
+                    <a:blip r:embed="rId8">
                       <a:extLst>
                         <a:ext uri="{28A0092B-C50C-407E-A947-70E740481C1C}">
                           <a14:useLocalDpi xmlns:a14="http://schemas.microsoft.com/office/drawing/2010/main" val="0"/>
@@ -2859,7 +2865,7 @@
                     </pic:cNvPicPr>
                   </pic:nvPicPr>
                   <pic:blipFill>
-                    <a:blip r:embed="rId7">
+                    <a:blip r:embed="rId9">
                       <a:extLst>
                         <a:ext uri="{28A0092B-C50C-407E-A947-70E740481C1C}">
                           <a14:useLocalDpi xmlns:a14="http://schemas.microsoft.com/office/drawing/2010/main" val="0"/>
@@ -3436,18 +3442,18 @@
           <w:noProof/>
         </w:rPr>
         <w:drawing>
-          <wp:anchor distT="0" distB="0" distL="114300" distR="114300" simplePos="0" relativeHeight="251659264" behindDoc="0" locked="0" layoutInCell="1" allowOverlap="1" wp14:anchorId="64497DD8" wp14:editId="726DB0AA">
+          <wp:anchor distT="0" distB="0" distL="114300" distR="114300" simplePos="0" relativeHeight="251666432" behindDoc="0" locked="0" layoutInCell="1" allowOverlap="1" wp14:anchorId="0CEC79B0" wp14:editId="066BD7E3">
             <wp:simplePos x="0" y="0"/>
             <wp:positionH relativeFrom="margin">
-              <wp:align>center</wp:align>
+              <wp:align>left</wp:align>
             </wp:positionH>
             <wp:positionV relativeFrom="paragraph">
-              <wp:posOffset>333817</wp:posOffset>
+              <wp:posOffset>339725</wp:posOffset>
             </wp:positionV>
-            <wp:extent cx="5103495" cy="3511670"/>
-            <wp:effectExtent l="0" t="0" r="1905" b="0"/>
+            <wp:extent cx="5721350" cy="3498850"/>
+            <wp:effectExtent l="0" t="0" r="0" b="6350"/>
             <wp:wrapSquare wrapText="bothSides"/>
-            <wp:docPr id="518669408" name="Obraz 1"/>
+            <wp:docPr id="753606361" name="Obraz 2"/>
             <wp:cNvGraphicFramePr>
               <a:graphicFrameLocks xmlns:a="http://schemas.openxmlformats.org/drawingml/2006/main" noChangeAspect="1"/>
             </wp:cNvGraphicFramePr>
@@ -3461,7 +3467,7 @@
                     </pic:cNvPicPr>
                   </pic:nvPicPr>
                   <pic:blipFill>
-                    <a:blip r:embed="rId8" cstate="print">
+                    <a:blip r:embed="rId10">
                       <a:extLst>
                         <a:ext uri="{28A0092B-C50C-407E-A947-70E740481C1C}">
                           <a14:useLocalDpi xmlns:a14="http://schemas.microsoft.com/office/drawing/2010/main" val="0"/>
@@ -3476,7 +3482,7 @@
                   <pic:spPr bwMode="auto">
                     <a:xfrm>
                       <a:off x="0" y="0"/>
-                      <a:ext cx="5103495" cy="3511670"/>
+                      <a:ext cx="5721350" cy="3498850"/>
                     </a:xfrm>
                     <a:prstGeom prst="rect">
                       <a:avLst/>
@@ -3489,12 +3495,6 @@
                 </pic:pic>
               </a:graphicData>
             </a:graphic>
-            <wp14:sizeRelH relativeFrom="margin">
-              <wp14:pctWidth>0</wp14:pctWidth>
-            </wp14:sizeRelH>
-            <wp14:sizeRelV relativeFrom="margin">
-              <wp14:pctHeight>0</wp14:pctHeight>
-            </wp14:sizeRelV>
           </wp:anchor>
         </w:drawing>
       </w:r>
@@ -3511,6 +3511,13 @@
           <w:rFonts w:eastAsiaTheme="minorEastAsia"/>
         </w:rPr>
         <w:t xml:space="preserve"> Pobranie środków zgodnie z wybraną taryfą.</w:t>
+      </w:r>
+      <w:r>
+        <w:rPr>
+          <w:rFonts w:eastAsiaTheme="minorEastAsia"/>
+          <w:noProof/>
+        </w:rPr>
+        <w:t xml:space="preserve"> </w:t>
       </w:r>
     </w:p>
     <w:p>
@@ -5081,7 +5088,7 @@
           <w:noProof/>
         </w:rPr>
         <w:drawing>
-          <wp:inline distT="0" distB="0" distL="0" distR="0" wp14:anchorId="751F6ADB" wp14:editId="51535290">
+          <wp:inline distT="0" distB="0" distL="0" distR="0" wp14:anchorId="751F6ADB" wp14:editId="3B563394">
             <wp:extent cx="5721350" cy="2984500"/>
             <wp:effectExtent l="0" t="0" r="0" b="6350"/>
             <wp:docPr id="1442175989" name="Obraz 1"/>
@@ -5098,7 +5105,7 @@
                     </pic:cNvPicPr>
                   </pic:nvPicPr>
                   <pic:blipFill>
-                    <a:blip r:embed="rId9" cstate="print">
+                    <a:blip r:embed="rId11" cstate="print">
                       <a:extLst>
                         <a:ext uri="{28A0092B-C50C-407E-A947-70E740481C1C}">
                           <a14:useLocalDpi xmlns:a14="http://schemas.microsoft.com/office/drawing/2010/main" val="0"/>
@@ -6463,7 +6470,7 @@
                     </pic:cNvPicPr>
                   </pic:nvPicPr>
                   <pic:blipFill>
-                    <a:blip r:embed="rId10">
+                    <a:blip r:embed="rId12">
                       <a:extLst>
                         <a:ext uri="{28A0092B-C50C-407E-A947-70E740481C1C}">
                           <a14:useLocalDpi xmlns:a14="http://schemas.microsoft.com/office/drawing/2010/main" val="0"/>
@@ -7847,13 +7854,13 @@
         </w:rPr>
         <w:lastRenderedPageBreak/>
         <w:drawing>
-          <wp:anchor distT="0" distB="0" distL="114300" distR="114300" simplePos="0" relativeHeight="251660288" behindDoc="0" locked="0" layoutInCell="1" allowOverlap="1" wp14:anchorId="6D789D0D" wp14:editId="472E0032">
+          <wp:anchor distT="0" distB="0" distL="114300" distR="114300" simplePos="0" relativeHeight="251660288" behindDoc="0" locked="0" layoutInCell="1" allowOverlap="1" wp14:anchorId="6D789D0D" wp14:editId="7273A362">
             <wp:simplePos x="0" y="0"/>
             <wp:positionH relativeFrom="margin">
               <wp:align>center</wp:align>
             </wp:positionH>
             <wp:positionV relativeFrom="paragraph">
-              <wp:posOffset>-28575</wp:posOffset>
+              <wp:posOffset>0</wp:posOffset>
             </wp:positionV>
             <wp:extent cx="4465044" cy="3098800"/>
             <wp:effectExtent l="0" t="0" r="0" b="6350"/>
@@ -7872,7 +7879,7 @@
                     </pic:cNvPicPr>
                   </pic:nvPicPr>
                   <pic:blipFill>
-                    <a:blip r:embed="rId11" cstate="print">
+                    <a:blip r:embed="rId13" cstate="print">
                       <a:extLst>
                         <a:ext uri="{28A0092B-C50C-407E-A947-70E740481C1C}">
                           <a14:useLocalDpi xmlns:a14="http://schemas.microsoft.com/office/drawing/2010/main" val="0"/>
@@ -7900,9 +7907,72 @@
                 </pic:pic>
               </a:graphicData>
             </a:graphic>
+            <wp14:sizeRelH relativeFrom="margin">
+              <wp14:pctWidth>0</wp14:pctWidth>
+            </wp14:sizeRelH>
+            <wp14:sizeRelV relativeFrom="margin">
+              <wp14:pctHeight>0</wp14:pctHeight>
+            </wp14:sizeRelV>
           </wp:anchor>
         </w:drawing>
       </w:r>
+    </w:p>
+    <w:p/>
+    <w:p>
+      <w:pPr>
+        <w:rPr>
+          <w:b/>
+          <w:bCs/>
+        </w:rPr>
+      </w:pPr>
+    </w:p>
+    <w:p>
+      <w:pPr>
+        <w:rPr>
+          <w:b/>
+          <w:bCs/>
+        </w:rPr>
+      </w:pPr>
+    </w:p>
+    <w:p>
+      <w:pPr>
+        <w:rPr>
+          <w:b/>
+          <w:bCs/>
+        </w:rPr>
+      </w:pPr>
+    </w:p>
+    <w:p>
+      <w:pPr>
+        <w:rPr>
+          <w:b/>
+          <w:bCs/>
+        </w:rPr>
+      </w:pPr>
+    </w:p>
+    <w:p>
+      <w:pPr>
+        <w:rPr>
+          <w:b/>
+          <w:bCs/>
+        </w:rPr>
+      </w:pPr>
+    </w:p>
+    <w:p>
+      <w:pPr>
+        <w:rPr>
+          <w:b/>
+          <w:bCs/>
+        </w:rPr>
+      </w:pPr>
+    </w:p>
+    <w:p>
+      <w:pPr>
+        <w:rPr>
+          <w:b/>
+          <w:bCs/>
+        </w:rPr>
+      </w:pPr>
     </w:p>
     <w:p/>
     <w:p>
@@ -9172,18 +9242,18 @@
           <w:noProof/>
         </w:rPr>
         <w:drawing>
-          <wp:anchor distT="0" distB="0" distL="114300" distR="114300" simplePos="0" relativeHeight="251661312" behindDoc="0" locked="0" layoutInCell="1" allowOverlap="1" wp14:anchorId="4ACA5D66" wp14:editId="506DE6B9">
+          <wp:anchor distT="0" distB="0" distL="114300" distR="114300" simplePos="0" relativeHeight="251667456" behindDoc="0" locked="0" layoutInCell="1" allowOverlap="1" wp14:anchorId="2A163A48" wp14:editId="2F52C1D4">
             <wp:simplePos x="0" y="0"/>
             <wp:positionH relativeFrom="margin">
               <wp:align>center</wp:align>
             </wp:positionH>
             <wp:positionV relativeFrom="paragraph">
-              <wp:posOffset>198120</wp:posOffset>
+              <wp:posOffset>349885</wp:posOffset>
             </wp:positionV>
-            <wp:extent cx="4483100" cy="3473626"/>
-            <wp:effectExtent l="0" t="0" r="0" b="0"/>
+            <wp:extent cx="5727700" cy="4038600"/>
+            <wp:effectExtent l="0" t="0" r="6350" b="0"/>
             <wp:wrapSquare wrapText="bothSides"/>
-            <wp:docPr id="2008355247" name="Obraz 4"/>
+            <wp:docPr id="1935142353" name="Obraz 3"/>
             <wp:cNvGraphicFramePr>
               <a:graphicFrameLocks xmlns:a="http://schemas.openxmlformats.org/drawingml/2006/main" noChangeAspect="1"/>
             </wp:cNvGraphicFramePr>
@@ -9191,13 +9261,13 @@
               <a:graphicData uri="http://schemas.openxmlformats.org/drawingml/2006/picture">
                 <pic:pic xmlns:pic="http://schemas.openxmlformats.org/drawingml/2006/picture">
                   <pic:nvPicPr>
-                    <pic:cNvPr id="0" name="Picture 4"/>
+                    <pic:cNvPr id="0" name="Picture 2"/>
                     <pic:cNvPicPr>
                       <a:picLocks noChangeAspect="1" noChangeArrowheads="1"/>
                     </pic:cNvPicPr>
                   </pic:nvPicPr>
                   <pic:blipFill>
-                    <a:blip r:embed="rId12" cstate="print">
+                    <a:blip r:embed="rId14">
                       <a:extLst>
                         <a:ext uri="{28A0092B-C50C-407E-A947-70E740481C1C}">
                           <a14:useLocalDpi xmlns:a14="http://schemas.microsoft.com/office/drawing/2010/main" val="0"/>
@@ -9212,7 +9282,7 @@
                   <pic:spPr bwMode="auto">
                     <a:xfrm>
                       <a:off x="0" y="0"/>
-                      <a:ext cx="4483100" cy="3473626"/>
+                      <a:ext cx="5727700" cy="4038600"/>
                     </a:xfrm>
                     <a:prstGeom prst="rect">
                       <a:avLst/>
@@ -9230,44 +9300,6 @@
       </w:r>
     </w:p>
     <w:p/>
-    <w:p/>
-    <w:p>
-      <w:pPr>
-        <w:rPr>
-          <w:b/>
-          <w:bCs/>
-        </w:rPr>
-      </w:pPr>
-    </w:p>
-    <w:p>
-      <w:pPr>
-        <w:rPr>
-          <w:b/>
-          <w:bCs/>
-        </w:rPr>
-      </w:pPr>
-    </w:p>
-    <w:p>
-      <w:pPr>
-        <w:rPr>
-          <w:b/>
-          <w:bCs/>
-        </w:rPr>
-      </w:pPr>
-    </w:p>
-    <w:p>
-      <w:pPr>
-        <w:rPr>
-          <w:b/>
-          <w:bCs/>
-        </w:rPr>
-      </w:pPr>
-    </w:p>
-    <w:p/>
-    <w:p/>
-    <w:p/>
-    <w:p/>
-    <w:p/>
     <w:p>
       <w:pPr>
         <w:pStyle w:val="Nagwek2"/>
@@ -9283,6 +9315,7 @@
           <w:bCs/>
           <w:color w:val="auto"/>
         </w:rPr>
+        <w:lastRenderedPageBreak/>
         <w:t xml:space="preserve">UC-05: </w:t>
       </w:r>
       <w:r>
@@ -9423,7 +9456,6 @@
                 <w:sz w:val="20"/>
                 <w:szCs w:val="20"/>
               </w:rPr>
-              <w:lastRenderedPageBreak/>
               <w:t>Nazwa</w:t>
             </w:r>
           </w:p>
@@ -10593,10 +10625,10 @@
         </w:rPr>
         <w:lastRenderedPageBreak/>
         <w:drawing>
-          <wp:inline distT="0" distB="0" distL="0" distR="0" wp14:anchorId="23392ACA" wp14:editId="632B4A38">
-            <wp:extent cx="5727700" cy="3041650"/>
-            <wp:effectExtent l="0" t="0" r="6350" b="6350"/>
-            <wp:docPr id="78083042" name="Obraz 5"/>
+          <wp:inline distT="0" distB="0" distL="0" distR="0" wp14:anchorId="0259B5C0" wp14:editId="0A194890">
+            <wp:extent cx="5727700" cy="2628900"/>
+            <wp:effectExtent l="0" t="0" r="6350" b="0"/>
+            <wp:docPr id="508781574" name="Obraz 4"/>
             <wp:cNvGraphicFramePr>
               <a:graphicFrameLocks xmlns:a="http://schemas.openxmlformats.org/drawingml/2006/main" noChangeAspect="1"/>
             </wp:cNvGraphicFramePr>
@@ -10604,13 +10636,13 @@
               <a:graphicData uri="http://schemas.openxmlformats.org/drawingml/2006/picture">
                 <pic:pic xmlns:pic="http://schemas.openxmlformats.org/drawingml/2006/picture">
                   <pic:nvPicPr>
-                    <pic:cNvPr id="0" name="Picture 5"/>
+                    <pic:cNvPr id="0" name="Picture 3"/>
                     <pic:cNvPicPr>
                       <a:picLocks noChangeAspect="1" noChangeArrowheads="1"/>
                     </pic:cNvPicPr>
                   </pic:nvPicPr>
                   <pic:blipFill>
-                    <a:blip r:embed="rId13">
+                    <a:blip r:embed="rId15">
                       <a:extLst>
                         <a:ext uri="{28A0092B-C50C-407E-A947-70E740481C1C}">
                           <a14:useLocalDpi xmlns:a14="http://schemas.microsoft.com/office/drawing/2010/main" val="0"/>
@@ -10625,7 +10657,7 @@
                   <pic:spPr bwMode="auto">
                     <a:xfrm>
                       <a:off x="0" y="0"/>
-                      <a:ext cx="5727700" cy="3041650"/>
+                      <a:ext cx="5727700" cy="2628900"/>
                     </a:xfrm>
                     <a:prstGeom prst="rect">
                       <a:avLst/>
@@ -11934,17 +11966,23 @@
         </w:tc>
       </w:tr>
     </w:tbl>
-    <w:p/>
     <w:p>
       <w:r>
         <w:rPr>
           <w:noProof/>
         </w:rPr>
-        <w:lastRenderedPageBreak/>
         <w:drawing>
-          <wp:inline distT="0" distB="0" distL="0" distR="0" wp14:anchorId="0ECB2116" wp14:editId="21C0FB32">
-            <wp:extent cx="5721350" cy="4845050"/>
-            <wp:effectExtent l="0" t="0" r="0" b="0"/>
+          <wp:anchor distT="0" distB="0" distL="114300" distR="114300" simplePos="0" relativeHeight="251668480" behindDoc="0" locked="0" layoutInCell="1" allowOverlap="1" wp14:anchorId="13C85C93" wp14:editId="35D4AF4F">
+            <wp:simplePos x="0" y="0"/>
+            <wp:positionH relativeFrom="margin">
+              <wp:align>center</wp:align>
+            </wp:positionH>
+            <wp:positionV relativeFrom="paragraph">
+              <wp:posOffset>432435</wp:posOffset>
+            </wp:positionV>
+            <wp:extent cx="5321300" cy="4505456"/>
+            <wp:effectExtent l="0" t="0" r="0" b="9525"/>
+            <wp:wrapSquare wrapText="bothSides"/>
             <wp:docPr id="1666936192" name="Obraz 6"/>
             <wp:cNvGraphicFramePr>
               <a:graphicFrameLocks xmlns:a="http://schemas.openxmlformats.org/drawingml/2006/main" noChangeAspect="1"/>
@@ -11959,7 +11997,7 @@
                     </pic:cNvPicPr>
                   </pic:nvPicPr>
                   <pic:blipFill>
-                    <a:blip r:embed="rId14" cstate="print">
+                    <a:blip r:embed="rId16" cstate="print">
                       <a:extLst>
                         <a:ext uri="{28A0092B-C50C-407E-A947-70E740481C1C}">
                           <a14:useLocalDpi xmlns:a14="http://schemas.microsoft.com/office/drawing/2010/main" val="0"/>
@@ -11974,1348 +12012,7 @@
                   <pic:spPr bwMode="auto">
                     <a:xfrm>
                       <a:off x="0" y="0"/>
-                      <a:ext cx="5721350" cy="4845050"/>
-                    </a:xfrm>
-                    <a:prstGeom prst="rect">
-                      <a:avLst/>
-                    </a:prstGeom>
-                    <a:noFill/>
-                    <a:ln>
-                      <a:noFill/>
-                    </a:ln>
-                  </pic:spPr>
-                </pic:pic>
-              </a:graphicData>
-            </a:graphic>
-          </wp:inline>
-        </w:drawing>
-      </w:r>
-    </w:p>
-    <w:p/>
-    <w:p>
-      <w:pPr>
-        <w:pStyle w:val="Nagwek2"/>
-        <w:rPr>
-          <w:b/>
-          <w:bCs/>
-          <w:color w:val="auto"/>
-        </w:rPr>
-      </w:pPr>
-      <w:r>
-        <w:rPr>
-          <w:b/>
-          <w:bCs/>
-          <w:color w:val="auto"/>
-        </w:rPr>
-        <w:t>UC-07: Definiowanie stref</w:t>
-      </w:r>
-    </w:p>
-    <w:tbl>
-      <w:tblPr>
-        <w:tblW w:w="0" w:type="auto"/>
-        <w:tblCellMar>
-          <w:left w:w="0" w:type="dxa"/>
-          <w:right w:w="0" w:type="dxa"/>
-        </w:tblCellMar>
-        <w:tblLook w:val="04A0" w:firstRow="1" w:lastRow="0" w:firstColumn="1" w:lastColumn="0" w:noHBand="0" w:noVBand="1"/>
-      </w:tblPr>
-      <w:tblGrid>
-        <w:gridCol w:w="2271"/>
-        <w:gridCol w:w="6739"/>
-      </w:tblGrid>
-      <w:tr>
-        <w:trPr>
-          <w:cantSplit/>
-        </w:trPr>
-        <w:tc>
-          <w:tcPr>
-            <w:tcW w:w="0" w:type="auto"/>
-            <w:tcBorders>
-              <w:top w:val="single" w:sz="6" w:space="0" w:color="auto"/>
-              <w:left w:val="single" w:sz="6" w:space="0" w:color="auto"/>
-              <w:bottom w:val="single" w:sz="6" w:space="0" w:color="auto"/>
-              <w:right w:val="single" w:sz="6" w:space="0" w:color="auto"/>
-            </w:tcBorders>
-            <w:tcMar>
-              <w:top w:w="240" w:type="dxa"/>
-              <w:left w:w="0" w:type="dxa"/>
-              <w:bottom w:w="240" w:type="dxa"/>
-              <w:right w:w="180" w:type="dxa"/>
-            </w:tcMar>
-            <w:vAlign w:val="center"/>
-            <w:hideMark/>
-          </w:tcPr>
-          <w:p>
-            <w:pPr>
-              <w:spacing w:after="0" w:line="240" w:lineRule="auto"/>
-              <w:rPr>
-                <w:sz w:val="20"/>
-                <w:szCs w:val="20"/>
-              </w:rPr>
-            </w:pPr>
-            <w:r>
-              <w:rPr>
-                <w:b/>
-                <w:bCs/>
-                <w:sz w:val="20"/>
-                <w:szCs w:val="20"/>
-              </w:rPr>
-              <w:t>Pole</w:t>
-            </w:r>
-          </w:p>
-        </w:tc>
-        <w:tc>
-          <w:tcPr>
-            <w:tcW w:w="0" w:type="auto"/>
-            <w:tcBorders>
-              <w:top w:val="single" w:sz="6" w:space="0" w:color="auto"/>
-              <w:left w:val="single" w:sz="6" w:space="0" w:color="auto"/>
-              <w:bottom w:val="single" w:sz="6" w:space="0" w:color="auto"/>
-              <w:right w:val="single" w:sz="6" w:space="0" w:color="auto"/>
-            </w:tcBorders>
-            <w:tcMar>
-              <w:top w:w="240" w:type="dxa"/>
-              <w:left w:w="0" w:type="dxa"/>
-              <w:bottom w:w="240" w:type="dxa"/>
-              <w:right w:w="0" w:type="dxa"/>
-            </w:tcMar>
-            <w:vAlign w:val="center"/>
-            <w:hideMark/>
-          </w:tcPr>
-          <w:p>
-            <w:pPr>
-              <w:spacing w:after="0" w:line="240" w:lineRule="auto"/>
-              <w:rPr>
-                <w:sz w:val="20"/>
-                <w:szCs w:val="20"/>
-              </w:rPr>
-            </w:pPr>
-            <w:r>
-              <w:rPr>
-                <w:b/>
-                <w:bCs/>
-                <w:sz w:val="20"/>
-                <w:szCs w:val="20"/>
-              </w:rPr>
-              <w:t>Opis</w:t>
-            </w:r>
-          </w:p>
-        </w:tc>
-      </w:tr>
-      <w:tr>
-        <w:trPr>
-          <w:cantSplit/>
-        </w:trPr>
-        <w:tc>
-          <w:tcPr>
-            <w:tcW w:w="0" w:type="auto"/>
-            <w:tcBorders>
-              <w:top w:val="single" w:sz="6" w:space="0" w:color="auto"/>
-              <w:left w:val="single" w:sz="6" w:space="0" w:color="auto"/>
-              <w:bottom w:val="single" w:sz="6" w:space="0" w:color="auto"/>
-              <w:right w:val="single" w:sz="6" w:space="0" w:color="auto"/>
-            </w:tcBorders>
-            <w:tcMar>
-              <w:top w:w="240" w:type="dxa"/>
-              <w:left w:w="0" w:type="dxa"/>
-              <w:bottom w:w="240" w:type="dxa"/>
-              <w:right w:w="180" w:type="dxa"/>
-            </w:tcMar>
-            <w:vAlign w:val="center"/>
-            <w:hideMark/>
-          </w:tcPr>
-          <w:p>
-            <w:pPr>
-              <w:spacing w:after="0" w:line="240" w:lineRule="auto"/>
-              <w:rPr>
-                <w:sz w:val="20"/>
-                <w:szCs w:val="20"/>
-              </w:rPr>
-            </w:pPr>
-            <w:r>
-              <w:rPr>
-                <w:b/>
-                <w:bCs/>
-                <w:sz w:val="20"/>
-                <w:szCs w:val="20"/>
-              </w:rPr>
-              <w:t>Nazwa</w:t>
-            </w:r>
-          </w:p>
-        </w:tc>
-        <w:tc>
-          <w:tcPr>
-            <w:tcW w:w="0" w:type="auto"/>
-            <w:tcBorders>
-              <w:top w:val="single" w:sz="6" w:space="0" w:color="auto"/>
-              <w:left w:val="single" w:sz="6" w:space="0" w:color="auto"/>
-              <w:bottom w:val="single" w:sz="6" w:space="0" w:color="auto"/>
-              <w:right w:val="single" w:sz="6" w:space="0" w:color="auto"/>
-            </w:tcBorders>
-            <w:tcMar>
-              <w:top w:w="240" w:type="dxa"/>
-              <w:left w:w="0" w:type="dxa"/>
-              <w:bottom w:w="240" w:type="dxa"/>
-              <w:right w:w="0" w:type="dxa"/>
-            </w:tcMar>
-            <w:vAlign w:val="center"/>
-            <w:hideMark/>
-          </w:tcPr>
-          <w:p>
-            <w:pPr>
-              <w:spacing w:after="0" w:line="240" w:lineRule="auto"/>
-              <w:rPr>
-                <w:sz w:val="20"/>
-                <w:szCs w:val="20"/>
-              </w:rPr>
-            </w:pPr>
-            <w:r>
-              <w:rPr>
-                <w:sz w:val="20"/>
-                <w:szCs w:val="20"/>
-              </w:rPr>
-              <w:t>Definiowanie stref</w:t>
-            </w:r>
-          </w:p>
-        </w:tc>
-      </w:tr>
-      <w:tr>
-        <w:trPr>
-          <w:cantSplit/>
-        </w:trPr>
-        <w:tc>
-          <w:tcPr>
-            <w:tcW w:w="0" w:type="auto"/>
-            <w:tcBorders>
-              <w:top w:val="single" w:sz="6" w:space="0" w:color="auto"/>
-              <w:left w:val="single" w:sz="6" w:space="0" w:color="auto"/>
-              <w:bottom w:val="single" w:sz="6" w:space="0" w:color="auto"/>
-              <w:right w:val="single" w:sz="6" w:space="0" w:color="auto"/>
-            </w:tcBorders>
-            <w:tcMar>
-              <w:top w:w="240" w:type="dxa"/>
-              <w:left w:w="0" w:type="dxa"/>
-              <w:bottom w:w="240" w:type="dxa"/>
-              <w:right w:w="180" w:type="dxa"/>
-            </w:tcMar>
-            <w:vAlign w:val="center"/>
-            <w:hideMark/>
-          </w:tcPr>
-          <w:p>
-            <w:pPr>
-              <w:spacing w:after="0" w:line="240" w:lineRule="auto"/>
-              <w:rPr>
-                <w:sz w:val="20"/>
-                <w:szCs w:val="20"/>
-              </w:rPr>
-            </w:pPr>
-            <w:r>
-              <w:rPr>
-                <w:b/>
-                <w:bCs/>
-                <w:sz w:val="20"/>
-                <w:szCs w:val="20"/>
-              </w:rPr>
-              <w:t>Numer</w:t>
-            </w:r>
-          </w:p>
-        </w:tc>
-        <w:tc>
-          <w:tcPr>
-            <w:tcW w:w="0" w:type="auto"/>
-            <w:tcBorders>
-              <w:top w:val="single" w:sz="6" w:space="0" w:color="auto"/>
-              <w:left w:val="single" w:sz="6" w:space="0" w:color="auto"/>
-              <w:bottom w:val="single" w:sz="6" w:space="0" w:color="auto"/>
-              <w:right w:val="single" w:sz="6" w:space="0" w:color="auto"/>
-            </w:tcBorders>
-            <w:tcMar>
-              <w:top w:w="240" w:type="dxa"/>
-              <w:left w:w="0" w:type="dxa"/>
-              <w:bottom w:w="240" w:type="dxa"/>
-              <w:right w:w="0" w:type="dxa"/>
-            </w:tcMar>
-            <w:vAlign w:val="center"/>
-            <w:hideMark/>
-          </w:tcPr>
-          <w:p>
-            <w:pPr>
-              <w:spacing w:after="0" w:line="240" w:lineRule="auto"/>
-              <w:rPr>
-                <w:sz w:val="20"/>
-                <w:szCs w:val="20"/>
-              </w:rPr>
-            </w:pPr>
-            <w:r>
-              <w:rPr>
-                <w:sz w:val="20"/>
-                <w:szCs w:val="20"/>
-              </w:rPr>
-              <w:t>UC-07</w:t>
-            </w:r>
-          </w:p>
-        </w:tc>
-      </w:tr>
-      <w:tr>
-        <w:trPr>
-          <w:cantSplit/>
-        </w:trPr>
-        <w:tc>
-          <w:tcPr>
-            <w:tcW w:w="0" w:type="auto"/>
-            <w:tcBorders>
-              <w:top w:val="single" w:sz="6" w:space="0" w:color="auto"/>
-              <w:left w:val="single" w:sz="6" w:space="0" w:color="auto"/>
-              <w:bottom w:val="single" w:sz="6" w:space="0" w:color="auto"/>
-              <w:right w:val="single" w:sz="6" w:space="0" w:color="auto"/>
-            </w:tcBorders>
-            <w:tcMar>
-              <w:top w:w="240" w:type="dxa"/>
-              <w:left w:w="0" w:type="dxa"/>
-              <w:bottom w:w="240" w:type="dxa"/>
-              <w:right w:w="180" w:type="dxa"/>
-            </w:tcMar>
-            <w:vAlign w:val="center"/>
-            <w:hideMark/>
-          </w:tcPr>
-          <w:p>
-            <w:pPr>
-              <w:spacing w:after="0" w:line="240" w:lineRule="auto"/>
-              <w:rPr>
-                <w:sz w:val="20"/>
-                <w:szCs w:val="20"/>
-              </w:rPr>
-            </w:pPr>
-            <w:r>
-              <w:rPr>
-                <w:b/>
-                <w:bCs/>
-                <w:sz w:val="20"/>
-                <w:szCs w:val="20"/>
-              </w:rPr>
-              <w:t>Twórca</w:t>
-            </w:r>
-          </w:p>
-        </w:tc>
-        <w:tc>
-          <w:tcPr>
-            <w:tcW w:w="0" w:type="auto"/>
-            <w:tcBorders>
-              <w:top w:val="single" w:sz="6" w:space="0" w:color="auto"/>
-              <w:left w:val="single" w:sz="6" w:space="0" w:color="auto"/>
-              <w:bottom w:val="single" w:sz="6" w:space="0" w:color="auto"/>
-              <w:right w:val="single" w:sz="6" w:space="0" w:color="auto"/>
-            </w:tcBorders>
-            <w:tcMar>
-              <w:top w:w="240" w:type="dxa"/>
-              <w:left w:w="0" w:type="dxa"/>
-              <w:bottom w:w="240" w:type="dxa"/>
-              <w:right w:w="0" w:type="dxa"/>
-            </w:tcMar>
-            <w:vAlign w:val="center"/>
-            <w:hideMark/>
-          </w:tcPr>
-          <w:p>
-            <w:pPr>
-              <w:spacing w:after="0" w:line="240" w:lineRule="auto"/>
-              <w:rPr>
-                <w:sz w:val="20"/>
-                <w:szCs w:val="20"/>
-              </w:rPr>
-            </w:pPr>
-            <w:r>
-              <w:rPr>
-                <w:sz w:val="20"/>
-                <w:szCs w:val="20"/>
-              </w:rPr>
-              <w:t>Analityk Systemowy</w:t>
-            </w:r>
-          </w:p>
-        </w:tc>
-      </w:tr>
-      <w:tr>
-        <w:trPr>
-          <w:cantSplit/>
-        </w:trPr>
-        <w:tc>
-          <w:tcPr>
-            <w:tcW w:w="0" w:type="auto"/>
-            <w:tcBorders>
-              <w:top w:val="single" w:sz="6" w:space="0" w:color="auto"/>
-              <w:left w:val="single" w:sz="6" w:space="0" w:color="auto"/>
-              <w:bottom w:val="single" w:sz="6" w:space="0" w:color="auto"/>
-              <w:right w:val="single" w:sz="6" w:space="0" w:color="auto"/>
-            </w:tcBorders>
-            <w:tcMar>
-              <w:top w:w="240" w:type="dxa"/>
-              <w:left w:w="0" w:type="dxa"/>
-              <w:bottom w:w="240" w:type="dxa"/>
-              <w:right w:w="180" w:type="dxa"/>
-            </w:tcMar>
-            <w:vAlign w:val="center"/>
-            <w:hideMark/>
-          </w:tcPr>
-          <w:p>
-            <w:pPr>
-              <w:spacing w:after="0" w:line="240" w:lineRule="auto"/>
-              <w:rPr>
-                <w:sz w:val="20"/>
-                <w:szCs w:val="20"/>
-              </w:rPr>
-            </w:pPr>
-            <w:r>
-              <w:rPr>
-                <w:b/>
-                <w:bCs/>
-                <w:sz w:val="20"/>
-                <w:szCs w:val="20"/>
-              </w:rPr>
-              <w:t>Poziom ważności</w:t>
-            </w:r>
-          </w:p>
-        </w:tc>
-        <w:tc>
-          <w:tcPr>
-            <w:tcW w:w="0" w:type="auto"/>
-            <w:tcBorders>
-              <w:top w:val="single" w:sz="6" w:space="0" w:color="auto"/>
-              <w:left w:val="single" w:sz="6" w:space="0" w:color="auto"/>
-              <w:bottom w:val="single" w:sz="6" w:space="0" w:color="auto"/>
-              <w:right w:val="single" w:sz="6" w:space="0" w:color="auto"/>
-            </w:tcBorders>
-            <w:tcMar>
-              <w:top w:w="240" w:type="dxa"/>
-              <w:left w:w="0" w:type="dxa"/>
-              <w:bottom w:w="240" w:type="dxa"/>
-              <w:right w:w="0" w:type="dxa"/>
-            </w:tcMar>
-            <w:vAlign w:val="center"/>
-            <w:hideMark/>
-          </w:tcPr>
-          <w:p>
-            <w:pPr>
-              <w:spacing w:after="0" w:line="240" w:lineRule="auto"/>
-              <w:rPr>
-                <w:sz w:val="20"/>
-                <w:szCs w:val="20"/>
-              </w:rPr>
-            </w:pPr>
-            <w:r>
-              <w:rPr>
-                <w:sz w:val="20"/>
-                <w:szCs w:val="20"/>
-              </w:rPr>
-              <w:t>Istotny</w:t>
-            </w:r>
-          </w:p>
-        </w:tc>
-      </w:tr>
-      <w:tr>
-        <w:trPr>
-          <w:cantSplit/>
-        </w:trPr>
-        <w:tc>
-          <w:tcPr>
-            <w:tcW w:w="0" w:type="auto"/>
-            <w:tcBorders>
-              <w:top w:val="single" w:sz="6" w:space="0" w:color="auto"/>
-              <w:left w:val="single" w:sz="6" w:space="0" w:color="auto"/>
-              <w:bottom w:val="single" w:sz="6" w:space="0" w:color="auto"/>
-              <w:right w:val="single" w:sz="6" w:space="0" w:color="auto"/>
-            </w:tcBorders>
-            <w:tcMar>
-              <w:top w:w="240" w:type="dxa"/>
-              <w:left w:w="0" w:type="dxa"/>
-              <w:bottom w:w="240" w:type="dxa"/>
-              <w:right w:w="180" w:type="dxa"/>
-            </w:tcMar>
-            <w:vAlign w:val="center"/>
-            <w:hideMark/>
-          </w:tcPr>
-          <w:p>
-            <w:pPr>
-              <w:spacing w:after="0" w:line="240" w:lineRule="auto"/>
-              <w:rPr>
-                <w:sz w:val="20"/>
-                <w:szCs w:val="20"/>
-              </w:rPr>
-            </w:pPr>
-            <w:r>
-              <w:rPr>
-                <w:b/>
-                <w:bCs/>
-                <w:sz w:val="20"/>
-                <w:szCs w:val="20"/>
-              </w:rPr>
-              <w:t>Typ przypadku użycia</w:t>
-            </w:r>
-          </w:p>
-        </w:tc>
-        <w:tc>
-          <w:tcPr>
-            <w:tcW w:w="0" w:type="auto"/>
-            <w:tcBorders>
-              <w:top w:val="single" w:sz="6" w:space="0" w:color="auto"/>
-              <w:left w:val="single" w:sz="6" w:space="0" w:color="auto"/>
-              <w:bottom w:val="single" w:sz="6" w:space="0" w:color="auto"/>
-              <w:right w:val="single" w:sz="6" w:space="0" w:color="auto"/>
-            </w:tcBorders>
-            <w:tcMar>
-              <w:top w:w="240" w:type="dxa"/>
-              <w:left w:w="0" w:type="dxa"/>
-              <w:bottom w:w="240" w:type="dxa"/>
-              <w:right w:w="0" w:type="dxa"/>
-            </w:tcMar>
-            <w:vAlign w:val="center"/>
-            <w:hideMark/>
-          </w:tcPr>
-          <w:p>
-            <w:pPr>
-              <w:spacing w:after="0" w:line="240" w:lineRule="auto"/>
-              <w:rPr>
-                <w:sz w:val="20"/>
-                <w:szCs w:val="20"/>
-              </w:rPr>
-            </w:pPr>
-            <w:r>
-              <w:rPr>
-                <w:sz w:val="20"/>
-                <w:szCs w:val="20"/>
-              </w:rPr>
-              <w:t>Szczegółowy, administracyjny</w:t>
-            </w:r>
-          </w:p>
-        </w:tc>
-      </w:tr>
-      <w:tr>
-        <w:trPr>
-          <w:cantSplit/>
-        </w:trPr>
-        <w:tc>
-          <w:tcPr>
-            <w:tcW w:w="0" w:type="auto"/>
-            <w:tcBorders>
-              <w:top w:val="single" w:sz="6" w:space="0" w:color="auto"/>
-              <w:left w:val="single" w:sz="6" w:space="0" w:color="auto"/>
-              <w:bottom w:val="single" w:sz="6" w:space="0" w:color="auto"/>
-              <w:right w:val="single" w:sz="6" w:space="0" w:color="auto"/>
-            </w:tcBorders>
-            <w:tcMar>
-              <w:top w:w="240" w:type="dxa"/>
-              <w:left w:w="0" w:type="dxa"/>
-              <w:bottom w:w="240" w:type="dxa"/>
-              <w:right w:w="180" w:type="dxa"/>
-            </w:tcMar>
-            <w:vAlign w:val="center"/>
-            <w:hideMark/>
-          </w:tcPr>
-          <w:p>
-            <w:pPr>
-              <w:spacing w:after="0" w:line="240" w:lineRule="auto"/>
-              <w:rPr>
-                <w:sz w:val="20"/>
-                <w:szCs w:val="20"/>
-              </w:rPr>
-            </w:pPr>
-            <w:r>
-              <w:rPr>
-                <w:b/>
-                <w:bCs/>
-                <w:sz w:val="20"/>
-                <w:szCs w:val="20"/>
-              </w:rPr>
-              <w:lastRenderedPageBreak/>
-              <w:t>Aktorzy</w:t>
-            </w:r>
-          </w:p>
-        </w:tc>
-        <w:tc>
-          <w:tcPr>
-            <w:tcW w:w="0" w:type="auto"/>
-            <w:tcBorders>
-              <w:top w:val="single" w:sz="6" w:space="0" w:color="auto"/>
-              <w:left w:val="single" w:sz="6" w:space="0" w:color="auto"/>
-              <w:bottom w:val="single" w:sz="6" w:space="0" w:color="auto"/>
-              <w:right w:val="single" w:sz="6" w:space="0" w:color="auto"/>
-            </w:tcBorders>
-            <w:tcMar>
-              <w:top w:w="240" w:type="dxa"/>
-              <w:left w:w="0" w:type="dxa"/>
-              <w:bottom w:w="240" w:type="dxa"/>
-              <w:right w:w="0" w:type="dxa"/>
-            </w:tcMar>
-            <w:vAlign w:val="center"/>
-            <w:hideMark/>
-          </w:tcPr>
-          <w:p>
-            <w:pPr>
-              <w:spacing w:after="0" w:line="240" w:lineRule="auto"/>
-              <w:rPr>
-                <w:sz w:val="20"/>
-                <w:szCs w:val="20"/>
-              </w:rPr>
-            </w:pPr>
-            <w:r>
-              <w:rPr>
-                <w:sz w:val="20"/>
-                <w:szCs w:val="20"/>
-              </w:rPr>
-              <w:t>Operator floty</w:t>
-            </w:r>
-          </w:p>
-        </w:tc>
-      </w:tr>
-      <w:tr>
-        <w:trPr>
-          <w:cantSplit/>
-        </w:trPr>
-        <w:tc>
-          <w:tcPr>
-            <w:tcW w:w="0" w:type="auto"/>
-            <w:tcBorders>
-              <w:top w:val="single" w:sz="6" w:space="0" w:color="auto"/>
-              <w:left w:val="single" w:sz="6" w:space="0" w:color="auto"/>
-              <w:bottom w:val="single" w:sz="6" w:space="0" w:color="auto"/>
-              <w:right w:val="single" w:sz="6" w:space="0" w:color="auto"/>
-            </w:tcBorders>
-            <w:tcMar>
-              <w:top w:w="240" w:type="dxa"/>
-              <w:left w:w="0" w:type="dxa"/>
-              <w:bottom w:w="240" w:type="dxa"/>
-              <w:right w:w="180" w:type="dxa"/>
-            </w:tcMar>
-            <w:vAlign w:val="center"/>
-            <w:hideMark/>
-          </w:tcPr>
-          <w:p>
-            <w:pPr>
-              <w:spacing w:after="0" w:line="240" w:lineRule="auto"/>
-              <w:rPr>
-                <w:sz w:val="20"/>
-                <w:szCs w:val="20"/>
-              </w:rPr>
-            </w:pPr>
-            <w:r>
-              <w:rPr>
-                <w:b/>
-                <w:bCs/>
-                <w:sz w:val="20"/>
-                <w:szCs w:val="20"/>
-              </w:rPr>
-              <w:t>Krótki opis</w:t>
-            </w:r>
-          </w:p>
-        </w:tc>
-        <w:tc>
-          <w:tcPr>
-            <w:tcW w:w="0" w:type="auto"/>
-            <w:tcBorders>
-              <w:top w:val="single" w:sz="6" w:space="0" w:color="auto"/>
-              <w:left w:val="single" w:sz="6" w:space="0" w:color="auto"/>
-              <w:bottom w:val="single" w:sz="6" w:space="0" w:color="auto"/>
-              <w:right w:val="single" w:sz="6" w:space="0" w:color="auto"/>
-            </w:tcBorders>
-            <w:tcMar>
-              <w:top w:w="240" w:type="dxa"/>
-              <w:left w:w="0" w:type="dxa"/>
-              <w:bottom w:w="240" w:type="dxa"/>
-              <w:right w:w="0" w:type="dxa"/>
-            </w:tcMar>
-            <w:vAlign w:val="center"/>
-            <w:hideMark/>
-          </w:tcPr>
-          <w:p>
-            <w:pPr>
-              <w:spacing w:after="0" w:line="240" w:lineRule="auto"/>
-              <w:rPr>
-                <w:sz w:val="20"/>
-                <w:szCs w:val="20"/>
-              </w:rPr>
-            </w:pPr>
-            <w:r>
-              <w:rPr>
-                <w:sz w:val="20"/>
-                <w:szCs w:val="20"/>
-              </w:rPr>
-              <w:t>Tworzenie obszarów geograficznych z różnymi regułami (np. strefy parkowania, strefy zakazu).</w:t>
-            </w:r>
-          </w:p>
-        </w:tc>
-      </w:tr>
-      <w:tr>
-        <w:trPr>
-          <w:cantSplit/>
-        </w:trPr>
-        <w:tc>
-          <w:tcPr>
-            <w:tcW w:w="0" w:type="auto"/>
-            <w:tcBorders>
-              <w:top w:val="single" w:sz="6" w:space="0" w:color="auto"/>
-              <w:left w:val="single" w:sz="6" w:space="0" w:color="auto"/>
-              <w:bottom w:val="single" w:sz="6" w:space="0" w:color="auto"/>
-              <w:right w:val="single" w:sz="6" w:space="0" w:color="auto"/>
-            </w:tcBorders>
-            <w:tcMar>
-              <w:top w:w="240" w:type="dxa"/>
-              <w:left w:w="0" w:type="dxa"/>
-              <w:bottom w:w="240" w:type="dxa"/>
-              <w:right w:w="180" w:type="dxa"/>
-            </w:tcMar>
-            <w:vAlign w:val="center"/>
-            <w:hideMark/>
-          </w:tcPr>
-          <w:p>
-            <w:pPr>
-              <w:spacing w:after="0" w:line="240" w:lineRule="auto"/>
-              <w:rPr>
-                <w:sz w:val="20"/>
-                <w:szCs w:val="20"/>
-              </w:rPr>
-            </w:pPr>
-            <w:r>
-              <w:rPr>
-                <w:b/>
-                <w:bCs/>
-                <w:sz w:val="20"/>
-                <w:szCs w:val="20"/>
-              </w:rPr>
-              <w:t>Warunki wstępne</w:t>
-            </w:r>
-          </w:p>
-        </w:tc>
-        <w:tc>
-          <w:tcPr>
-            <w:tcW w:w="0" w:type="auto"/>
-            <w:tcBorders>
-              <w:top w:val="single" w:sz="6" w:space="0" w:color="auto"/>
-              <w:left w:val="single" w:sz="6" w:space="0" w:color="auto"/>
-              <w:bottom w:val="single" w:sz="6" w:space="0" w:color="auto"/>
-              <w:right w:val="single" w:sz="6" w:space="0" w:color="auto"/>
-            </w:tcBorders>
-            <w:tcMar>
-              <w:top w:w="240" w:type="dxa"/>
-              <w:left w:w="0" w:type="dxa"/>
-              <w:bottom w:w="240" w:type="dxa"/>
-              <w:right w:w="0" w:type="dxa"/>
-            </w:tcMar>
-            <w:vAlign w:val="center"/>
-            <w:hideMark/>
-          </w:tcPr>
-          <w:p>
-            <w:pPr>
-              <w:spacing w:after="0" w:line="240" w:lineRule="auto"/>
-              <w:rPr>
-                <w:sz w:val="20"/>
-                <w:szCs w:val="20"/>
-              </w:rPr>
-            </w:pPr>
-            <w:r>
-              <w:rPr>
-                <w:sz w:val="20"/>
-                <w:szCs w:val="20"/>
-              </w:rPr>
-              <w:t>Operator posiada uprawnienia "Manager Floty".</w:t>
-            </w:r>
-          </w:p>
-        </w:tc>
-      </w:tr>
-      <w:tr>
-        <w:trPr>
-          <w:cantSplit/>
-        </w:trPr>
-        <w:tc>
-          <w:tcPr>
-            <w:tcW w:w="0" w:type="auto"/>
-            <w:tcBorders>
-              <w:top w:val="single" w:sz="6" w:space="0" w:color="auto"/>
-              <w:left w:val="single" w:sz="6" w:space="0" w:color="auto"/>
-              <w:bottom w:val="single" w:sz="6" w:space="0" w:color="auto"/>
-              <w:right w:val="single" w:sz="6" w:space="0" w:color="auto"/>
-            </w:tcBorders>
-            <w:tcMar>
-              <w:top w:w="240" w:type="dxa"/>
-              <w:left w:w="0" w:type="dxa"/>
-              <w:bottom w:w="240" w:type="dxa"/>
-              <w:right w:w="180" w:type="dxa"/>
-            </w:tcMar>
-            <w:vAlign w:val="center"/>
-            <w:hideMark/>
-          </w:tcPr>
-          <w:p>
-            <w:pPr>
-              <w:spacing w:after="0" w:line="240" w:lineRule="auto"/>
-              <w:rPr>
-                <w:sz w:val="20"/>
-                <w:szCs w:val="20"/>
-              </w:rPr>
-            </w:pPr>
-            <w:r>
-              <w:rPr>
-                <w:b/>
-                <w:bCs/>
-                <w:sz w:val="20"/>
-                <w:szCs w:val="20"/>
-              </w:rPr>
-              <w:t>Warunki końcowe</w:t>
-            </w:r>
-          </w:p>
-        </w:tc>
-        <w:tc>
-          <w:tcPr>
-            <w:tcW w:w="0" w:type="auto"/>
-            <w:tcBorders>
-              <w:top w:val="single" w:sz="6" w:space="0" w:color="auto"/>
-              <w:left w:val="single" w:sz="6" w:space="0" w:color="auto"/>
-              <w:bottom w:val="single" w:sz="6" w:space="0" w:color="auto"/>
-              <w:right w:val="single" w:sz="6" w:space="0" w:color="auto"/>
-            </w:tcBorders>
-            <w:tcMar>
-              <w:top w:w="240" w:type="dxa"/>
-              <w:left w:w="0" w:type="dxa"/>
-              <w:bottom w:w="240" w:type="dxa"/>
-              <w:right w:w="0" w:type="dxa"/>
-            </w:tcMar>
-            <w:vAlign w:val="center"/>
-            <w:hideMark/>
-          </w:tcPr>
-          <w:p>
-            <w:pPr>
-              <w:spacing w:after="0" w:line="240" w:lineRule="auto"/>
-              <w:rPr>
-                <w:sz w:val="20"/>
-                <w:szCs w:val="20"/>
-              </w:rPr>
-            </w:pPr>
-            <w:r>
-              <w:rPr>
-                <w:sz w:val="20"/>
-                <w:szCs w:val="20"/>
-              </w:rPr>
-              <w:t>Zmiany są naniesione na globalną mapę i widoczne dla użytkowników.</w:t>
-            </w:r>
-          </w:p>
-        </w:tc>
-      </w:tr>
-      <w:tr>
-        <w:trPr>
-          <w:cantSplit/>
-        </w:trPr>
-        <w:tc>
-          <w:tcPr>
-            <w:tcW w:w="0" w:type="auto"/>
-            <w:tcBorders>
-              <w:top w:val="single" w:sz="6" w:space="0" w:color="auto"/>
-              <w:left w:val="single" w:sz="6" w:space="0" w:color="auto"/>
-              <w:bottom w:val="single" w:sz="6" w:space="0" w:color="auto"/>
-              <w:right w:val="single" w:sz="6" w:space="0" w:color="auto"/>
-            </w:tcBorders>
-            <w:tcMar>
-              <w:top w:w="240" w:type="dxa"/>
-              <w:left w:w="0" w:type="dxa"/>
-              <w:bottom w:w="240" w:type="dxa"/>
-              <w:right w:w="180" w:type="dxa"/>
-            </w:tcMar>
-            <w:vAlign w:val="center"/>
-            <w:hideMark/>
-          </w:tcPr>
-          <w:p>
-            <w:pPr>
-              <w:spacing w:after="0" w:line="240" w:lineRule="auto"/>
-              <w:rPr>
-                <w:sz w:val="20"/>
-                <w:szCs w:val="20"/>
-              </w:rPr>
-            </w:pPr>
-            <w:r>
-              <w:rPr>
-                <w:b/>
-                <w:bCs/>
-                <w:sz w:val="20"/>
-                <w:szCs w:val="20"/>
-              </w:rPr>
-              <w:t>Główny przepływ zdarzeń</w:t>
-            </w:r>
-          </w:p>
-        </w:tc>
-        <w:tc>
-          <w:tcPr>
-            <w:tcW w:w="0" w:type="auto"/>
-            <w:tcBorders>
-              <w:top w:val="single" w:sz="6" w:space="0" w:color="auto"/>
-              <w:left w:val="single" w:sz="6" w:space="0" w:color="auto"/>
-              <w:bottom w:val="single" w:sz="6" w:space="0" w:color="auto"/>
-              <w:right w:val="single" w:sz="6" w:space="0" w:color="auto"/>
-            </w:tcBorders>
-            <w:tcMar>
-              <w:top w:w="240" w:type="dxa"/>
-              <w:left w:w="0" w:type="dxa"/>
-              <w:bottom w:w="240" w:type="dxa"/>
-              <w:right w:w="0" w:type="dxa"/>
-            </w:tcMar>
-            <w:vAlign w:val="center"/>
-            <w:hideMark/>
-          </w:tcPr>
-          <w:p>
-            <w:pPr>
-              <w:spacing w:after="0" w:line="240" w:lineRule="auto"/>
-              <w:rPr>
-                <w:sz w:val="20"/>
-                <w:szCs w:val="20"/>
-              </w:rPr>
-            </w:pPr>
-            <w:r>
-              <w:rPr>
-                <w:sz w:val="20"/>
-                <w:szCs w:val="20"/>
-              </w:rPr>
-              <w:t>1. Operator otwiera edytor mapy.</w:t>
-            </w:r>
-            <w:r>
-              <w:rPr>
-                <w:sz w:val="20"/>
-                <w:szCs w:val="20"/>
-              </w:rPr>
-              <w:br/>
-            </w:r>
-          </w:p>
-          <w:p>
-            <w:pPr>
-              <w:spacing w:after="0" w:line="240" w:lineRule="auto"/>
-              <w:rPr>
-                <w:sz w:val="20"/>
-                <w:szCs w:val="20"/>
-              </w:rPr>
-            </w:pPr>
-            <w:r>
-              <w:rPr>
-                <w:sz w:val="20"/>
-                <w:szCs w:val="20"/>
-              </w:rPr>
-              <w:t>2. Operator rysuje wielokąt na mapie.</w:t>
-            </w:r>
-          </w:p>
-          <w:p>
-            <w:pPr>
-              <w:spacing w:after="0" w:line="240" w:lineRule="auto"/>
-              <w:rPr>
-                <w:sz w:val="20"/>
-                <w:szCs w:val="20"/>
-              </w:rPr>
-            </w:pPr>
-          </w:p>
-          <w:p>
-            <w:pPr>
-              <w:spacing w:after="0" w:line="240" w:lineRule="auto"/>
-              <w:rPr>
-                <w:sz w:val="20"/>
-                <w:szCs w:val="20"/>
-              </w:rPr>
-            </w:pPr>
-            <w:r>
-              <w:rPr>
-                <w:sz w:val="20"/>
-                <w:szCs w:val="20"/>
-              </w:rPr>
-              <w:t>3. Operator przypisuje parametry (np. prędkość max 20km/h, zakaz parkowania).</w:t>
-            </w:r>
-            <w:r>
-              <w:rPr>
-                <w:sz w:val="20"/>
-                <w:szCs w:val="20"/>
-              </w:rPr>
-              <w:br/>
-            </w:r>
-          </w:p>
-          <w:p>
-            <w:pPr>
-              <w:spacing w:after="0" w:line="240" w:lineRule="auto"/>
-              <w:rPr>
-                <w:sz w:val="20"/>
-                <w:szCs w:val="20"/>
-              </w:rPr>
-            </w:pPr>
-            <w:r>
-              <w:rPr>
-                <w:sz w:val="20"/>
-                <w:szCs w:val="20"/>
-              </w:rPr>
-              <w:t>4. System publikuje nową strefę.</w:t>
-            </w:r>
-          </w:p>
-        </w:tc>
-      </w:tr>
-      <w:tr>
-        <w:trPr>
-          <w:cantSplit/>
-        </w:trPr>
-        <w:tc>
-          <w:tcPr>
-            <w:tcW w:w="0" w:type="auto"/>
-            <w:tcBorders>
-              <w:top w:val="single" w:sz="6" w:space="0" w:color="auto"/>
-              <w:left w:val="single" w:sz="6" w:space="0" w:color="auto"/>
-              <w:bottom w:val="single" w:sz="6" w:space="0" w:color="auto"/>
-              <w:right w:val="single" w:sz="6" w:space="0" w:color="auto"/>
-            </w:tcBorders>
-            <w:tcMar>
-              <w:top w:w="240" w:type="dxa"/>
-              <w:left w:w="0" w:type="dxa"/>
-              <w:bottom w:w="240" w:type="dxa"/>
-              <w:right w:w="180" w:type="dxa"/>
-            </w:tcMar>
-            <w:vAlign w:val="center"/>
-            <w:hideMark/>
-          </w:tcPr>
-          <w:p>
-            <w:pPr>
-              <w:spacing w:after="0" w:line="240" w:lineRule="auto"/>
-              <w:rPr>
-                <w:sz w:val="20"/>
-                <w:szCs w:val="20"/>
-              </w:rPr>
-            </w:pPr>
-            <w:r>
-              <w:rPr>
-                <w:b/>
-                <w:bCs/>
-                <w:sz w:val="20"/>
-                <w:szCs w:val="20"/>
-              </w:rPr>
-              <w:t>Alternatywne przepływy</w:t>
-            </w:r>
-          </w:p>
-        </w:tc>
-        <w:tc>
-          <w:tcPr>
-            <w:tcW w:w="0" w:type="auto"/>
-            <w:tcBorders>
-              <w:top w:val="single" w:sz="6" w:space="0" w:color="auto"/>
-              <w:left w:val="single" w:sz="6" w:space="0" w:color="auto"/>
-              <w:bottom w:val="single" w:sz="6" w:space="0" w:color="auto"/>
-              <w:right w:val="single" w:sz="6" w:space="0" w:color="auto"/>
-            </w:tcBorders>
-            <w:tcMar>
-              <w:top w:w="240" w:type="dxa"/>
-              <w:left w:w="0" w:type="dxa"/>
-              <w:bottom w:w="240" w:type="dxa"/>
-              <w:right w:w="0" w:type="dxa"/>
-            </w:tcMar>
-            <w:vAlign w:val="center"/>
-            <w:hideMark/>
-          </w:tcPr>
-          <w:p>
-            <w:pPr>
-              <w:spacing w:after="0" w:line="240" w:lineRule="auto"/>
-              <w:rPr>
-                <w:sz w:val="20"/>
-                <w:szCs w:val="20"/>
-              </w:rPr>
-            </w:pPr>
-            <w:r>
-              <w:rPr>
-                <w:sz w:val="20"/>
-                <w:szCs w:val="20"/>
-              </w:rPr>
-              <w:t>3a. Kopiowanie strefy: Operator duplikuje strefę z innego miasta.</w:t>
-            </w:r>
-          </w:p>
-        </w:tc>
-      </w:tr>
-      <w:tr>
-        <w:trPr>
-          <w:cantSplit/>
-        </w:trPr>
-        <w:tc>
-          <w:tcPr>
-            <w:tcW w:w="0" w:type="auto"/>
-            <w:tcBorders>
-              <w:top w:val="single" w:sz="6" w:space="0" w:color="auto"/>
-              <w:left w:val="single" w:sz="6" w:space="0" w:color="auto"/>
-              <w:bottom w:val="single" w:sz="6" w:space="0" w:color="auto"/>
-              <w:right w:val="single" w:sz="6" w:space="0" w:color="auto"/>
-            </w:tcBorders>
-            <w:tcMar>
-              <w:top w:w="240" w:type="dxa"/>
-              <w:left w:w="0" w:type="dxa"/>
-              <w:bottom w:w="240" w:type="dxa"/>
-              <w:right w:w="180" w:type="dxa"/>
-            </w:tcMar>
-            <w:vAlign w:val="center"/>
-            <w:hideMark/>
-          </w:tcPr>
-          <w:p>
-            <w:pPr>
-              <w:spacing w:after="0" w:line="240" w:lineRule="auto"/>
-              <w:rPr>
-                <w:sz w:val="20"/>
-                <w:szCs w:val="20"/>
-              </w:rPr>
-            </w:pPr>
-            <w:r>
-              <w:rPr>
-                <w:b/>
-                <w:bCs/>
-                <w:sz w:val="20"/>
-                <w:szCs w:val="20"/>
-              </w:rPr>
-              <w:t>Wyjątki w przepływach</w:t>
-            </w:r>
-          </w:p>
-        </w:tc>
-        <w:tc>
-          <w:tcPr>
-            <w:tcW w:w="0" w:type="auto"/>
-            <w:tcBorders>
-              <w:top w:val="single" w:sz="6" w:space="0" w:color="auto"/>
-              <w:left w:val="single" w:sz="6" w:space="0" w:color="auto"/>
-              <w:bottom w:val="single" w:sz="6" w:space="0" w:color="auto"/>
-              <w:right w:val="single" w:sz="6" w:space="0" w:color="auto"/>
-            </w:tcBorders>
-            <w:tcMar>
-              <w:top w:w="240" w:type="dxa"/>
-              <w:left w:w="0" w:type="dxa"/>
-              <w:bottom w:w="240" w:type="dxa"/>
-              <w:right w:w="0" w:type="dxa"/>
-            </w:tcMar>
-            <w:vAlign w:val="center"/>
-            <w:hideMark/>
-          </w:tcPr>
-          <w:p>
-            <w:pPr>
-              <w:spacing w:after="0" w:line="240" w:lineRule="auto"/>
-              <w:rPr>
-                <w:sz w:val="20"/>
-                <w:szCs w:val="20"/>
-              </w:rPr>
-            </w:pPr>
-            <w:r>
-              <w:rPr>
-                <w:sz w:val="20"/>
-                <w:szCs w:val="20"/>
-              </w:rPr>
-              <w:t>4a. Błąd nakładania (</w:t>
-            </w:r>
-            <w:proofErr w:type="spellStart"/>
-            <w:r>
-              <w:rPr>
-                <w:sz w:val="20"/>
-                <w:szCs w:val="20"/>
-              </w:rPr>
-              <w:t>Overlap</w:t>
-            </w:r>
-            <w:proofErr w:type="spellEnd"/>
-            <w:r>
-              <w:rPr>
-                <w:sz w:val="20"/>
-                <w:szCs w:val="20"/>
-              </w:rPr>
-              <w:t>): System wykrywa konflikt reguł w tym samym miejscu.</w:t>
-            </w:r>
-          </w:p>
-        </w:tc>
-      </w:tr>
-      <w:tr>
-        <w:trPr>
-          <w:cantSplit/>
-        </w:trPr>
-        <w:tc>
-          <w:tcPr>
-            <w:tcW w:w="0" w:type="auto"/>
-            <w:tcBorders>
-              <w:top w:val="single" w:sz="6" w:space="0" w:color="auto"/>
-              <w:left w:val="single" w:sz="6" w:space="0" w:color="auto"/>
-              <w:bottom w:val="single" w:sz="6" w:space="0" w:color="auto"/>
-              <w:right w:val="single" w:sz="6" w:space="0" w:color="auto"/>
-            </w:tcBorders>
-            <w:tcMar>
-              <w:top w:w="240" w:type="dxa"/>
-              <w:left w:w="0" w:type="dxa"/>
-              <w:bottom w:w="240" w:type="dxa"/>
-              <w:right w:w="180" w:type="dxa"/>
-            </w:tcMar>
-            <w:vAlign w:val="center"/>
-            <w:hideMark/>
-          </w:tcPr>
-          <w:p>
-            <w:pPr>
-              <w:spacing w:after="0" w:line="240" w:lineRule="auto"/>
-              <w:rPr>
-                <w:sz w:val="20"/>
-                <w:szCs w:val="20"/>
-              </w:rPr>
-            </w:pPr>
-            <w:r>
-              <w:rPr>
-                <w:b/>
-                <w:bCs/>
-                <w:sz w:val="20"/>
-                <w:szCs w:val="20"/>
-              </w:rPr>
-              <w:t>Specjalne wymagania</w:t>
-            </w:r>
-          </w:p>
-        </w:tc>
-        <w:tc>
-          <w:tcPr>
-            <w:tcW w:w="0" w:type="auto"/>
-            <w:tcBorders>
-              <w:top w:val="single" w:sz="6" w:space="0" w:color="auto"/>
-              <w:left w:val="single" w:sz="6" w:space="0" w:color="auto"/>
-              <w:bottom w:val="single" w:sz="6" w:space="0" w:color="auto"/>
-              <w:right w:val="single" w:sz="6" w:space="0" w:color="auto"/>
-            </w:tcBorders>
-            <w:tcMar>
-              <w:top w:w="240" w:type="dxa"/>
-              <w:left w:w="0" w:type="dxa"/>
-              <w:bottom w:w="240" w:type="dxa"/>
-              <w:right w:w="0" w:type="dxa"/>
-            </w:tcMar>
-            <w:vAlign w:val="center"/>
-            <w:hideMark/>
-          </w:tcPr>
-          <w:p>
-            <w:pPr>
-              <w:spacing w:after="0" w:line="240" w:lineRule="auto"/>
-              <w:rPr>
-                <w:sz w:val="20"/>
-                <w:szCs w:val="20"/>
-              </w:rPr>
-            </w:pPr>
-            <w:r>
-              <w:rPr>
-                <w:sz w:val="20"/>
-                <w:szCs w:val="20"/>
-              </w:rPr>
-              <w:t>Narzędzie do rysowania musi być precyzyjne (skala budynków).</w:t>
-            </w:r>
-          </w:p>
-        </w:tc>
-      </w:tr>
-      <w:tr>
-        <w:trPr>
-          <w:cantSplit/>
-        </w:trPr>
-        <w:tc>
-          <w:tcPr>
-            <w:tcW w:w="0" w:type="auto"/>
-            <w:tcBorders>
-              <w:top w:val="single" w:sz="6" w:space="0" w:color="auto"/>
-              <w:left w:val="single" w:sz="6" w:space="0" w:color="auto"/>
-              <w:bottom w:val="single" w:sz="6" w:space="0" w:color="auto"/>
-              <w:right w:val="single" w:sz="6" w:space="0" w:color="auto"/>
-            </w:tcBorders>
-            <w:tcMar>
-              <w:top w:w="240" w:type="dxa"/>
-              <w:left w:w="0" w:type="dxa"/>
-              <w:bottom w:w="240" w:type="dxa"/>
-              <w:right w:w="180" w:type="dxa"/>
-            </w:tcMar>
-            <w:vAlign w:val="center"/>
-            <w:hideMark/>
-          </w:tcPr>
-          <w:p>
-            <w:pPr>
-              <w:spacing w:after="0" w:line="240" w:lineRule="auto"/>
-              <w:rPr>
-                <w:sz w:val="20"/>
-                <w:szCs w:val="20"/>
-              </w:rPr>
-            </w:pPr>
-            <w:r>
-              <w:rPr>
-                <w:b/>
-                <w:bCs/>
-                <w:sz w:val="20"/>
-                <w:szCs w:val="20"/>
-              </w:rPr>
-              <w:t>Notatki i kwestie</w:t>
-            </w:r>
-          </w:p>
-        </w:tc>
-        <w:tc>
-          <w:tcPr>
-            <w:tcW w:w="0" w:type="auto"/>
-            <w:tcBorders>
-              <w:top w:val="single" w:sz="6" w:space="0" w:color="auto"/>
-              <w:left w:val="single" w:sz="6" w:space="0" w:color="auto"/>
-              <w:bottom w:val="single" w:sz="6" w:space="0" w:color="auto"/>
-              <w:right w:val="single" w:sz="6" w:space="0" w:color="auto"/>
-            </w:tcBorders>
-            <w:tcMar>
-              <w:top w:w="240" w:type="dxa"/>
-              <w:left w:w="0" w:type="dxa"/>
-              <w:bottom w:w="240" w:type="dxa"/>
-              <w:right w:w="0" w:type="dxa"/>
-            </w:tcMar>
-            <w:vAlign w:val="center"/>
-            <w:hideMark/>
-          </w:tcPr>
-          <w:p>
-            <w:pPr>
-              <w:spacing w:after="0" w:line="240" w:lineRule="auto"/>
-              <w:rPr>
-                <w:sz w:val="20"/>
-                <w:szCs w:val="20"/>
-              </w:rPr>
-            </w:pPr>
-            <w:r>
-              <w:rPr>
-                <w:sz w:val="20"/>
-                <w:szCs w:val="20"/>
-              </w:rPr>
-              <w:t>Integracja z miejskimi systemami płatnego parkowania (automatyczna aktualizacja).</w:t>
-            </w:r>
-          </w:p>
-        </w:tc>
-      </w:tr>
-    </w:tbl>
-    <w:p>
-      <w:r>
-        <w:rPr>
-          <w:noProof/>
-        </w:rPr>
-        <w:drawing>
-          <wp:anchor distT="0" distB="0" distL="114300" distR="114300" simplePos="0" relativeHeight="251662336" behindDoc="0" locked="0" layoutInCell="1" allowOverlap="1" wp14:anchorId="03717B78" wp14:editId="339A56F4">
-            <wp:simplePos x="0" y="0"/>
-            <wp:positionH relativeFrom="margin">
-              <wp:align>center</wp:align>
-            </wp:positionH>
-            <wp:positionV relativeFrom="paragraph">
-              <wp:posOffset>0</wp:posOffset>
-            </wp:positionV>
-            <wp:extent cx="4006850" cy="2731820"/>
-            <wp:effectExtent l="0" t="0" r="0" b="0"/>
-            <wp:wrapSquare wrapText="bothSides"/>
-            <wp:docPr id="291083886" name="Obraz 7"/>
-            <wp:cNvGraphicFramePr>
-              <a:graphicFrameLocks xmlns:a="http://schemas.openxmlformats.org/drawingml/2006/main" noChangeAspect="1"/>
-            </wp:cNvGraphicFramePr>
-            <a:graphic xmlns:a="http://schemas.openxmlformats.org/drawingml/2006/main">
-              <a:graphicData uri="http://schemas.openxmlformats.org/drawingml/2006/picture">
-                <pic:pic xmlns:pic="http://schemas.openxmlformats.org/drawingml/2006/picture">
-                  <pic:nvPicPr>
-                    <pic:cNvPr id="0" name="Picture 7"/>
-                    <pic:cNvPicPr>
-                      <a:picLocks noChangeAspect="1" noChangeArrowheads="1"/>
-                    </pic:cNvPicPr>
-                  </pic:nvPicPr>
-                  <pic:blipFill>
-                    <a:blip r:embed="rId15" cstate="print">
-                      <a:extLst>
-                        <a:ext uri="{28A0092B-C50C-407E-A947-70E740481C1C}">
-                          <a14:useLocalDpi xmlns:a14="http://schemas.microsoft.com/office/drawing/2010/main" val="0"/>
-                        </a:ext>
-                      </a:extLst>
-                    </a:blip>
-                    <a:srcRect/>
-                    <a:stretch>
-                      <a:fillRect/>
-                    </a:stretch>
-                  </pic:blipFill>
-                  <pic:spPr bwMode="auto">
-                    <a:xfrm>
-                      <a:off x="0" y="0"/>
-                      <a:ext cx="4006850" cy="2731820"/>
+                      <a:ext cx="5321300" cy="4505456"/>
                     </a:xfrm>
                     <a:prstGeom prst="rect">
                       <a:avLst/>
@@ -13338,63 +12035,6 @@
         </w:drawing>
       </w:r>
     </w:p>
-    <w:p/>
-    <w:p>
-      <w:pPr>
-        <w:rPr>
-          <w:b/>
-          <w:bCs/>
-        </w:rPr>
-      </w:pPr>
-    </w:p>
-    <w:p>
-      <w:pPr>
-        <w:rPr>
-          <w:b/>
-          <w:bCs/>
-        </w:rPr>
-      </w:pPr>
-    </w:p>
-    <w:p>
-      <w:pPr>
-        <w:rPr>
-          <w:b/>
-          <w:bCs/>
-        </w:rPr>
-      </w:pPr>
-    </w:p>
-    <w:p>
-      <w:pPr>
-        <w:rPr>
-          <w:b/>
-          <w:bCs/>
-        </w:rPr>
-      </w:pPr>
-    </w:p>
-    <w:p>
-      <w:pPr>
-        <w:rPr>
-          <w:b/>
-          <w:bCs/>
-        </w:rPr>
-      </w:pPr>
-    </w:p>
-    <w:p>
-      <w:pPr>
-        <w:rPr>
-          <w:b/>
-          <w:bCs/>
-        </w:rPr>
-      </w:pPr>
-    </w:p>
-    <w:p>
-      <w:pPr>
-        <w:rPr>
-          <w:b/>
-          <w:bCs/>
-        </w:rPr>
-      </w:pPr>
-    </w:p>
     <w:p>
       <w:pPr>
         <w:pStyle w:val="Nagwek2"/>
@@ -13404,6 +12044,1314 @@
           <w:color w:val="auto"/>
         </w:rPr>
       </w:pPr>
+      <w:r>
+        <w:rPr>
+          <w:b/>
+          <w:bCs/>
+          <w:color w:val="auto"/>
+        </w:rPr>
+        <w:lastRenderedPageBreak/>
+        <w:t>UC-07: Definiowanie stref</w:t>
+      </w:r>
+    </w:p>
+    <w:tbl>
+      <w:tblPr>
+        <w:tblW w:w="0" w:type="auto"/>
+        <w:tblCellMar>
+          <w:left w:w="0" w:type="dxa"/>
+          <w:right w:w="0" w:type="dxa"/>
+        </w:tblCellMar>
+        <w:tblLook w:val="04A0" w:firstRow="1" w:lastRow="0" w:firstColumn="1" w:lastColumn="0" w:noHBand="0" w:noVBand="1"/>
+      </w:tblPr>
+      <w:tblGrid>
+        <w:gridCol w:w="2271"/>
+        <w:gridCol w:w="6739"/>
+      </w:tblGrid>
+      <w:tr>
+        <w:trPr>
+          <w:cantSplit/>
+        </w:trPr>
+        <w:tc>
+          <w:tcPr>
+            <w:tcW w:w="0" w:type="auto"/>
+            <w:tcBorders>
+              <w:top w:val="single" w:sz="6" w:space="0" w:color="auto"/>
+              <w:left w:val="single" w:sz="6" w:space="0" w:color="auto"/>
+              <w:bottom w:val="single" w:sz="6" w:space="0" w:color="auto"/>
+              <w:right w:val="single" w:sz="6" w:space="0" w:color="auto"/>
+            </w:tcBorders>
+            <w:tcMar>
+              <w:top w:w="240" w:type="dxa"/>
+              <w:left w:w="0" w:type="dxa"/>
+              <w:bottom w:w="240" w:type="dxa"/>
+              <w:right w:w="180" w:type="dxa"/>
+            </w:tcMar>
+            <w:vAlign w:val="center"/>
+            <w:hideMark/>
+          </w:tcPr>
+          <w:p>
+            <w:pPr>
+              <w:spacing w:after="0" w:line="240" w:lineRule="auto"/>
+              <w:rPr>
+                <w:sz w:val="20"/>
+                <w:szCs w:val="20"/>
+              </w:rPr>
+            </w:pPr>
+            <w:r>
+              <w:rPr>
+                <w:b/>
+                <w:bCs/>
+                <w:sz w:val="20"/>
+                <w:szCs w:val="20"/>
+              </w:rPr>
+              <w:t>Pole</w:t>
+            </w:r>
+          </w:p>
+        </w:tc>
+        <w:tc>
+          <w:tcPr>
+            <w:tcW w:w="0" w:type="auto"/>
+            <w:tcBorders>
+              <w:top w:val="single" w:sz="6" w:space="0" w:color="auto"/>
+              <w:left w:val="single" w:sz="6" w:space="0" w:color="auto"/>
+              <w:bottom w:val="single" w:sz="6" w:space="0" w:color="auto"/>
+              <w:right w:val="single" w:sz="6" w:space="0" w:color="auto"/>
+            </w:tcBorders>
+            <w:tcMar>
+              <w:top w:w="240" w:type="dxa"/>
+              <w:left w:w="0" w:type="dxa"/>
+              <w:bottom w:w="240" w:type="dxa"/>
+              <w:right w:w="0" w:type="dxa"/>
+            </w:tcMar>
+            <w:vAlign w:val="center"/>
+            <w:hideMark/>
+          </w:tcPr>
+          <w:p>
+            <w:pPr>
+              <w:spacing w:after="0" w:line="240" w:lineRule="auto"/>
+              <w:rPr>
+                <w:sz w:val="20"/>
+                <w:szCs w:val="20"/>
+              </w:rPr>
+            </w:pPr>
+            <w:r>
+              <w:rPr>
+                <w:b/>
+                <w:bCs/>
+                <w:sz w:val="20"/>
+                <w:szCs w:val="20"/>
+              </w:rPr>
+              <w:t>Opis</w:t>
+            </w:r>
+          </w:p>
+        </w:tc>
+      </w:tr>
+      <w:tr>
+        <w:trPr>
+          <w:cantSplit/>
+        </w:trPr>
+        <w:tc>
+          <w:tcPr>
+            <w:tcW w:w="0" w:type="auto"/>
+            <w:tcBorders>
+              <w:top w:val="single" w:sz="6" w:space="0" w:color="auto"/>
+              <w:left w:val="single" w:sz="6" w:space="0" w:color="auto"/>
+              <w:bottom w:val="single" w:sz="6" w:space="0" w:color="auto"/>
+              <w:right w:val="single" w:sz="6" w:space="0" w:color="auto"/>
+            </w:tcBorders>
+            <w:tcMar>
+              <w:top w:w="240" w:type="dxa"/>
+              <w:left w:w="0" w:type="dxa"/>
+              <w:bottom w:w="240" w:type="dxa"/>
+              <w:right w:w="180" w:type="dxa"/>
+            </w:tcMar>
+            <w:vAlign w:val="center"/>
+            <w:hideMark/>
+          </w:tcPr>
+          <w:p>
+            <w:pPr>
+              <w:spacing w:after="0" w:line="240" w:lineRule="auto"/>
+              <w:rPr>
+                <w:sz w:val="20"/>
+                <w:szCs w:val="20"/>
+              </w:rPr>
+            </w:pPr>
+            <w:r>
+              <w:rPr>
+                <w:b/>
+                <w:bCs/>
+                <w:sz w:val="20"/>
+                <w:szCs w:val="20"/>
+              </w:rPr>
+              <w:t>Nazwa</w:t>
+            </w:r>
+          </w:p>
+        </w:tc>
+        <w:tc>
+          <w:tcPr>
+            <w:tcW w:w="0" w:type="auto"/>
+            <w:tcBorders>
+              <w:top w:val="single" w:sz="6" w:space="0" w:color="auto"/>
+              <w:left w:val="single" w:sz="6" w:space="0" w:color="auto"/>
+              <w:bottom w:val="single" w:sz="6" w:space="0" w:color="auto"/>
+              <w:right w:val="single" w:sz="6" w:space="0" w:color="auto"/>
+            </w:tcBorders>
+            <w:tcMar>
+              <w:top w:w="240" w:type="dxa"/>
+              <w:left w:w="0" w:type="dxa"/>
+              <w:bottom w:w="240" w:type="dxa"/>
+              <w:right w:w="0" w:type="dxa"/>
+            </w:tcMar>
+            <w:vAlign w:val="center"/>
+            <w:hideMark/>
+          </w:tcPr>
+          <w:p>
+            <w:pPr>
+              <w:spacing w:after="0" w:line="240" w:lineRule="auto"/>
+              <w:rPr>
+                <w:sz w:val="20"/>
+                <w:szCs w:val="20"/>
+              </w:rPr>
+            </w:pPr>
+            <w:r>
+              <w:rPr>
+                <w:sz w:val="20"/>
+                <w:szCs w:val="20"/>
+              </w:rPr>
+              <w:t>Definiowanie stref</w:t>
+            </w:r>
+          </w:p>
+        </w:tc>
+      </w:tr>
+      <w:tr>
+        <w:trPr>
+          <w:cantSplit/>
+        </w:trPr>
+        <w:tc>
+          <w:tcPr>
+            <w:tcW w:w="0" w:type="auto"/>
+            <w:tcBorders>
+              <w:top w:val="single" w:sz="6" w:space="0" w:color="auto"/>
+              <w:left w:val="single" w:sz="6" w:space="0" w:color="auto"/>
+              <w:bottom w:val="single" w:sz="6" w:space="0" w:color="auto"/>
+              <w:right w:val="single" w:sz="6" w:space="0" w:color="auto"/>
+            </w:tcBorders>
+            <w:tcMar>
+              <w:top w:w="240" w:type="dxa"/>
+              <w:left w:w="0" w:type="dxa"/>
+              <w:bottom w:w="240" w:type="dxa"/>
+              <w:right w:w="180" w:type="dxa"/>
+            </w:tcMar>
+            <w:vAlign w:val="center"/>
+            <w:hideMark/>
+          </w:tcPr>
+          <w:p>
+            <w:pPr>
+              <w:spacing w:after="0" w:line="240" w:lineRule="auto"/>
+              <w:rPr>
+                <w:sz w:val="20"/>
+                <w:szCs w:val="20"/>
+              </w:rPr>
+            </w:pPr>
+            <w:r>
+              <w:rPr>
+                <w:b/>
+                <w:bCs/>
+                <w:sz w:val="20"/>
+                <w:szCs w:val="20"/>
+              </w:rPr>
+              <w:t>Numer</w:t>
+            </w:r>
+          </w:p>
+        </w:tc>
+        <w:tc>
+          <w:tcPr>
+            <w:tcW w:w="0" w:type="auto"/>
+            <w:tcBorders>
+              <w:top w:val="single" w:sz="6" w:space="0" w:color="auto"/>
+              <w:left w:val="single" w:sz="6" w:space="0" w:color="auto"/>
+              <w:bottom w:val="single" w:sz="6" w:space="0" w:color="auto"/>
+              <w:right w:val="single" w:sz="6" w:space="0" w:color="auto"/>
+            </w:tcBorders>
+            <w:tcMar>
+              <w:top w:w="240" w:type="dxa"/>
+              <w:left w:w="0" w:type="dxa"/>
+              <w:bottom w:w="240" w:type="dxa"/>
+              <w:right w:w="0" w:type="dxa"/>
+            </w:tcMar>
+            <w:vAlign w:val="center"/>
+            <w:hideMark/>
+          </w:tcPr>
+          <w:p>
+            <w:pPr>
+              <w:spacing w:after="0" w:line="240" w:lineRule="auto"/>
+              <w:rPr>
+                <w:sz w:val="20"/>
+                <w:szCs w:val="20"/>
+              </w:rPr>
+            </w:pPr>
+            <w:r>
+              <w:rPr>
+                <w:sz w:val="20"/>
+                <w:szCs w:val="20"/>
+              </w:rPr>
+              <w:t>UC-07</w:t>
+            </w:r>
+          </w:p>
+        </w:tc>
+      </w:tr>
+      <w:tr>
+        <w:trPr>
+          <w:cantSplit/>
+        </w:trPr>
+        <w:tc>
+          <w:tcPr>
+            <w:tcW w:w="0" w:type="auto"/>
+            <w:tcBorders>
+              <w:top w:val="single" w:sz="6" w:space="0" w:color="auto"/>
+              <w:left w:val="single" w:sz="6" w:space="0" w:color="auto"/>
+              <w:bottom w:val="single" w:sz="6" w:space="0" w:color="auto"/>
+              <w:right w:val="single" w:sz="6" w:space="0" w:color="auto"/>
+            </w:tcBorders>
+            <w:tcMar>
+              <w:top w:w="240" w:type="dxa"/>
+              <w:left w:w="0" w:type="dxa"/>
+              <w:bottom w:w="240" w:type="dxa"/>
+              <w:right w:w="180" w:type="dxa"/>
+            </w:tcMar>
+            <w:vAlign w:val="center"/>
+            <w:hideMark/>
+          </w:tcPr>
+          <w:p>
+            <w:pPr>
+              <w:spacing w:after="0" w:line="240" w:lineRule="auto"/>
+              <w:rPr>
+                <w:sz w:val="20"/>
+                <w:szCs w:val="20"/>
+              </w:rPr>
+            </w:pPr>
+            <w:r>
+              <w:rPr>
+                <w:b/>
+                <w:bCs/>
+                <w:sz w:val="20"/>
+                <w:szCs w:val="20"/>
+              </w:rPr>
+              <w:t>Twórca</w:t>
+            </w:r>
+          </w:p>
+        </w:tc>
+        <w:tc>
+          <w:tcPr>
+            <w:tcW w:w="0" w:type="auto"/>
+            <w:tcBorders>
+              <w:top w:val="single" w:sz="6" w:space="0" w:color="auto"/>
+              <w:left w:val="single" w:sz="6" w:space="0" w:color="auto"/>
+              <w:bottom w:val="single" w:sz="6" w:space="0" w:color="auto"/>
+              <w:right w:val="single" w:sz="6" w:space="0" w:color="auto"/>
+            </w:tcBorders>
+            <w:tcMar>
+              <w:top w:w="240" w:type="dxa"/>
+              <w:left w:w="0" w:type="dxa"/>
+              <w:bottom w:w="240" w:type="dxa"/>
+              <w:right w:w="0" w:type="dxa"/>
+            </w:tcMar>
+            <w:vAlign w:val="center"/>
+            <w:hideMark/>
+          </w:tcPr>
+          <w:p>
+            <w:pPr>
+              <w:spacing w:after="0" w:line="240" w:lineRule="auto"/>
+              <w:rPr>
+                <w:sz w:val="20"/>
+                <w:szCs w:val="20"/>
+              </w:rPr>
+            </w:pPr>
+            <w:r>
+              <w:rPr>
+                <w:sz w:val="20"/>
+                <w:szCs w:val="20"/>
+              </w:rPr>
+              <w:t>Analityk Systemowy</w:t>
+            </w:r>
+          </w:p>
+        </w:tc>
+      </w:tr>
+      <w:tr>
+        <w:trPr>
+          <w:cantSplit/>
+        </w:trPr>
+        <w:tc>
+          <w:tcPr>
+            <w:tcW w:w="0" w:type="auto"/>
+            <w:tcBorders>
+              <w:top w:val="single" w:sz="6" w:space="0" w:color="auto"/>
+              <w:left w:val="single" w:sz="6" w:space="0" w:color="auto"/>
+              <w:bottom w:val="single" w:sz="6" w:space="0" w:color="auto"/>
+              <w:right w:val="single" w:sz="6" w:space="0" w:color="auto"/>
+            </w:tcBorders>
+            <w:tcMar>
+              <w:top w:w="240" w:type="dxa"/>
+              <w:left w:w="0" w:type="dxa"/>
+              <w:bottom w:w="240" w:type="dxa"/>
+              <w:right w:w="180" w:type="dxa"/>
+            </w:tcMar>
+            <w:vAlign w:val="center"/>
+            <w:hideMark/>
+          </w:tcPr>
+          <w:p>
+            <w:pPr>
+              <w:spacing w:after="0" w:line="240" w:lineRule="auto"/>
+              <w:rPr>
+                <w:sz w:val="20"/>
+                <w:szCs w:val="20"/>
+              </w:rPr>
+            </w:pPr>
+            <w:r>
+              <w:rPr>
+                <w:b/>
+                <w:bCs/>
+                <w:sz w:val="20"/>
+                <w:szCs w:val="20"/>
+              </w:rPr>
+              <w:t>Poziom ważności</w:t>
+            </w:r>
+          </w:p>
+        </w:tc>
+        <w:tc>
+          <w:tcPr>
+            <w:tcW w:w="0" w:type="auto"/>
+            <w:tcBorders>
+              <w:top w:val="single" w:sz="6" w:space="0" w:color="auto"/>
+              <w:left w:val="single" w:sz="6" w:space="0" w:color="auto"/>
+              <w:bottom w:val="single" w:sz="6" w:space="0" w:color="auto"/>
+              <w:right w:val="single" w:sz="6" w:space="0" w:color="auto"/>
+            </w:tcBorders>
+            <w:tcMar>
+              <w:top w:w="240" w:type="dxa"/>
+              <w:left w:w="0" w:type="dxa"/>
+              <w:bottom w:w="240" w:type="dxa"/>
+              <w:right w:w="0" w:type="dxa"/>
+            </w:tcMar>
+            <w:vAlign w:val="center"/>
+            <w:hideMark/>
+          </w:tcPr>
+          <w:p>
+            <w:pPr>
+              <w:spacing w:after="0" w:line="240" w:lineRule="auto"/>
+              <w:rPr>
+                <w:sz w:val="20"/>
+                <w:szCs w:val="20"/>
+              </w:rPr>
+            </w:pPr>
+            <w:r>
+              <w:rPr>
+                <w:sz w:val="20"/>
+                <w:szCs w:val="20"/>
+              </w:rPr>
+              <w:t>Istotny</w:t>
+            </w:r>
+          </w:p>
+        </w:tc>
+      </w:tr>
+      <w:tr>
+        <w:trPr>
+          <w:cantSplit/>
+        </w:trPr>
+        <w:tc>
+          <w:tcPr>
+            <w:tcW w:w="0" w:type="auto"/>
+            <w:tcBorders>
+              <w:top w:val="single" w:sz="6" w:space="0" w:color="auto"/>
+              <w:left w:val="single" w:sz="6" w:space="0" w:color="auto"/>
+              <w:bottom w:val="single" w:sz="6" w:space="0" w:color="auto"/>
+              <w:right w:val="single" w:sz="6" w:space="0" w:color="auto"/>
+            </w:tcBorders>
+            <w:tcMar>
+              <w:top w:w="240" w:type="dxa"/>
+              <w:left w:w="0" w:type="dxa"/>
+              <w:bottom w:w="240" w:type="dxa"/>
+              <w:right w:w="180" w:type="dxa"/>
+            </w:tcMar>
+            <w:vAlign w:val="center"/>
+            <w:hideMark/>
+          </w:tcPr>
+          <w:p>
+            <w:pPr>
+              <w:spacing w:after="0" w:line="240" w:lineRule="auto"/>
+              <w:rPr>
+                <w:sz w:val="20"/>
+                <w:szCs w:val="20"/>
+              </w:rPr>
+            </w:pPr>
+            <w:r>
+              <w:rPr>
+                <w:b/>
+                <w:bCs/>
+                <w:sz w:val="20"/>
+                <w:szCs w:val="20"/>
+              </w:rPr>
+              <w:t>Typ przypadku użycia</w:t>
+            </w:r>
+          </w:p>
+        </w:tc>
+        <w:tc>
+          <w:tcPr>
+            <w:tcW w:w="0" w:type="auto"/>
+            <w:tcBorders>
+              <w:top w:val="single" w:sz="6" w:space="0" w:color="auto"/>
+              <w:left w:val="single" w:sz="6" w:space="0" w:color="auto"/>
+              <w:bottom w:val="single" w:sz="6" w:space="0" w:color="auto"/>
+              <w:right w:val="single" w:sz="6" w:space="0" w:color="auto"/>
+            </w:tcBorders>
+            <w:tcMar>
+              <w:top w:w="240" w:type="dxa"/>
+              <w:left w:w="0" w:type="dxa"/>
+              <w:bottom w:w="240" w:type="dxa"/>
+              <w:right w:w="0" w:type="dxa"/>
+            </w:tcMar>
+            <w:vAlign w:val="center"/>
+            <w:hideMark/>
+          </w:tcPr>
+          <w:p>
+            <w:pPr>
+              <w:spacing w:after="0" w:line="240" w:lineRule="auto"/>
+              <w:rPr>
+                <w:sz w:val="20"/>
+                <w:szCs w:val="20"/>
+              </w:rPr>
+            </w:pPr>
+            <w:r>
+              <w:rPr>
+                <w:sz w:val="20"/>
+                <w:szCs w:val="20"/>
+              </w:rPr>
+              <w:t>Szczegółowy, administracyjny</w:t>
+            </w:r>
+          </w:p>
+        </w:tc>
+      </w:tr>
+      <w:tr>
+        <w:trPr>
+          <w:cantSplit/>
+        </w:trPr>
+        <w:tc>
+          <w:tcPr>
+            <w:tcW w:w="0" w:type="auto"/>
+            <w:tcBorders>
+              <w:top w:val="single" w:sz="6" w:space="0" w:color="auto"/>
+              <w:left w:val="single" w:sz="6" w:space="0" w:color="auto"/>
+              <w:bottom w:val="single" w:sz="6" w:space="0" w:color="auto"/>
+              <w:right w:val="single" w:sz="6" w:space="0" w:color="auto"/>
+            </w:tcBorders>
+            <w:tcMar>
+              <w:top w:w="240" w:type="dxa"/>
+              <w:left w:w="0" w:type="dxa"/>
+              <w:bottom w:w="240" w:type="dxa"/>
+              <w:right w:w="180" w:type="dxa"/>
+            </w:tcMar>
+            <w:vAlign w:val="center"/>
+            <w:hideMark/>
+          </w:tcPr>
+          <w:p>
+            <w:pPr>
+              <w:spacing w:after="0" w:line="240" w:lineRule="auto"/>
+              <w:rPr>
+                <w:sz w:val="20"/>
+                <w:szCs w:val="20"/>
+              </w:rPr>
+            </w:pPr>
+            <w:r>
+              <w:rPr>
+                <w:b/>
+                <w:bCs/>
+                <w:sz w:val="20"/>
+                <w:szCs w:val="20"/>
+              </w:rPr>
+              <w:t>Aktorzy</w:t>
+            </w:r>
+          </w:p>
+        </w:tc>
+        <w:tc>
+          <w:tcPr>
+            <w:tcW w:w="0" w:type="auto"/>
+            <w:tcBorders>
+              <w:top w:val="single" w:sz="6" w:space="0" w:color="auto"/>
+              <w:left w:val="single" w:sz="6" w:space="0" w:color="auto"/>
+              <w:bottom w:val="single" w:sz="6" w:space="0" w:color="auto"/>
+              <w:right w:val="single" w:sz="6" w:space="0" w:color="auto"/>
+            </w:tcBorders>
+            <w:tcMar>
+              <w:top w:w="240" w:type="dxa"/>
+              <w:left w:w="0" w:type="dxa"/>
+              <w:bottom w:w="240" w:type="dxa"/>
+              <w:right w:w="0" w:type="dxa"/>
+            </w:tcMar>
+            <w:vAlign w:val="center"/>
+            <w:hideMark/>
+          </w:tcPr>
+          <w:p>
+            <w:pPr>
+              <w:spacing w:after="0" w:line="240" w:lineRule="auto"/>
+              <w:rPr>
+                <w:sz w:val="20"/>
+                <w:szCs w:val="20"/>
+              </w:rPr>
+            </w:pPr>
+            <w:r>
+              <w:rPr>
+                <w:sz w:val="20"/>
+                <w:szCs w:val="20"/>
+              </w:rPr>
+              <w:t>Operator floty</w:t>
+            </w:r>
+          </w:p>
+        </w:tc>
+      </w:tr>
+      <w:tr>
+        <w:trPr>
+          <w:cantSplit/>
+        </w:trPr>
+        <w:tc>
+          <w:tcPr>
+            <w:tcW w:w="0" w:type="auto"/>
+            <w:tcBorders>
+              <w:top w:val="single" w:sz="6" w:space="0" w:color="auto"/>
+              <w:left w:val="single" w:sz="6" w:space="0" w:color="auto"/>
+              <w:bottom w:val="single" w:sz="6" w:space="0" w:color="auto"/>
+              <w:right w:val="single" w:sz="6" w:space="0" w:color="auto"/>
+            </w:tcBorders>
+            <w:tcMar>
+              <w:top w:w="240" w:type="dxa"/>
+              <w:left w:w="0" w:type="dxa"/>
+              <w:bottom w:w="240" w:type="dxa"/>
+              <w:right w:w="180" w:type="dxa"/>
+            </w:tcMar>
+            <w:vAlign w:val="center"/>
+            <w:hideMark/>
+          </w:tcPr>
+          <w:p>
+            <w:pPr>
+              <w:spacing w:after="0" w:line="240" w:lineRule="auto"/>
+              <w:rPr>
+                <w:sz w:val="20"/>
+                <w:szCs w:val="20"/>
+              </w:rPr>
+            </w:pPr>
+            <w:r>
+              <w:rPr>
+                <w:b/>
+                <w:bCs/>
+                <w:sz w:val="20"/>
+                <w:szCs w:val="20"/>
+              </w:rPr>
+              <w:t>Krótki opis</w:t>
+            </w:r>
+          </w:p>
+        </w:tc>
+        <w:tc>
+          <w:tcPr>
+            <w:tcW w:w="0" w:type="auto"/>
+            <w:tcBorders>
+              <w:top w:val="single" w:sz="6" w:space="0" w:color="auto"/>
+              <w:left w:val="single" w:sz="6" w:space="0" w:color="auto"/>
+              <w:bottom w:val="single" w:sz="6" w:space="0" w:color="auto"/>
+              <w:right w:val="single" w:sz="6" w:space="0" w:color="auto"/>
+            </w:tcBorders>
+            <w:tcMar>
+              <w:top w:w="240" w:type="dxa"/>
+              <w:left w:w="0" w:type="dxa"/>
+              <w:bottom w:w="240" w:type="dxa"/>
+              <w:right w:w="0" w:type="dxa"/>
+            </w:tcMar>
+            <w:vAlign w:val="center"/>
+            <w:hideMark/>
+          </w:tcPr>
+          <w:p>
+            <w:pPr>
+              <w:spacing w:after="0" w:line="240" w:lineRule="auto"/>
+              <w:rPr>
+                <w:sz w:val="20"/>
+                <w:szCs w:val="20"/>
+              </w:rPr>
+            </w:pPr>
+            <w:r>
+              <w:rPr>
+                <w:sz w:val="20"/>
+                <w:szCs w:val="20"/>
+              </w:rPr>
+              <w:t>Tworzenie obszarów geograficznych z różnymi regułami (np. strefy parkowania, strefy zakazu).</w:t>
+            </w:r>
+          </w:p>
+        </w:tc>
+      </w:tr>
+      <w:tr>
+        <w:trPr>
+          <w:cantSplit/>
+        </w:trPr>
+        <w:tc>
+          <w:tcPr>
+            <w:tcW w:w="0" w:type="auto"/>
+            <w:tcBorders>
+              <w:top w:val="single" w:sz="6" w:space="0" w:color="auto"/>
+              <w:left w:val="single" w:sz="6" w:space="0" w:color="auto"/>
+              <w:bottom w:val="single" w:sz="6" w:space="0" w:color="auto"/>
+              <w:right w:val="single" w:sz="6" w:space="0" w:color="auto"/>
+            </w:tcBorders>
+            <w:tcMar>
+              <w:top w:w="240" w:type="dxa"/>
+              <w:left w:w="0" w:type="dxa"/>
+              <w:bottom w:w="240" w:type="dxa"/>
+              <w:right w:w="180" w:type="dxa"/>
+            </w:tcMar>
+            <w:vAlign w:val="center"/>
+            <w:hideMark/>
+          </w:tcPr>
+          <w:p>
+            <w:pPr>
+              <w:spacing w:after="0" w:line="240" w:lineRule="auto"/>
+              <w:rPr>
+                <w:sz w:val="20"/>
+                <w:szCs w:val="20"/>
+              </w:rPr>
+            </w:pPr>
+            <w:r>
+              <w:rPr>
+                <w:b/>
+                <w:bCs/>
+                <w:sz w:val="20"/>
+                <w:szCs w:val="20"/>
+              </w:rPr>
+              <w:t>Warunki wstępne</w:t>
+            </w:r>
+          </w:p>
+        </w:tc>
+        <w:tc>
+          <w:tcPr>
+            <w:tcW w:w="0" w:type="auto"/>
+            <w:tcBorders>
+              <w:top w:val="single" w:sz="6" w:space="0" w:color="auto"/>
+              <w:left w:val="single" w:sz="6" w:space="0" w:color="auto"/>
+              <w:bottom w:val="single" w:sz="6" w:space="0" w:color="auto"/>
+              <w:right w:val="single" w:sz="6" w:space="0" w:color="auto"/>
+            </w:tcBorders>
+            <w:tcMar>
+              <w:top w:w="240" w:type="dxa"/>
+              <w:left w:w="0" w:type="dxa"/>
+              <w:bottom w:w="240" w:type="dxa"/>
+              <w:right w:w="0" w:type="dxa"/>
+            </w:tcMar>
+            <w:vAlign w:val="center"/>
+            <w:hideMark/>
+          </w:tcPr>
+          <w:p>
+            <w:pPr>
+              <w:spacing w:after="0" w:line="240" w:lineRule="auto"/>
+              <w:rPr>
+                <w:sz w:val="20"/>
+                <w:szCs w:val="20"/>
+              </w:rPr>
+            </w:pPr>
+            <w:r>
+              <w:rPr>
+                <w:sz w:val="20"/>
+                <w:szCs w:val="20"/>
+              </w:rPr>
+              <w:t>Operator posiada uprawnienia "Manager Floty".</w:t>
+            </w:r>
+          </w:p>
+        </w:tc>
+      </w:tr>
+      <w:tr>
+        <w:trPr>
+          <w:cantSplit/>
+        </w:trPr>
+        <w:tc>
+          <w:tcPr>
+            <w:tcW w:w="0" w:type="auto"/>
+            <w:tcBorders>
+              <w:top w:val="single" w:sz="6" w:space="0" w:color="auto"/>
+              <w:left w:val="single" w:sz="6" w:space="0" w:color="auto"/>
+              <w:bottom w:val="single" w:sz="6" w:space="0" w:color="auto"/>
+              <w:right w:val="single" w:sz="6" w:space="0" w:color="auto"/>
+            </w:tcBorders>
+            <w:tcMar>
+              <w:top w:w="240" w:type="dxa"/>
+              <w:left w:w="0" w:type="dxa"/>
+              <w:bottom w:w="240" w:type="dxa"/>
+              <w:right w:w="180" w:type="dxa"/>
+            </w:tcMar>
+            <w:vAlign w:val="center"/>
+            <w:hideMark/>
+          </w:tcPr>
+          <w:p>
+            <w:pPr>
+              <w:spacing w:after="0" w:line="240" w:lineRule="auto"/>
+              <w:rPr>
+                <w:sz w:val="20"/>
+                <w:szCs w:val="20"/>
+              </w:rPr>
+            </w:pPr>
+            <w:r>
+              <w:rPr>
+                <w:b/>
+                <w:bCs/>
+                <w:sz w:val="20"/>
+                <w:szCs w:val="20"/>
+              </w:rPr>
+              <w:t>Warunki końcowe</w:t>
+            </w:r>
+          </w:p>
+        </w:tc>
+        <w:tc>
+          <w:tcPr>
+            <w:tcW w:w="0" w:type="auto"/>
+            <w:tcBorders>
+              <w:top w:val="single" w:sz="6" w:space="0" w:color="auto"/>
+              <w:left w:val="single" w:sz="6" w:space="0" w:color="auto"/>
+              <w:bottom w:val="single" w:sz="6" w:space="0" w:color="auto"/>
+              <w:right w:val="single" w:sz="6" w:space="0" w:color="auto"/>
+            </w:tcBorders>
+            <w:tcMar>
+              <w:top w:w="240" w:type="dxa"/>
+              <w:left w:w="0" w:type="dxa"/>
+              <w:bottom w:w="240" w:type="dxa"/>
+              <w:right w:w="0" w:type="dxa"/>
+            </w:tcMar>
+            <w:vAlign w:val="center"/>
+            <w:hideMark/>
+          </w:tcPr>
+          <w:p>
+            <w:pPr>
+              <w:spacing w:after="0" w:line="240" w:lineRule="auto"/>
+              <w:rPr>
+                <w:sz w:val="20"/>
+                <w:szCs w:val="20"/>
+              </w:rPr>
+            </w:pPr>
+            <w:r>
+              <w:rPr>
+                <w:sz w:val="20"/>
+                <w:szCs w:val="20"/>
+              </w:rPr>
+              <w:t>Zmiany są naniesione na globalną mapę i widoczne dla użytkowników.</w:t>
+            </w:r>
+          </w:p>
+        </w:tc>
+      </w:tr>
+      <w:tr>
+        <w:trPr>
+          <w:cantSplit/>
+        </w:trPr>
+        <w:tc>
+          <w:tcPr>
+            <w:tcW w:w="0" w:type="auto"/>
+            <w:tcBorders>
+              <w:top w:val="single" w:sz="6" w:space="0" w:color="auto"/>
+              <w:left w:val="single" w:sz="6" w:space="0" w:color="auto"/>
+              <w:bottom w:val="single" w:sz="6" w:space="0" w:color="auto"/>
+              <w:right w:val="single" w:sz="6" w:space="0" w:color="auto"/>
+            </w:tcBorders>
+            <w:tcMar>
+              <w:top w:w="240" w:type="dxa"/>
+              <w:left w:w="0" w:type="dxa"/>
+              <w:bottom w:w="240" w:type="dxa"/>
+              <w:right w:w="180" w:type="dxa"/>
+            </w:tcMar>
+            <w:vAlign w:val="center"/>
+            <w:hideMark/>
+          </w:tcPr>
+          <w:p>
+            <w:pPr>
+              <w:spacing w:after="0" w:line="240" w:lineRule="auto"/>
+              <w:rPr>
+                <w:sz w:val="20"/>
+                <w:szCs w:val="20"/>
+              </w:rPr>
+            </w:pPr>
+            <w:r>
+              <w:rPr>
+                <w:b/>
+                <w:bCs/>
+                <w:sz w:val="20"/>
+                <w:szCs w:val="20"/>
+              </w:rPr>
+              <w:t>Główny przepływ zdarzeń</w:t>
+            </w:r>
+          </w:p>
+        </w:tc>
+        <w:tc>
+          <w:tcPr>
+            <w:tcW w:w="0" w:type="auto"/>
+            <w:tcBorders>
+              <w:top w:val="single" w:sz="6" w:space="0" w:color="auto"/>
+              <w:left w:val="single" w:sz="6" w:space="0" w:color="auto"/>
+              <w:bottom w:val="single" w:sz="6" w:space="0" w:color="auto"/>
+              <w:right w:val="single" w:sz="6" w:space="0" w:color="auto"/>
+            </w:tcBorders>
+            <w:tcMar>
+              <w:top w:w="240" w:type="dxa"/>
+              <w:left w:w="0" w:type="dxa"/>
+              <w:bottom w:w="240" w:type="dxa"/>
+              <w:right w:w="0" w:type="dxa"/>
+            </w:tcMar>
+            <w:vAlign w:val="center"/>
+            <w:hideMark/>
+          </w:tcPr>
+          <w:p>
+            <w:pPr>
+              <w:spacing w:after="0" w:line="240" w:lineRule="auto"/>
+              <w:rPr>
+                <w:sz w:val="20"/>
+                <w:szCs w:val="20"/>
+              </w:rPr>
+            </w:pPr>
+            <w:r>
+              <w:rPr>
+                <w:sz w:val="20"/>
+                <w:szCs w:val="20"/>
+              </w:rPr>
+              <w:t>1. Operator otwiera edytor mapy.</w:t>
+            </w:r>
+          </w:p>
+          <w:p>
+            <w:pPr>
+              <w:spacing w:after="0" w:line="240" w:lineRule="auto"/>
+              <w:rPr>
+                <w:sz w:val="20"/>
+                <w:szCs w:val="20"/>
+              </w:rPr>
+            </w:pPr>
+            <w:r>
+              <w:rPr>
+                <w:sz w:val="20"/>
+                <w:szCs w:val="20"/>
+              </w:rPr>
+              <w:t>2. Operator rysuje wielokąt na mapie.</w:t>
+            </w:r>
+          </w:p>
+          <w:p>
+            <w:pPr>
+              <w:spacing w:after="0" w:line="240" w:lineRule="auto"/>
+              <w:rPr>
+                <w:sz w:val="20"/>
+                <w:szCs w:val="20"/>
+              </w:rPr>
+            </w:pPr>
+            <w:r>
+              <w:rPr>
+                <w:sz w:val="20"/>
+                <w:szCs w:val="20"/>
+              </w:rPr>
+              <w:t>3. Operator przypisuje parametry (np. prędkość max 20km/h, zakaz parkowania).</w:t>
+            </w:r>
+          </w:p>
+          <w:p>
+            <w:pPr>
+              <w:spacing w:after="0" w:line="240" w:lineRule="auto"/>
+              <w:rPr>
+                <w:sz w:val="20"/>
+                <w:szCs w:val="20"/>
+              </w:rPr>
+            </w:pPr>
+            <w:r>
+              <w:rPr>
+                <w:sz w:val="20"/>
+                <w:szCs w:val="20"/>
+              </w:rPr>
+              <w:t>4. System publikuje nową strefę.</w:t>
+            </w:r>
+          </w:p>
+        </w:tc>
+      </w:tr>
+      <w:tr>
+        <w:trPr>
+          <w:cantSplit/>
+        </w:trPr>
+        <w:tc>
+          <w:tcPr>
+            <w:tcW w:w="0" w:type="auto"/>
+            <w:tcBorders>
+              <w:top w:val="single" w:sz="6" w:space="0" w:color="auto"/>
+              <w:left w:val="single" w:sz="6" w:space="0" w:color="auto"/>
+              <w:bottom w:val="single" w:sz="6" w:space="0" w:color="auto"/>
+              <w:right w:val="single" w:sz="6" w:space="0" w:color="auto"/>
+            </w:tcBorders>
+            <w:tcMar>
+              <w:top w:w="240" w:type="dxa"/>
+              <w:left w:w="0" w:type="dxa"/>
+              <w:bottom w:w="240" w:type="dxa"/>
+              <w:right w:w="180" w:type="dxa"/>
+            </w:tcMar>
+            <w:vAlign w:val="center"/>
+            <w:hideMark/>
+          </w:tcPr>
+          <w:p>
+            <w:pPr>
+              <w:spacing w:after="0" w:line="240" w:lineRule="auto"/>
+              <w:rPr>
+                <w:sz w:val="20"/>
+                <w:szCs w:val="20"/>
+              </w:rPr>
+            </w:pPr>
+            <w:r>
+              <w:rPr>
+                <w:b/>
+                <w:bCs/>
+                <w:sz w:val="20"/>
+                <w:szCs w:val="20"/>
+              </w:rPr>
+              <w:t>Alternatywne przepływy</w:t>
+            </w:r>
+          </w:p>
+        </w:tc>
+        <w:tc>
+          <w:tcPr>
+            <w:tcW w:w="0" w:type="auto"/>
+            <w:tcBorders>
+              <w:top w:val="single" w:sz="6" w:space="0" w:color="auto"/>
+              <w:left w:val="single" w:sz="6" w:space="0" w:color="auto"/>
+              <w:bottom w:val="single" w:sz="6" w:space="0" w:color="auto"/>
+              <w:right w:val="single" w:sz="6" w:space="0" w:color="auto"/>
+            </w:tcBorders>
+            <w:tcMar>
+              <w:top w:w="240" w:type="dxa"/>
+              <w:left w:w="0" w:type="dxa"/>
+              <w:bottom w:w="240" w:type="dxa"/>
+              <w:right w:w="0" w:type="dxa"/>
+            </w:tcMar>
+            <w:vAlign w:val="center"/>
+            <w:hideMark/>
+          </w:tcPr>
+          <w:p>
+            <w:pPr>
+              <w:spacing w:after="0" w:line="240" w:lineRule="auto"/>
+              <w:rPr>
+                <w:sz w:val="20"/>
+                <w:szCs w:val="20"/>
+              </w:rPr>
+            </w:pPr>
+            <w:r>
+              <w:rPr>
+                <w:sz w:val="20"/>
+                <w:szCs w:val="20"/>
+              </w:rPr>
+              <w:t>3a. Kopiowanie strefy: Operator duplikuje strefę z innego miasta.</w:t>
+            </w:r>
+          </w:p>
+        </w:tc>
+      </w:tr>
+      <w:tr>
+        <w:trPr>
+          <w:cantSplit/>
+        </w:trPr>
+        <w:tc>
+          <w:tcPr>
+            <w:tcW w:w="0" w:type="auto"/>
+            <w:tcBorders>
+              <w:top w:val="single" w:sz="6" w:space="0" w:color="auto"/>
+              <w:left w:val="single" w:sz="6" w:space="0" w:color="auto"/>
+              <w:bottom w:val="single" w:sz="6" w:space="0" w:color="auto"/>
+              <w:right w:val="single" w:sz="6" w:space="0" w:color="auto"/>
+            </w:tcBorders>
+            <w:tcMar>
+              <w:top w:w="240" w:type="dxa"/>
+              <w:left w:w="0" w:type="dxa"/>
+              <w:bottom w:w="240" w:type="dxa"/>
+              <w:right w:w="180" w:type="dxa"/>
+            </w:tcMar>
+            <w:vAlign w:val="center"/>
+            <w:hideMark/>
+          </w:tcPr>
+          <w:p>
+            <w:pPr>
+              <w:spacing w:after="0" w:line="240" w:lineRule="auto"/>
+              <w:rPr>
+                <w:sz w:val="20"/>
+                <w:szCs w:val="20"/>
+              </w:rPr>
+            </w:pPr>
+            <w:r>
+              <w:rPr>
+                <w:b/>
+                <w:bCs/>
+                <w:sz w:val="20"/>
+                <w:szCs w:val="20"/>
+              </w:rPr>
+              <w:t>Wyjątki w przepływach</w:t>
+            </w:r>
+          </w:p>
+        </w:tc>
+        <w:tc>
+          <w:tcPr>
+            <w:tcW w:w="0" w:type="auto"/>
+            <w:tcBorders>
+              <w:top w:val="single" w:sz="6" w:space="0" w:color="auto"/>
+              <w:left w:val="single" w:sz="6" w:space="0" w:color="auto"/>
+              <w:bottom w:val="single" w:sz="6" w:space="0" w:color="auto"/>
+              <w:right w:val="single" w:sz="6" w:space="0" w:color="auto"/>
+            </w:tcBorders>
+            <w:tcMar>
+              <w:top w:w="240" w:type="dxa"/>
+              <w:left w:w="0" w:type="dxa"/>
+              <w:bottom w:w="240" w:type="dxa"/>
+              <w:right w:w="0" w:type="dxa"/>
+            </w:tcMar>
+            <w:vAlign w:val="center"/>
+            <w:hideMark/>
+          </w:tcPr>
+          <w:p>
+            <w:pPr>
+              <w:spacing w:after="0" w:line="240" w:lineRule="auto"/>
+              <w:rPr>
+                <w:sz w:val="20"/>
+                <w:szCs w:val="20"/>
+              </w:rPr>
+            </w:pPr>
+            <w:r>
+              <w:rPr>
+                <w:sz w:val="20"/>
+                <w:szCs w:val="20"/>
+              </w:rPr>
+              <w:t>4a. Błąd nakładania (</w:t>
+            </w:r>
+            <w:proofErr w:type="spellStart"/>
+            <w:r>
+              <w:rPr>
+                <w:sz w:val="20"/>
+                <w:szCs w:val="20"/>
+              </w:rPr>
+              <w:t>Overlap</w:t>
+            </w:r>
+            <w:proofErr w:type="spellEnd"/>
+            <w:r>
+              <w:rPr>
+                <w:sz w:val="20"/>
+                <w:szCs w:val="20"/>
+              </w:rPr>
+              <w:t>): System wykrywa konflikt reguł w tym samym miejscu.</w:t>
+            </w:r>
+          </w:p>
+        </w:tc>
+      </w:tr>
+      <w:tr>
+        <w:trPr>
+          <w:cantSplit/>
+        </w:trPr>
+        <w:tc>
+          <w:tcPr>
+            <w:tcW w:w="0" w:type="auto"/>
+            <w:tcBorders>
+              <w:top w:val="single" w:sz="6" w:space="0" w:color="auto"/>
+              <w:left w:val="single" w:sz="6" w:space="0" w:color="auto"/>
+              <w:bottom w:val="single" w:sz="6" w:space="0" w:color="auto"/>
+              <w:right w:val="single" w:sz="6" w:space="0" w:color="auto"/>
+            </w:tcBorders>
+            <w:tcMar>
+              <w:top w:w="240" w:type="dxa"/>
+              <w:left w:w="0" w:type="dxa"/>
+              <w:bottom w:w="240" w:type="dxa"/>
+              <w:right w:w="180" w:type="dxa"/>
+            </w:tcMar>
+            <w:vAlign w:val="center"/>
+            <w:hideMark/>
+          </w:tcPr>
+          <w:p>
+            <w:pPr>
+              <w:spacing w:after="0" w:line="240" w:lineRule="auto"/>
+              <w:rPr>
+                <w:sz w:val="20"/>
+                <w:szCs w:val="20"/>
+              </w:rPr>
+            </w:pPr>
+            <w:r>
+              <w:rPr>
+                <w:b/>
+                <w:bCs/>
+                <w:sz w:val="20"/>
+                <w:szCs w:val="20"/>
+              </w:rPr>
+              <w:t>Specjalne wymagania</w:t>
+            </w:r>
+          </w:p>
+        </w:tc>
+        <w:tc>
+          <w:tcPr>
+            <w:tcW w:w="0" w:type="auto"/>
+            <w:tcBorders>
+              <w:top w:val="single" w:sz="6" w:space="0" w:color="auto"/>
+              <w:left w:val="single" w:sz="6" w:space="0" w:color="auto"/>
+              <w:bottom w:val="single" w:sz="6" w:space="0" w:color="auto"/>
+              <w:right w:val="single" w:sz="6" w:space="0" w:color="auto"/>
+            </w:tcBorders>
+            <w:tcMar>
+              <w:top w:w="240" w:type="dxa"/>
+              <w:left w:w="0" w:type="dxa"/>
+              <w:bottom w:w="240" w:type="dxa"/>
+              <w:right w:w="0" w:type="dxa"/>
+            </w:tcMar>
+            <w:vAlign w:val="center"/>
+            <w:hideMark/>
+          </w:tcPr>
+          <w:p>
+            <w:pPr>
+              <w:spacing w:after="0" w:line="240" w:lineRule="auto"/>
+              <w:rPr>
+                <w:sz w:val="20"/>
+                <w:szCs w:val="20"/>
+              </w:rPr>
+            </w:pPr>
+            <w:r>
+              <w:rPr>
+                <w:sz w:val="20"/>
+                <w:szCs w:val="20"/>
+              </w:rPr>
+              <w:t>Narzędzie do rysowania musi być precyzyjne (skala budynków).</w:t>
+            </w:r>
+          </w:p>
+        </w:tc>
+      </w:tr>
+      <w:tr>
+        <w:trPr>
+          <w:cantSplit/>
+        </w:trPr>
+        <w:tc>
+          <w:tcPr>
+            <w:tcW w:w="0" w:type="auto"/>
+            <w:tcBorders>
+              <w:top w:val="single" w:sz="6" w:space="0" w:color="auto"/>
+              <w:left w:val="single" w:sz="6" w:space="0" w:color="auto"/>
+              <w:bottom w:val="single" w:sz="6" w:space="0" w:color="auto"/>
+              <w:right w:val="single" w:sz="6" w:space="0" w:color="auto"/>
+            </w:tcBorders>
+            <w:tcMar>
+              <w:top w:w="240" w:type="dxa"/>
+              <w:left w:w="0" w:type="dxa"/>
+              <w:bottom w:w="240" w:type="dxa"/>
+              <w:right w:w="180" w:type="dxa"/>
+            </w:tcMar>
+            <w:vAlign w:val="center"/>
+            <w:hideMark/>
+          </w:tcPr>
+          <w:p>
+            <w:pPr>
+              <w:spacing w:after="0" w:line="240" w:lineRule="auto"/>
+              <w:rPr>
+                <w:sz w:val="20"/>
+                <w:szCs w:val="20"/>
+              </w:rPr>
+            </w:pPr>
+            <w:r>
+              <w:rPr>
+                <w:b/>
+                <w:bCs/>
+                <w:sz w:val="20"/>
+                <w:szCs w:val="20"/>
+              </w:rPr>
+              <w:t>Notatki i kwestie</w:t>
+            </w:r>
+          </w:p>
+        </w:tc>
+        <w:tc>
+          <w:tcPr>
+            <w:tcW w:w="0" w:type="auto"/>
+            <w:tcBorders>
+              <w:top w:val="single" w:sz="6" w:space="0" w:color="auto"/>
+              <w:left w:val="single" w:sz="6" w:space="0" w:color="auto"/>
+              <w:bottom w:val="single" w:sz="6" w:space="0" w:color="auto"/>
+              <w:right w:val="single" w:sz="6" w:space="0" w:color="auto"/>
+            </w:tcBorders>
+            <w:tcMar>
+              <w:top w:w="240" w:type="dxa"/>
+              <w:left w:w="0" w:type="dxa"/>
+              <w:bottom w:w="240" w:type="dxa"/>
+              <w:right w:w="0" w:type="dxa"/>
+            </w:tcMar>
+            <w:vAlign w:val="center"/>
+            <w:hideMark/>
+          </w:tcPr>
+          <w:p>
+            <w:pPr>
+              <w:spacing w:after="0" w:line="240" w:lineRule="auto"/>
+              <w:rPr>
+                <w:sz w:val="20"/>
+                <w:szCs w:val="20"/>
+              </w:rPr>
+            </w:pPr>
+            <w:r>
+              <w:rPr>
+                <w:sz w:val="20"/>
+                <w:szCs w:val="20"/>
+              </w:rPr>
+              <w:t>Integracja z miejskimi systemami płatnego parkowania (automatyczna aktualizacja).</w:t>
+            </w:r>
+          </w:p>
+        </w:tc>
+      </w:tr>
+    </w:tbl>
+    <w:p>
+      <w:r>
+        <w:rPr>
+          <w:noProof/>
+        </w:rPr>
+        <w:lastRenderedPageBreak/>
+        <w:drawing>
+          <wp:anchor distT="0" distB="0" distL="114300" distR="114300" simplePos="0" relativeHeight="251669504" behindDoc="0" locked="0" layoutInCell="1" allowOverlap="1" wp14:anchorId="3C855F22" wp14:editId="3BC63E05">
+            <wp:simplePos x="0" y="0"/>
+            <wp:positionH relativeFrom="margin">
+              <wp:align>right</wp:align>
+            </wp:positionH>
+            <wp:positionV relativeFrom="paragraph">
+              <wp:posOffset>0</wp:posOffset>
+            </wp:positionV>
+            <wp:extent cx="5734050" cy="4083050"/>
+            <wp:effectExtent l="0" t="0" r="0" b="0"/>
+            <wp:wrapSquare wrapText="bothSides"/>
+            <wp:docPr id="500201338" name="Obraz 5"/>
+            <wp:cNvGraphicFramePr>
+              <a:graphicFrameLocks xmlns:a="http://schemas.openxmlformats.org/drawingml/2006/main" noChangeAspect="1"/>
+            </wp:cNvGraphicFramePr>
+            <a:graphic xmlns:a="http://schemas.openxmlformats.org/drawingml/2006/main">
+              <a:graphicData uri="http://schemas.openxmlformats.org/drawingml/2006/picture">
+                <pic:pic xmlns:pic="http://schemas.openxmlformats.org/drawingml/2006/picture">
+                  <pic:nvPicPr>
+                    <pic:cNvPr id="0" name="Picture 4"/>
+                    <pic:cNvPicPr>
+                      <a:picLocks noChangeAspect="1" noChangeArrowheads="1"/>
+                    </pic:cNvPicPr>
+                  </pic:nvPicPr>
+                  <pic:blipFill>
+                    <a:blip r:embed="rId17">
+                      <a:extLst>
+                        <a:ext uri="{28A0092B-C50C-407E-A947-70E740481C1C}">
+                          <a14:useLocalDpi xmlns:a14="http://schemas.microsoft.com/office/drawing/2010/main" val="0"/>
+                        </a:ext>
+                      </a:extLst>
+                    </a:blip>
+                    <a:srcRect/>
+                    <a:stretch>
+                      <a:fillRect/>
+                    </a:stretch>
+                  </pic:blipFill>
+                  <pic:spPr bwMode="auto">
+                    <a:xfrm>
+                      <a:off x="0" y="0"/>
+                      <a:ext cx="5734050" cy="4083050"/>
+                    </a:xfrm>
+                    <a:prstGeom prst="rect">
+                      <a:avLst/>
+                    </a:prstGeom>
+                    <a:noFill/>
+                    <a:ln>
+                      <a:noFill/>
+                    </a:ln>
+                  </pic:spPr>
+                </pic:pic>
+              </a:graphicData>
+            </a:graphic>
+          </wp:anchor>
+        </w:drawing>
+      </w:r>
     </w:p>
     <w:p>
       <w:pPr>
@@ -14099,6 +14047,7 @@
                 <w:sz w:val="20"/>
                 <w:szCs w:val="20"/>
               </w:rPr>
+              <w:lastRenderedPageBreak/>
               <w:t>Warunki wstępne</w:t>
             </w:r>
           </w:p>
@@ -14632,7 +14581,6 @@
                 <w:sz w:val="20"/>
                 <w:szCs w:val="20"/>
               </w:rPr>
-              <w:lastRenderedPageBreak/>
               <w:t>Notatki i kwestie</w:t>
             </w:r>
           </w:p>
@@ -14674,16 +14622,23 @@
         </w:tc>
       </w:tr>
     </w:tbl>
-    <w:p/>
     <w:p>
       <w:r>
         <w:rPr>
           <w:noProof/>
         </w:rPr>
         <w:drawing>
-          <wp:inline distT="0" distB="0" distL="0" distR="0" wp14:anchorId="4306967F" wp14:editId="6EC86764">
-            <wp:extent cx="5727700" cy="4616450"/>
-            <wp:effectExtent l="0" t="0" r="6350" b="0"/>
+          <wp:anchor distT="0" distB="0" distL="114300" distR="114300" simplePos="0" relativeHeight="251670528" behindDoc="0" locked="0" layoutInCell="1" allowOverlap="1" wp14:anchorId="4306967F" wp14:editId="61F602C2">
+            <wp:simplePos x="0" y="0"/>
+            <wp:positionH relativeFrom="margin">
+              <wp:align>center</wp:align>
+            </wp:positionH>
+            <wp:positionV relativeFrom="paragraph">
+              <wp:posOffset>255905</wp:posOffset>
+            </wp:positionV>
+            <wp:extent cx="4616826" cy="3721100"/>
+            <wp:effectExtent l="0" t="0" r="0" b="0"/>
+            <wp:wrapSquare wrapText="bothSides"/>
             <wp:docPr id="338549726" name="Obraz 8"/>
             <wp:cNvGraphicFramePr>
               <a:graphicFrameLocks xmlns:a="http://schemas.openxmlformats.org/drawingml/2006/main" noChangeAspect="1"/>
@@ -14698,7 +14653,7 @@
                     </pic:cNvPicPr>
                   </pic:nvPicPr>
                   <pic:blipFill>
-                    <a:blip r:embed="rId16">
+                    <a:blip r:embed="rId18" cstate="print">
                       <a:extLst>
                         <a:ext uri="{28A0092B-C50C-407E-A947-70E740481C1C}">
                           <a14:useLocalDpi xmlns:a14="http://schemas.microsoft.com/office/drawing/2010/main" val="0"/>
@@ -14713,7 +14668,7 @@
                   <pic:spPr bwMode="auto">
                     <a:xfrm>
                       <a:off x="0" y="0"/>
-                      <a:ext cx="5727700" cy="4616450"/>
+                      <a:ext cx="4616826" cy="3721100"/>
                     </a:xfrm>
                     <a:prstGeom prst="rect">
                       <a:avLst/>
@@ -14726,10 +14681,11 @@
                 </pic:pic>
               </a:graphicData>
             </a:graphic>
-          </wp:inline>
+          </wp:anchor>
         </w:drawing>
       </w:r>
     </w:p>
+    <w:p/>
     <w:p>
       <w:pPr>
         <w:pStyle w:val="Nagwek1"/>
@@ -14773,7 +14729,7 @@
                     <pic:cNvPicPr/>
                   </pic:nvPicPr>
                   <pic:blipFill>
-                    <a:blip r:embed="rId17" cstate="print">
+                    <a:blip r:embed="rId19" cstate="print">
                       <a:extLst>
                         <a:ext uri="{28A0092B-C50C-407E-A947-70E740481C1C}">
                           <a14:useLocalDpi xmlns:a14="http://schemas.microsoft.com/office/drawing/2010/main" val="0"/>
@@ -14842,7 +14798,7 @@
                     <pic:cNvPicPr/>
                   </pic:nvPicPr>
                   <pic:blipFill>
-                    <a:blip r:embed="rId18">
+                    <a:blip r:embed="rId20">
                       <a:extLst>
                         <a:ext uri="{28A0092B-C50C-407E-A947-70E740481C1C}">
                           <a14:useLocalDpi xmlns:a14="http://schemas.microsoft.com/office/drawing/2010/main" val="0"/>
@@ -14870,7 +14826,7 @@
       </w:r>
     </w:p>
     <w:sectPr>
-      <w:footerReference w:type="default" r:id="rId19"/>
+      <w:footerReference w:type="default" r:id="rId21"/>
       <w:pgSz w:w="11906" w:h="16838"/>
       <w:pgMar w:top="1440" w:right="1440" w:bottom="1440" w:left="1440" w:header="708" w:footer="708" w:gutter="0"/>
       <w:cols w:space="708"/>
@@ -14878,6 +14834,31 @@
     </w:sectPr>
   </w:body>
 </w:document>
+</file>
+
+<file path=word/endnotes.xml><?xml version="1.0" encoding="utf-8"?>
+<w:endnotes xmlns:wpc="http://schemas.microsoft.com/office/word/2010/wordprocessingCanvas" xmlns:cx="http://schemas.microsoft.com/office/drawing/2014/chartex" xmlns:cx1="http://schemas.microsoft.com/office/drawing/2015/9/8/chartex" xmlns:cx2="http://schemas.microsoft.com/office/drawing/2015/10/21/chartex" xmlns:cx3="http://schemas.microsoft.com/office/drawing/2016/5/9/chartex" xmlns:cx4="http://schemas.microsoft.com/office/drawing/2016/5/10/chartex" xmlns:cx5="http://schemas.microsoft.com/office/drawing/2016/5/11/chartex" xmlns:cx6="http://schemas.microsoft.com/office/drawing/2016/5/12/chartex" xmlns:cx7="http://schemas.microsoft.com/office/drawing/2016/5/13/chartex" xmlns:cx8="http://schemas.microsoft.com/office/drawing/2016/5/14/chartex" xmlns:mc="http://schemas.openxmlformats.org/markup-compatibility/2006" xmlns:aink="http://schemas.microsoft.com/office/drawing/2016/ink" xmlns:am3d="http://schemas.microsoft.com/office/drawing/2017/model3d" xmlns:o="urn:schemas-microsoft-com:office:office" xmlns:oel="http://schemas.microsoft.com/office/2019/extlst" xmlns:r="http://schemas.openxmlformats.org/officeDocument/2006/relationships" xmlns:m="http://schemas.openxmlformats.org/officeDocument/2006/math" xmlns:v="urn:schemas-microsoft-com:vml" xmlns:wp14="http://schemas.microsoft.com/office/word/2010/wordprocessingDrawing" xmlns:wp="http://schemas.openxmlformats.org/drawingml/2006/wordprocessingDrawing" xmlns:w10="urn:schemas-microsoft-com:office:word" xmlns:w="http://schemas.openxmlformats.org/wordprocessingml/2006/main" xmlns:w14="http://schemas.microsoft.com/office/word/2010/wordml" xmlns:w15="http://schemas.microsoft.com/office/word/2012/wordml" xmlns:w16cex="http://schemas.microsoft.com/office/word/2018/wordml/cex" xmlns:w16cid="http://schemas.microsoft.com/office/word/2016/wordml/cid" xmlns:w16="http://schemas.microsoft.com/office/word/2018/wordml" xmlns:w16du="http://schemas.microsoft.com/office/word/2023/wordml/word16du" xmlns:w16sdtdh="http://schemas.microsoft.com/office/word/2020/wordml/sdtdatahash" xmlns:w16sdtfl="http://schemas.microsoft.com/office/word/2024/wordml/sdtformatlock" xmlns:w16se="http://schemas.microsoft.com/office/word/2015/wordml/symex" xmlns:wpg="http://schemas.microsoft.com/office/word/2010/wordprocessingGroup" xmlns:wpi="http://schemas.microsoft.com/office/word/2010/wordprocessingInk" xmlns:wne="http://schemas.microsoft.com/office/word/2006/wordml" xmlns:wps="http://schemas.microsoft.com/office/word/2010/wordprocessingShape" mc:Ignorable="w14 w15 w16se w16cid w16 w16cex w16sdtdh w16sdtfl w16du wp14">
+  <w:endnote w:type="separator" w:id="-1">
+    <w:p>
+      <w:pPr>
+        <w:spacing w:after="0" w:line="240" w:lineRule="auto"/>
+      </w:pPr>
+      <w:r>
+        <w:separator/>
+      </w:r>
+    </w:p>
+  </w:endnote>
+  <w:endnote w:type="continuationSeparator" w:id="0">
+    <w:p>
+      <w:pPr>
+        <w:spacing w:after="0" w:line="240" w:lineRule="auto"/>
+      </w:pPr>
+      <w:r>
+        <w:continuationSeparator/>
+      </w:r>
+    </w:p>
+  </w:endnote>
+</w:endnotes>
 </file>
 
 <file path=word/footer1.xml><?xml version="1.0" encoding="utf-8"?>
@@ -14893,6 +14874,31 @@
     </w:pPr>
   </w:p>
 </w:ftr>
+</file>
+
+<file path=word/footnotes.xml><?xml version="1.0" encoding="utf-8"?>
+<w:footnotes xmlns:wpc="http://schemas.microsoft.com/office/word/2010/wordprocessingCanvas" xmlns:cx="http://schemas.microsoft.com/office/drawing/2014/chartex" xmlns:cx1="http://schemas.microsoft.com/office/drawing/2015/9/8/chartex" xmlns:cx2="http://schemas.microsoft.com/office/drawing/2015/10/21/chartex" xmlns:cx3="http://schemas.microsoft.com/office/drawing/2016/5/9/chartex" xmlns:cx4="http://schemas.microsoft.com/office/drawing/2016/5/10/chartex" xmlns:cx5="http://schemas.microsoft.com/office/drawing/2016/5/11/chartex" xmlns:cx6="http://schemas.microsoft.com/office/drawing/2016/5/12/chartex" xmlns:cx7="http://schemas.microsoft.com/office/drawing/2016/5/13/chartex" xmlns:cx8="http://schemas.microsoft.com/office/drawing/2016/5/14/chartex" xmlns:mc="http://schemas.openxmlformats.org/markup-compatibility/2006" xmlns:aink="http://schemas.microsoft.com/office/drawing/2016/ink" xmlns:am3d="http://schemas.microsoft.com/office/drawing/2017/model3d" xmlns:o="urn:schemas-microsoft-com:office:office" xmlns:oel="http://schemas.microsoft.com/office/2019/extlst" xmlns:r="http://schemas.openxmlformats.org/officeDocument/2006/relationships" xmlns:m="http://schemas.openxmlformats.org/officeDocument/2006/math" xmlns:v="urn:schemas-microsoft-com:vml" xmlns:wp14="http://schemas.microsoft.com/office/word/2010/wordprocessingDrawing" xmlns:wp="http://schemas.openxmlformats.org/drawingml/2006/wordprocessingDrawing" xmlns:w10="urn:schemas-microsoft-com:office:word" xmlns:w="http://schemas.openxmlformats.org/wordprocessingml/2006/main" xmlns:w14="http://schemas.microsoft.com/office/word/2010/wordml" xmlns:w15="http://schemas.microsoft.com/office/word/2012/wordml" xmlns:w16cex="http://schemas.microsoft.com/office/word/2018/wordml/cex" xmlns:w16cid="http://schemas.microsoft.com/office/word/2016/wordml/cid" xmlns:w16="http://schemas.microsoft.com/office/word/2018/wordml" xmlns:w16du="http://schemas.microsoft.com/office/word/2023/wordml/word16du" xmlns:w16sdtdh="http://schemas.microsoft.com/office/word/2020/wordml/sdtdatahash" xmlns:w16sdtfl="http://schemas.microsoft.com/office/word/2024/wordml/sdtformatlock" xmlns:w16se="http://schemas.microsoft.com/office/word/2015/wordml/symex" xmlns:wpg="http://schemas.microsoft.com/office/word/2010/wordprocessingGroup" xmlns:wpi="http://schemas.microsoft.com/office/word/2010/wordprocessingInk" xmlns:wne="http://schemas.microsoft.com/office/word/2006/wordml" xmlns:wps="http://schemas.microsoft.com/office/word/2010/wordprocessingShape" mc:Ignorable="w14 w15 w16se w16cid w16 w16cex w16sdtdh w16sdtfl w16du wp14">
+  <w:footnote w:type="separator" w:id="-1">
+    <w:p>
+      <w:pPr>
+        <w:spacing w:after="0" w:line="240" w:lineRule="auto"/>
+      </w:pPr>
+      <w:r>
+        <w:separator/>
+      </w:r>
+    </w:p>
+  </w:footnote>
+  <w:footnote w:type="continuationSeparator" w:id="0">
+    <w:p>
+      <w:pPr>
+        <w:spacing w:after="0" w:line="240" w:lineRule="auto"/>
+      </w:pPr>
+      <w:r>
+        <w:continuationSeparator/>
+      </w:r>
+    </w:p>
+  </w:footnote>
+</w:footnotes>
 </file>
 
 <file path=word/numbering.xml><?xml version="1.0" encoding="utf-8"?>

</xml_diff>

<commit_message>
diagram obiektow; diagram: relacyjny model bazy danych; sprawozdanie 5;
</commit_message>
<xml_diff>
--- a/docs/ProjectDocumentation.docx
+++ b/docs/ProjectDocumentation.docx
@@ -3128,25 +3128,7 @@
           <w:i/>
           <w:iCs/>
         </w:rPr>
-        <w:t>«</w:t>
-      </w:r>
-      <w:proofErr w:type="spellStart"/>
-      <w:r>
-        <w:rPr>
-          <w:rFonts w:eastAsiaTheme="minorEastAsia"/>
-          <w:i/>
-          <w:iCs/>
-        </w:rPr>
-        <w:t>include</w:t>
-      </w:r>
-      <w:proofErr w:type="spellEnd"/>
-      <w:r>
-        <w:rPr>
-          <w:rFonts w:eastAsiaTheme="minorEastAsia"/>
-          <w:i/>
-          <w:iCs/>
-        </w:rPr>
-        <w:t>»</w:t>
+        <w:t>«include»</w:t>
       </w:r>
       <w:r>
         <w:rPr>
@@ -4726,23 +4708,7 @@
                 <w:sz w:val="20"/>
                 <w:szCs w:val="20"/>
               </w:rPr>
-              <w:t>1a. Logowanie przez Biometrię: Użytkownik używa odcisku palca/</w:t>
-            </w:r>
-            <w:proofErr w:type="spellStart"/>
-            <w:r>
-              <w:rPr>
-                <w:sz w:val="20"/>
-                <w:szCs w:val="20"/>
-              </w:rPr>
-              <w:t>FaceID</w:t>
-            </w:r>
-            <w:proofErr w:type="spellEnd"/>
-            <w:r>
-              <w:rPr>
-                <w:sz w:val="20"/>
-                <w:szCs w:val="20"/>
-              </w:rPr>
-              <w:t xml:space="preserve"> zamiast hasła.</w:t>
+              <w:t>1a. Logowanie przez Biometrię: Użytkownik używa odcisku palca/FaceID zamiast hasła.</w:t>
             </w:r>
           </w:p>
           <w:p>
@@ -4771,39 +4737,7 @@
                 <w:sz w:val="20"/>
                 <w:szCs w:val="20"/>
               </w:rPr>
-              <w:t xml:space="preserve">1b. Logowanie przez </w:t>
-            </w:r>
-            <w:proofErr w:type="spellStart"/>
-            <w:r>
-              <w:rPr>
-                <w:sz w:val="20"/>
-                <w:szCs w:val="20"/>
-              </w:rPr>
-              <w:t>Social</w:t>
-            </w:r>
-            <w:proofErr w:type="spellEnd"/>
-            <w:r>
-              <w:rPr>
-                <w:sz w:val="20"/>
-                <w:szCs w:val="20"/>
-              </w:rPr>
-              <w:t xml:space="preserve"> Media: System weryfikuje </w:t>
-            </w:r>
-            <w:proofErr w:type="spellStart"/>
-            <w:r>
-              <w:rPr>
-                <w:sz w:val="20"/>
-                <w:szCs w:val="20"/>
-              </w:rPr>
-              <w:t>token</w:t>
-            </w:r>
-            <w:proofErr w:type="spellEnd"/>
-            <w:r>
-              <w:rPr>
-                <w:sz w:val="20"/>
-                <w:szCs w:val="20"/>
-              </w:rPr>
-              <w:t xml:space="preserve"> z zewnętrznego serwisu (np. Google).</w:t>
+              <w:t>1b. Logowanie przez Social Media: System weryfikuje token z zewnętrznego serwisu (np. Google).</w:t>
             </w:r>
           </w:p>
         </w:tc>
@@ -5088,7 +5022,7 @@
           <w:noProof/>
         </w:rPr>
         <w:drawing>
-          <wp:inline distT="0" distB="0" distL="0" distR="0" wp14:anchorId="751F6ADB" wp14:editId="40ADC1F1">
+          <wp:inline distT="0" distB="0" distL="0" distR="0" wp14:anchorId="751F6ADB" wp14:editId="03BF38E8">
             <wp:extent cx="5721350" cy="2984500"/>
             <wp:effectExtent l="0" t="0" r="0" b="6350"/>
             <wp:docPr id="1442175989" name="Obraz 1"/>
@@ -6244,23 +6178,7 @@
                 <w:sz w:val="20"/>
                 <w:szCs w:val="20"/>
               </w:rPr>
-              <w:t xml:space="preserve">4a. Pojazd zajęty: Inny użytkownik zarezerwował pojazd milisekundy wcześniej (Race </w:t>
-            </w:r>
-            <w:proofErr w:type="spellStart"/>
-            <w:r>
-              <w:rPr>
-                <w:sz w:val="20"/>
-                <w:szCs w:val="20"/>
-              </w:rPr>
-              <w:t>Condition</w:t>
-            </w:r>
-            <w:proofErr w:type="spellEnd"/>
-            <w:r>
-              <w:rPr>
-                <w:sz w:val="20"/>
-                <w:szCs w:val="20"/>
-              </w:rPr>
-              <w:t>).</w:t>
+              <w:t>4a. Pojazd zajęty: Inny użytkownik zarezerwował pojazd milisekundy wcześniej (Race Condition).</w:t>
             </w:r>
           </w:p>
           <w:p>
@@ -7645,23 +7563,7 @@
                 <w:sz w:val="20"/>
                 <w:szCs w:val="20"/>
               </w:rPr>
-              <w:t xml:space="preserve">3a. Błąd modułu </w:t>
-            </w:r>
-            <w:proofErr w:type="spellStart"/>
-            <w:r>
-              <w:rPr>
-                <w:sz w:val="20"/>
-                <w:szCs w:val="20"/>
-              </w:rPr>
-              <w:t>IoT</w:t>
-            </w:r>
-            <w:proofErr w:type="spellEnd"/>
-            <w:r>
-              <w:rPr>
-                <w:sz w:val="20"/>
-                <w:szCs w:val="20"/>
-              </w:rPr>
-              <w:t>: Pojazd nie odpowiada na sygnał otwarcia.</w:t>
+              <w:t>3a. Błąd modułu IoT: Pojazd nie odpowiada na sygnał otwarcia.</w:t>
             </w:r>
           </w:p>
           <w:p>
@@ -10114,23 +10016,7 @@
                 <w:sz w:val="20"/>
                 <w:szCs w:val="20"/>
               </w:rPr>
-              <w:t xml:space="preserve">Wyświetlenie aktualnego stanu floty na </w:t>
-            </w:r>
-            <w:proofErr w:type="spellStart"/>
-            <w:r>
-              <w:rPr>
-                <w:sz w:val="20"/>
-                <w:szCs w:val="20"/>
-              </w:rPr>
-              <w:t>dashboardzie</w:t>
-            </w:r>
-            <w:proofErr w:type="spellEnd"/>
-            <w:r>
-              <w:rPr>
-                <w:sz w:val="20"/>
-                <w:szCs w:val="20"/>
-              </w:rPr>
-              <w:t>.</w:t>
+              <w:t>Wyświetlenie aktualnego stanu floty na dashboardzie.</w:t>
             </w:r>
           </w:p>
         </w:tc>
@@ -10207,23 +10093,7 @@
                 <w:sz w:val="20"/>
                 <w:szCs w:val="20"/>
               </w:rPr>
-              <w:t xml:space="preserve">1. Moduły </w:t>
-            </w:r>
-            <w:proofErr w:type="spellStart"/>
-            <w:r>
-              <w:rPr>
-                <w:sz w:val="20"/>
-                <w:szCs w:val="20"/>
-              </w:rPr>
-              <w:t>IoT</w:t>
-            </w:r>
-            <w:proofErr w:type="spellEnd"/>
-            <w:r>
-              <w:rPr>
-                <w:sz w:val="20"/>
-                <w:szCs w:val="20"/>
-              </w:rPr>
-              <w:t xml:space="preserve"> w pojazdach wysyłają pakiety danych (GPS, paliwo, błędy).</w:t>
+              <w:t>1. Moduły IoT w pojazdach wysyłają pakiety danych (GPS, paliwo, błędy).</w:t>
             </w:r>
             <w:r>
               <w:rPr>
@@ -10425,23 +10295,7 @@
                 <w:sz w:val="20"/>
                 <w:szCs w:val="20"/>
               </w:rPr>
-              <w:t>1a. Utrata sygnału (</w:t>
-            </w:r>
-            <w:proofErr w:type="spellStart"/>
-            <w:r>
-              <w:rPr>
-                <w:sz w:val="20"/>
-                <w:szCs w:val="20"/>
-              </w:rPr>
-              <w:t>Dead</w:t>
-            </w:r>
-            <w:proofErr w:type="spellEnd"/>
-            <w:r>
-              <w:rPr>
-                <w:sz w:val="20"/>
-                <w:szCs w:val="20"/>
-              </w:rPr>
-              <w:t xml:space="preserve"> Zone): System oznacza pojazd jako "Offline" i podświetla na czerwono.</w:t>
+              <w:t>1a. Utrata sygnału (Dead Zone): System oznacza pojazd jako "Offline" i podświetla na czerwono.</w:t>
             </w:r>
           </w:p>
         </w:tc>
@@ -10595,23 +10449,7 @@
                 <w:sz w:val="20"/>
                 <w:szCs w:val="20"/>
               </w:rPr>
-              <w:t xml:space="preserve">Kwestia RODO: Czy dane o lokalizacji przejazdu użytkownika powinny być </w:t>
-            </w:r>
-            <w:proofErr w:type="spellStart"/>
-            <w:r>
-              <w:rPr>
-                <w:sz w:val="20"/>
-                <w:szCs w:val="20"/>
-              </w:rPr>
-              <w:t>anonimizowane</w:t>
-            </w:r>
-            <w:proofErr w:type="spellEnd"/>
-            <w:r>
-              <w:rPr>
-                <w:sz w:val="20"/>
-                <w:szCs w:val="20"/>
-              </w:rPr>
-              <w:t xml:space="preserve"> po 30 dniach?</w:t>
+              <w:t>Kwestia RODO: Czy dane o lokalizacji przejazdu użytkownika powinny być anonimizowane po 30 dniach?</w:t>
             </w:r>
           </w:p>
         </w:tc>
@@ -11972,7 +11810,7 @@
           <w:noProof/>
         </w:rPr>
         <w:drawing>
-          <wp:anchor distT="0" distB="0" distL="114300" distR="114300" simplePos="0" relativeHeight="251668480" behindDoc="0" locked="0" layoutInCell="1" allowOverlap="1" wp14:anchorId="13C85C93" wp14:editId="7B77DEDD">
+          <wp:anchor distT="0" distB="0" distL="114300" distR="114300" simplePos="0" relativeHeight="251668480" behindDoc="0" locked="0" layoutInCell="1" allowOverlap="1" wp14:anchorId="13C85C93" wp14:editId="3936BB61">
             <wp:simplePos x="0" y="0"/>
             <wp:positionH relativeFrom="margin">
               <wp:align>center</wp:align>
@@ -13113,23 +12951,7 @@
                 <w:sz w:val="20"/>
                 <w:szCs w:val="20"/>
               </w:rPr>
-              <w:t>4a. Błąd nakładania (</w:t>
-            </w:r>
-            <w:proofErr w:type="spellStart"/>
-            <w:r>
-              <w:rPr>
-                <w:sz w:val="20"/>
-                <w:szCs w:val="20"/>
-              </w:rPr>
-              <w:t>Overlap</w:t>
-            </w:r>
-            <w:proofErr w:type="spellEnd"/>
-            <w:r>
-              <w:rPr>
-                <w:sz w:val="20"/>
-                <w:szCs w:val="20"/>
-              </w:rPr>
-              <w:t>): System wykrywa konflikt reguł w tym samym miejscu.</w:t>
+              <w:t>4a. Błąd nakładania (Overlap): System wykrywa konflikt reguł w tym samym miejscu.</w:t>
             </w:r>
           </w:p>
         </w:tc>
@@ -14628,7 +14450,7 @@
           <w:noProof/>
         </w:rPr>
         <w:drawing>
-          <wp:anchor distT="0" distB="0" distL="114300" distR="114300" simplePos="0" relativeHeight="251670528" behindDoc="0" locked="0" layoutInCell="1" allowOverlap="1" wp14:anchorId="4306967F" wp14:editId="273370B7">
+          <wp:anchor distT="0" distB="0" distL="114300" distR="114300" simplePos="0" relativeHeight="251670528" behindDoc="0" locked="0" layoutInCell="1" allowOverlap="1" wp14:anchorId="4306967F" wp14:editId="4FE2572A">
             <wp:simplePos x="0" y="0"/>
             <wp:positionH relativeFrom="margin">
               <wp:align>center</wp:align>
@@ -14688,22 +14510,13 @@
     <w:p/>
     <w:p>
       <w:pPr>
-        <w:pStyle w:val="Nagwek1"/>
-        <w:rPr>
-          <w:color w:val="auto"/>
-        </w:rPr>
+        <w:pStyle w:val="Styl1"/>
       </w:pPr>
       <w:r>
-        <w:rPr>
-          <w:color w:val="auto"/>
-        </w:rPr>
         <w:lastRenderedPageBreak/>
         <w:t>Implementacyjny</w:t>
       </w:r>
       <w:r>
-        <w:rPr>
-          <w:color w:val="auto"/>
-        </w:rPr>
         <w:t xml:space="preserve"> diagram klas</w:t>
       </w:r>
     </w:p>
@@ -14720,10 +14533,10 @@
           <w:noProof/>
         </w:rPr>
         <w:drawing>
-          <wp:inline distT="0" distB="0" distL="0" distR="0" wp14:anchorId="19335EB1" wp14:editId="62C46D69">
-            <wp:extent cx="5731510" cy="4032885"/>
-            <wp:effectExtent l="0" t="0" r="2540" b="5715"/>
-            <wp:docPr id="727992353" name="Obraz 2"/>
+          <wp:inline distT="0" distB="0" distL="0" distR="0" wp14:anchorId="3DE5B9D4" wp14:editId="3C4BAB78">
+            <wp:extent cx="5721350" cy="3968750"/>
+            <wp:effectExtent l="0" t="0" r="0" b="0"/>
+            <wp:docPr id="28697421" name="Obraz 2"/>
             <wp:cNvGraphicFramePr>
               <a:graphicFrameLocks xmlns:a="http://schemas.openxmlformats.org/drawingml/2006/main" noChangeAspect="1"/>
             </wp:cNvGraphicFramePr>
@@ -14731,29 +14544,36 @@
               <a:graphicData uri="http://schemas.openxmlformats.org/drawingml/2006/picture">
                 <pic:pic xmlns:pic="http://schemas.openxmlformats.org/drawingml/2006/picture">
                   <pic:nvPicPr>
-                    <pic:cNvPr id="727992353" name="Obraz 727992353"/>
-                    <pic:cNvPicPr/>
+                    <pic:cNvPr id="0" name="Picture 1"/>
+                    <pic:cNvPicPr>
+                      <a:picLocks noChangeAspect="1" noChangeArrowheads="1"/>
+                    </pic:cNvPicPr>
                   </pic:nvPicPr>
                   <pic:blipFill>
-                    <a:blip r:embed="rId19" cstate="print">
+                    <a:blip r:embed="rId19">
                       <a:extLst>
                         <a:ext uri="{28A0092B-C50C-407E-A947-70E740481C1C}">
                           <a14:useLocalDpi xmlns:a14="http://schemas.microsoft.com/office/drawing/2010/main" val="0"/>
                         </a:ext>
                       </a:extLst>
                     </a:blip>
+                    <a:srcRect/>
                     <a:stretch>
                       <a:fillRect/>
                     </a:stretch>
                   </pic:blipFill>
-                  <pic:spPr>
+                  <pic:spPr bwMode="auto">
                     <a:xfrm>
                       <a:off x="0" y="0"/>
-                      <a:ext cx="5731510" cy="4032885"/>
+                      <a:ext cx="5721350" cy="3968750"/>
                     </a:xfrm>
                     <a:prstGeom prst="rect">
                       <a:avLst/>
                     </a:prstGeom>
+                    <a:noFill/>
+                    <a:ln>
+                      <a:noFill/>
+                    </a:ln>
                   </pic:spPr>
                 </pic:pic>
               </a:graphicData>
@@ -14795,10 +14615,10 @@
           <w:noProof/>
         </w:rPr>
         <w:drawing>
-          <wp:inline distT="0" distB="0" distL="0" distR="0" wp14:anchorId="24A64F6E" wp14:editId="1B41F339">
-            <wp:extent cx="5731510" cy="3425190"/>
-            <wp:effectExtent l="0" t="0" r="2540" b="3810"/>
-            <wp:docPr id="1121119403" name="Obraz 6"/>
+          <wp:inline distT="0" distB="0" distL="0" distR="0" wp14:anchorId="4691B216" wp14:editId="62F6BE27">
+            <wp:extent cx="5727700" cy="3441700"/>
+            <wp:effectExtent l="0" t="0" r="6350" b="6350"/>
+            <wp:docPr id="557969778" name="Obraz 2"/>
             <wp:cNvGraphicFramePr>
               <a:graphicFrameLocks xmlns:a="http://schemas.openxmlformats.org/drawingml/2006/main" noChangeAspect="1"/>
             </wp:cNvGraphicFramePr>
@@ -14806,8 +14626,10 @@
               <a:graphicData uri="http://schemas.openxmlformats.org/drawingml/2006/picture">
                 <pic:pic xmlns:pic="http://schemas.openxmlformats.org/drawingml/2006/picture">
                   <pic:nvPicPr>
-                    <pic:cNvPr id="1121119403" name="Obraz 1121119403"/>
-                    <pic:cNvPicPr/>
+                    <pic:cNvPr id="0" name="Picture 1"/>
+                    <pic:cNvPicPr>
+                      <a:picLocks noChangeAspect="1" noChangeArrowheads="1"/>
+                    </pic:cNvPicPr>
                   </pic:nvPicPr>
                   <pic:blipFill>
                     <a:blip r:embed="rId20">
@@ -14817,18 +14639,23 @@
                         </a:ext>
                       </a:extLst>
                     </a:blip>
+                    <a:srcRect/>
                     <a:stretch>
                       <a:fillRect/>
                     </a:stretch>
                   </pic:blipFill>
-                  <pic:spPr>
+                  <pic:spPr bwMode="auto">
                     <a:xfrm>
                       <a:off x="0" y="0"/>
-                      <a:ext cx="5731510" cy="3425190"/>
+                      <a:ext cx="5727700" cy="3441700"/>
                     </a:xfrm>
                     <a:prstGeom prst="rect">
                       <a:avLst/>
                     </a:prstGeom>
+                    <a:noFill/>
+                    <a:ln>
+                      <a:noFill/>
+                    </a:ln>
                   </pic:spPr>
                 </pic:pic>
               </a:graphicData>
@@ -14837,8 +14664,164 @@
         </w:drawing>
       </w:r>
     </w:p>
+    <w:p>
+      <w:pPr>
+        <w:spacing w:before="240" w:after="240"/>
+        <w:rPr>
+          <w:rFonts w:eastAsiaTheme="minorEastAsia"/>
+        </w:rPr>
+      </w:pPr>
+    </w:p>
+    <w:p>
+      <w:pPr>
+        <w:pStyle w:val="Styl1"/>
+      </w:pPr>
+      <w:r>
+        <w:lastRenderedPageBreak/>
+        <w:t>Diagram Obiektów</w:t>
+      </w:r>
+    </w:p>
+    <w:p>
+      <w:r>
+        <w:rPr>
+          <w:noProof/>
+        </w:rPr>
+        <w:drawing>
+          <wp:inline distT="0" distB="0" distL="0" distR="0" wp14:anchorId="5BF16EDB" wp14:editId="7C928F9A">
+            <wp:extent cx="5715000" cy="3854450"/>
+            <wp:effectExtent l="0" t="0" r="0" b="0"/>
+            <wp:docPr id="863517967" name="Obraz 6"/>
+            <wp:cNvGraphicFramePr>
+              <a:graphicFrameLocks xmlns:a="http://schemas.openxmlformats.org/drawingml/2006/main" noChangeAspect="1"/>
+            </wp:cNvGraphicFramePr>
+            <a:graphic xmlns:a="http://schemas.openxmlformats.org/drawingml/2006/main">
+              <a:graphicData uri="http://schemas.openxmlformats.org/drawingml/2006/picture">
+                <pic:pic xmlns:pic="http://schemas.openxmlformats.org/drawingml/2006/picture">
+                  <pic:nvPicPr>
+                    <pic:cNvPr id="0" name="Picture 5"/>
+                    <pic:cNvPicPr>
+                      <a:picLocks noChangeAspect="1" noChangeArrowheads="1"/>
+                    </pic:cNvPicPr>
+                  </pic:nvPicPr>
+                  <pic:blipFill>
+                    <a:blip r:embed="rId21" cstate="print">
+                      <a:extLst>
+                        <a:ext uri="{28A0092B-C50C-407E-A947-70E740481C1C}">
+                          <a14:useLocalDpi xmlns:a14="http://schemas.microsoft.com/office/drawing/2010/main" val="0"/>
+                        </a:ext>
+                      </a:extLst>
+                    </a:blip>
+                    <a:srcRect/>
+                    <a:stretch>
+                      <a:fillRect/>
+                    </a:stretch>
+                  </pic:blipFill>
+                  <pic:spPr bwMode="auto">
+                    <a:xfrm>
+                      <a:off x="0" y="0"/>
+                      <a:ext cx="5715000" cy="3854450"/>
+                    </a:xfrm>
+                    <a:prstGeom prst="rect">
+                      <a:avLst/>
+                    </a:prstGeom>
+                    <a:noFill/>
+                    <a:ln>
+                      <a:noFill/>
+                    </a:ln>
+                  </pic:spPr>
+                </pic:pic>
+              </a:graphicData>
+            </a:graphic>
+          </wp:inline>
+        </w:drawing>
+      </w:r>
+    </w:p>
+    <w:p>
+      <w:pPr>
+        <w:pStyle w:val="Styl1"/>
+      </w:pPr>
+      <w:r>
+        <w:t>Relacyjny Model Bazy Danych</w:t>
+      </w:r>
+    </w:p>
+    <w:p>
+      <w:r>
+        <w:rPr>
+          <w:noProof/>
+        </w:rPr>
+        <w:drawing>
+          <wp:inline distT="0" distB="0" distL="0" distR="0" wp14:anchorId="075DE4CE" wp14:editId="28198F5E">
+            <wp:extent cx="5185546" cy="4229100"/>
+            <wp:effectExtent l="0" t="0" r="0" b="0"/>
+            <wp:docPr id="823773891" name="Obraz 7"/>
+            <wp:cNvGraphicFramePr>
+              <a:graphicFrameLocks xmlns:a="http://schemas.openxmlformats.org/drawingml/2006/main" noChangeAspect="1"/>
+            </wp:cNvGraphicFramePr>
+            <a:graphic xmlns:a="http://schemas.openxmlformats.org/drawingml/2006/main">
+              <a:graphicData uri="http://schemas.openxmlformats.org/drawingml/2006/picture">
+                <pic:pic xmlns:pic="http://schemas.openxmlformats.org/drawingml/2006/picture">
+                  <pic:nvPicPr>
+                    <pic:cNvPr id="0" name="Picture 6"/>
+                    <pic:cNvPicPr>
+                      <a:picLocks noChangeAspect="1" noChangeArrowheads="1"/>
+                    </pic:cNvPicPr>
+                  </pic:nvPicPr>
+                  <pic:blipFill>
+                    <a:blip r:embed="rId22" cstate="print">
+                      <a:extLst>
+                        <a:ext uri="{28A0092B-C50C-407E-A947-70E740481C1C}">
+                          <a14:useLocalDpi xmlns:a14="http://schemas.microsoft.com/office/drawing/2010/main" val="0"/>
+                        </a:ext>
+                      </a:extLst>
+                    </a:blip>
+                    <a:srcRect/>
+                    <a:stretch>
+                      <a:fillRect/>
+                    </a:stretch>
+                  </pic:blipFill>
+                  <pic:spPr bwMode="auto">
+                    <a:xfrm>
+                      <a:off x="0" y="0"/>
+                      <a:ext cx="5196314" cy="4237882"/>
+                    </a:xfrm>
+                    <a:prstGeom prst="rect">
+                      <a:avLst/>
+                    </a:prstGeom>
+                    <a:noFill/>
+                    <a:ln>
+                      <a:noFill/>
+                    </a:ln>
+                  </pic:spPr>
+                </pic:pic>
+              </a:graphicData>
+            </a:graphic>
+          </wp:inline>
+        </w:drawing>
+      </w:r>
+    </w:p>
+    <w:p>
+      <w:pPr>
+        <w:pStyle w:val="Nagwek1"/>
+        <w:rPr>
+          <w:color w:val="auto"/>
+        </w:rPr>
+      </w:pPr>
+      <w:r>
+        <w:rPr>
+          <w:color w:val="auto"/>
+        </w:rPr>
+        <w:lastRenderedPageBreak/>
+        <w:t>Interfejs Użytkownika</w:t>
+      </w:r>
+    </w:p>
+    <w:p/>
+    <w:p>
+      <w:r>
+        <w:t>..</w:t>
+      </w:r>
+    </w:p>
     <w:sectPr>
-      <w:footerReference w:type="default" r:id="rId21"/>
+      <w:footerReference w:type="default" r:id="rId23"/>
       <w:pgSz w:w="11906" w:h="16838"/>
       <w:pgMar w:top="1440" w:right="1440" w:bottom="1440" w:left="1440" w:header="708" w:footer="708" w:gutter="0"/>
       <w:cols w:space="708"/>
@@ -19524,6 +19507,28 @@
     <w:uiPriority w:val="99"/>
     <w:rsid w:val="00D64724"/>
   </w:style>
+  <w:style w:type="paragraph" w:customStyle="1" w:styleId="Styl1">
+    <w:name w:val="Styl1"/>
+    <w:basedOn w:val="Nagwek1"/>
+    <w:link w:val="Styl1Znak"/>
+    <w:qFormat/>
+    <w:rsid w:val="00054FED"/>
+    <w:rPr>
+      <w:color w:val="auto"/>
+    </w:rPr>
+  </w:style>
+  <w:style w:type="character" w:customStyle="1" w:styleId="Styl1Znak">
+    <w:name w:val="Styl1 Znak"/>
+    <w:basedOn w:val="Nagwek1Znak"/>
+    <w:link w:val="Styl1"/>
+    <w:rsid w:val="00054FED"/>
+    <w:rPr>
+      <w:rFonts w:asciiTheme="majorHAnsi" w:eastAsiaTheme="majorEastAsia" w:hAnsiTheme="majorHAnsi" w:cstheme="majorBidi"/>
+      <w:color w:val="0F4761" w:themeColor="accent1" w:themeShade="BF"/>
+      <w:sz w:val="32"/>
+      <w:szCs w:val="32"/>
+    </w:rPr>
+  </w:style>
 </w:styles>
 </file>
 

</xml_diff>

<commit_message>
status report 6; gui
</commit_message>
<xml_diff>
--- a/docs/ProjectDocumentation.docx
+++ b/docs/ProjectDocumentation.docx
@@ -3128,7 +3128,25 @@
           <w:i/>
           <w:iCs/>
         </w:rPr>
-        <w:t>«include»</w:t>
+        <w:t>«</w:t>
+      </w:r>
+      <w:proofErr w:type="spellStart"/>
+      <w:r>
+        <w:rPr>
+          <w:rFonts w:eastAsiaTheme="minorEastAsia"/>
+          <w:i/>
+          <w:iCs/>
+        </w:rPr>
+        <w:t>include</w:t>
+      </w:r>
+      <w:proofErr w:type="spellEnd"/>
+      <w:r>
+        <w:rPr>
+          <w:rFonts w:eastAsiaTheme="minorEastAsia"/>
+          <w:i/>
+          <w:iCs/>
+        </w:rPr>
+        <w:t>»</w:t>
       </w:r>
       <w:r>
         <w:rPr>
@@ -4708,7 +4726,23 @@
                 <w:sz w:val="20"/>
                 <w:szCs w:val="20"/>
               </w:rPr>
-              <w:t>1a. Logowanie przez Biometrię: Użytkownik używa odcisku palca/FaceID zamiast hasła.</w:t>
+              <w:t>1a. Logowanie przez Biometrię: Użytkownik używa odcisku palca/</w:t>
+            </w:r>
+            <w:proofErr w:type="spellStart"/>
+            <w:r>
+              <w:rPr>
+                <w:sz w:val="20"/>
+                <w:szCs w:val="20"/>
+              </w:rPr>
+              <w:t>FaceID</w:t>
+            </w:r>
+            <w:proofErr w:type="spellEnd"/>
+            <w:r>
+              <w:rPr>
+                <w:sz w:val="20"/>
+                <w:szCs w:val="20"/>
+              </w:rPr>
+              <w:t xml:space="preserve"> zamiast hasła.</w:t>
             </w:r>
           </w:p>
           <w:p>
@@ -4737,7 +4771,39 @@
                 <w:sz w:val="20"/>
                 <w:szCs w:val="20"/>
               </w:rPr>
-              <w:t>1b. Logowanie przez Social Media: System weryfikuje token z zewnętrznego serwisu (np. Google).</w:t>
+              <w:t xml:space="preserve">1b. Logowanie przez </w:t>
+            </w:r>
+            <w:proofErr w:type="spellStart"/>
+            <w:r>
+              <w:rPr>
+                <w:sz w:val="20"/>
+                <w:szCs w:val="20"/>
+              </w:rPr>
+              <w:t>Social</w:t>
+            </w:r>
+            <w:proofErr w:type="spellEnd"/>
+            <w:r>
+              <w:rPr>
+                <w:sz w:val="20"/>
+                <w:szCs w:val="20"/>
+              </w:rPr>
+              <w:t xml:space="preserve"> Media: System weryfikuje </w:t>
+            </w:r>
+            <w:proofErr w:type="spellStart"/>
+            <w:r>
+              <w:rPr>
+                <w:sz w:val="20"/>
+                <w:szCs w:val="20"/>
+              </w:rPr>
+              <w:t>token</w:t>
+            </w:r>
+            <w:proofErr w:type="spellEnd"/>
+            <w:r>
+              <w:rPr>
+                <w:sz w:val="20"/>
+                <w:szCs w:val="20"/>
+              </w:rPr>
+              <w:t xml:space="preserve"> z zewnętrznego serwisu (np. Google).</w:t>
             </w:r>
           </w:p>
         </w:tc>
@@ -5022,7 +5088,7 @@
           <w:noProof/>
         </w:rPr>
         <w:drawing>
-          <wp:inline distT="0" distB="0" distL="0" distR="0" wp14:anchorId="751F6ADB" wp14:editId="03BF38E8">
+          <wp:inline distT="0" distB="0" distL="0" distR="0" wp14:anchorId="751F6ADB" wp14:editId="0901C564">
             <wp:extent cx="5721350" cy="2984500"/>
             <wp:effectExtent l="0" t="0" r="0" b="6350"/>
             <wp:docPr id="1442175989" name="Obraz 1"/>
@@ -6178,7 +6244,23 @@
                 <w:sz w:val="20"/>
                 <w:szCs w:val="20"/>
               </w:rPr>
-              <w:t>4a. Pojazd zajęty: Inny użytkownik zarezerwował pojazd milisekundy wcześniej (Race Condition).</w:t>
+              <w:t xml:space="preserve">4a. Pojazd zajęty: Inny użytkownik zarezerwował pojazd milisekundy wcześniej (Race </w:t>
+            </w:r>
+            <w:proofErr w:type="spellStart"/>
+            <w:r>
+              <w:rPr>
+                <w:sz w:val="20"/>
+                <w:szCs w:val="20"/>
+              </w:rPr>
+              <w:t>Condition</w:t>
+            </w:r>
+            <w:proofErr w:type="spellEnd"/>
+            <w:r>
+              <w:rPr>
+                <w:sz w:val="20"/>
+                <w:szCs w:val="20"/>
+              </w:rPr>
+              <w:t>).</w:t>
             </w:r>
           </w:p>
           <w:p>
@@ -7563,7 +7645,23 @@
                 <w:sz w:val="20"/>
                 <w:szCs w:val="20"/>
               </w:rPr>
-              <w:t>3a. Błąd modułu IoT: Pojazd nie odpowiada na sygnał otwarcia.</w:t>
+              <w:t xml:space="preserve">3a. Błąd modułu </w:t>
+            </w:r>
+            <w:proofErr w:type="spellStart"/>
+            <w:r>
+              <w:rPr>
+                <w:sz w:val="20"/>
+                <w:szCs w:val="20"/>
+              </w:rPr>
+              <w:t>IoT</w:t>
+            </w:r>
+            <w:proofErr w:type="spellEnd"/>
+            <w:r>
+              <w:rPr>
+                <w:sz w:val="20"/>
+                <w:szCs w:val="20"/>
+              </w:rPr>
+              <w:t>: Pojazd nie odpowiada na sygnał otwarcia.</w:t>
             </w:r>
           </w:p>
           <w:p>
@@ -10016,7 +10114,23 @@
                 <w:sz w:val="20"/>
                 <w:szCs w:val="20"/>
               </w:rPr>
-              <w:t>Wyświetlenie aktualnego stanu floty na dashboardzie.</w:t>
+              <w:t xml:space="preserve">Wyświetlenie aktualnego stanu floty na </w:t>
+            </w:r>
+            <w:proofErr w:type="spellStart"/>
+            <w:r>
+              <w:rPr>
+                <w:sz w:val="20"/>
+                <w:szCs w:val="20"/>
+              </w:rPr>
+              <w:t>dashboardzie</w:t>
+            </w:r>
+            <w:proofErr w:type="spellEnd"/>
+            <w:r>
+              <w:rPr>
+                <w:sz w:val="20"/>
+                <w:szCs w:val="20"/>
+              </w:rPr>
+              <w:t>.</w:t>
             </w:r>
           </w:p>
         </w:tc>
@@ -10093,7 +10207,23 @@
                 <w:sz w:val="20"/>
                 <w:szCs w:val="20"/>
               </w:rPr>
-              <w:t>1. Moduły IoT w pojazdach wysyłają pakiety danych (GPS, paliwo, błędy).</w:t>
+              <w:t xml:space="preserve">1. Moduły </w:t>
+            </w:r>
+            <w:proofErr w:type="spellStart"/>
+            <w:r>
+              <w:rPr>
+                <w:sz w:val="20"/>
+                <w:szCs w:val="20"/>
+              </w:rPr>
+              <w:t>IoT</w:t>
+            </w:r>
+            <w:proofErr w:type="spellEnd"/>
+            <w:r>
+              <w:rPr>
+                <w:sz w:val="20"/>
+                <w:szCs w:val="20"/>
+              </w:rPr>
+              <w:t xml:space="preserve"> w pojazdach wysyłają pakiety danych (GPS, paliwo, błędy).</w:t>
             </w:r>
             <w:r>
               <w:rPr>
@@ -10295,7 +10425,23 @@
                 <w:sz w:val="20"/>
                 <w:szCs w:val="20"/>
               </w:rPr>
-              <w:t>1a. Utrata sygnału (Dead Zone): System oznacza pojazd jako "Offline" i podświetla na czerwono.</w:t>
+              <w:t>1a. Utrata sygnału (</w:t>
+            </w:r>
+            <w:proofErr w:type="spellStart"/>
+            <w:r>
+              <w:rPr>
+                <w:sz w:val="20"/>
+                <w:szCs w:val="20"/>
+              </w:rPr>
+              <w:t>Dead</w:t>
+            </w:r>
+            <w:proofErr w:type="spellEnd"/>
+            <w:r>
+              <w:rPr>
+                <w:sz w:val="20"/>
+                <w:szCs w:val="20"/>
+              </w:rPr>
+              <w:t xml:space="preserve"> Zone): System oznacza pojazd jako "Offline" i podświetla na czerwono.</w:t>
             </w:r>
           </w:p>
         </w:tc>
@@ -10449,7 +10595,23 @@
                 <w:sz w:val="20"/>
                 <w:szCs w:val="20"/>
               </w:rPr>
-              <w:t>Kwestia RODO: Czy dane o lokalizacji przejazdu użytkownika powinny być anonimizowane po 30 dniach?</w:t>
+              <w:t xml:space="preserve">Kwestia RODO: Czy dane o lokalizacji przejazdu użytkownika powinny być </w:t>
+            </w:r>
+            <w:proofErr w:type="spellStart"/>
+            <w:r>
+              <w:rPr>
+                <w:sz w:val="20"/>
+                <w:szCs w:val="20"/>
+              </w:rPr>
+              <w:t>anonimizowane</w:t>
+            </w:r>
+            <w:proofErr w:type="spellEnd"/>
+            <w:r>
+              <w:rPr>
+                <w:sz w:val="20"/>
+                <w:szCs w:val="20"/>
+              </w:rPr>
+              <w:t xml:space="preserve"> po 30 dniach?</w:t>
             </w:r>
           </w:p>
         </w:tc>
@@ -11810,7 +11972,7 @@
           <w:noProof/>
         </w:rPr>
         <w:drawing>
-          <wp:anchor distT="0" distB="0" distL="114300" distR="114300" simplePos="0" relativeHeight="251668480" behindDoc="0" locked="0" layoutInCell="1" allowOverlap="1" wp14:anchorId="13C85C93" wp14:editId="3936BB61">
+          <wp:anchor distT="0" distB="0" distL="114300" distR="114300" simplePos="0" relativeHeight="251668480" behindDoc="0" locked="0" layoutInCell="1" allowOverlap="1" wp14:anchorId="13C85C93" wp14:editId="3C32EED9">
             <wp:simplePos x="0" y="0"/>
             <wp:positionH relativeFrom="margin">
               <wp:align>center</wp:align>
@@ -12951,7 +13113,23 @@
                 <w:sz w:val="20"/>
                 <w:szCs w:val="20"/>
               </w:rPr>
-              <w:t>4a. Błąd nakładania (Overlap): System wykrywa konflikt reguł w tym samym miejscu.</w:t>
+              <w:t>4a. Błąd nakładania (</w:t>
+            </w:r>
+            <w:proofErr w:type="spellStart"/>
+            <w:r>
+              <w:rPr>
+                <w:sz w:val="20"/>
+                <w:szCs w:val="20"/>
+              </w:rPr>
+              <w:t>Overlap</w:t>
+            </w:r>
+            <w:proofErr w:type="spellEnd"/>
+            <w:r>
+              <w:rPr>
+                <w:sz w:val="20"/>
+                <w:szCs w:val="20"/>
+              </w:rPr>
+              <w:t>): System wykrywa konflikt reguł w tym samym miejscu.</w:t>
             </w:r>
           </w:p>
         </w:tc>
@@ -14450,7 +14628,7 @@
           <w:noProof/>
         </w:rPr>
         <w:drawing>
-          <wp:anchor distT="0" distB="0" distL="114300" distR="114300" simplePos="0" relativeHeight="251670528" behindDoc="0" locked="0" layoutInCell="1" allowOverlap="1" wp14:anchorId="4306967F" wp14:editId="4FE2572A">
+          <wp:anchor distT="0" distB="0" distL="114300" distR="114300" simplePos="0" relativeHeight="251670528" behindDoc="0" locked="0" layoutInCell="1" allowOverlap="1" wp14:anchorId="4306967F" wp14:editId="29C66C3B">
             <wp:simplePos x="0" y="0"/>
             <wp:positionH relativeFrom="margin">
               <wp:align>center</wp:align>
@@ -14817,11 +14995,117 @@
     <w:p/>
     <w:p>
       <w:r>
-        <w:t>..</w:t>
+        <w:rPr>
+          <w:noProof/>
+        </w:rPr>
+        <w:drawing>
+          <wp:inline distT="0" distB="0" distL="0" distR="0" wp14:anchorId="4FD13472" wp14:editId="27D5D31B">
+            <wp:extent cx="5721350" cy="3854450"/>
+            <wp:effectExtent l="0" t="0" r="0" b="0"/>
+            <wp:docPr id="1604792556" name="Obraz 1"/>
+            <wp:cNvGraphicFramePr>
+              <a:graphicFrameLocks xmlns:a="http://schemas.openxmlformats.org/drawingml/2006/main" noChangeAspect="1"/>
+            </wp:cNvGraphicFramePr>
+            <a:graphic xmlns:a="http://schemas.openxmlformats.org/drawingml/2006/main">
+              <a:graphicData uri="http://schemas.openxmlformats.org/drawingml/2006/picture">
+                <pic:pic xmlns:pic="http://schemas.openxmlformats.org/drawingml/2006/picture">
+                  <pic:nvPicPr>
+                    <pic:cNvPr id="0" name="Picture 1"/>
+                    <pic:cNvPicPr>
+                      <a:picLocks noChangeAspect="1" noChangeArrowheads="1"/>
+                    </pic:cNvPicPr>
+                  </pic:nvPicPr>
+                  <pic:blipFill>
+                    <a:blip r:embed="rId23">
+                      <a:extLst>
+                        <a:ext uri="{28A0092B-C50C-407E-A947-70E740481C1C}">
+                          <a14:useLocalDpi xmlns:a14="http://schemas.microsoft.com/office/drawing/2010/main" val="0"/>
+                        </a:ext>
+                      </a:extLst>
+                    </a:blip>
+                    <a:srcRect/>
+                    <a:stretch>
+                      <a:fillRect/>
+                    </a:stretch>
+                  </pic:blipFill>
+                  <pic:spPr bwMode="auto">
+                    <a:xfrm>
+                      <a:off x="0" y="0"/>
+                      <a:ext cx="5721350" cy="3854450"/>
+                    </a:xfrm>
+                    <a:prstGeom prst="rect">
+                      <a:avLst/>
+                    </a:prstGeom>
+                    <a:noFill/>
+                    <a:ln>
+                      <a:noFill/>
+                    </a:ln>
+                  </pic:spPr>
+                </pic:pic>
+              </a:graphicData>
+            </a:graphic>
+          </wp:inline>
+        </w:drawing>
       </w:r>
     </w:p>
+    <w:p>
+      <w:r>
+        <w:rPr>
+          <w:noProof/>
+        </w:rPr>
+        <w:drawing>
+          <wp:inline distT="0" distB="0" distL="0" distR="0" wp14:anchorId="5110768B" wp14:editId="7FA09420">
+            <wp:extent cx="5727700" cy="3867150"/>
+            <wp:effectExtent l="0" t="0" r="6350" b="0"/>
+            <wp:docPr id="393272810" name="Obraz 2"/>
+            <wp:cNvGraphicFramePr>
+              <a:graphicFrameLocks xmlns:a="http://schemas.openxmlformats.org/drawingml/2006/main" noChangeAspect="1"/>
+            </wp:cNvGraphicFramePr>
+            <a:graphic xmlns:a="http://schemas.openxmlformats.org/drawingml/2006/main">
+              <a:graphicData uri="http://schemas.openxmlformats.org/drawingml/2006/picture">
+                <pic:pic xmlns:pic="http://schemas.openxmlformats.org/drawingml/2006/picture">
+                  <pic:nvPicPr>
+                    <pic:cNvPr id="0" name="Picture 2"/>
+                    <pic:cNvPicPr>
+                      <a:picLocks noChangeAspect="1" noChangeArrowheads="1"/>
+                    </pic:cNvPicPr>
+                  </pic:nvPicPr>
+                  <pic:blipFill>
+                    <a:blip r:embed="rId24">
+                      <a:extLst>
+                        <a:ext uri="{28A0092B-C50C-407E-A947-70E740481C1C}">
+                          <a14:useLocalDpi xmlns:a14="http://schemas.microsoft.com/office/drawing/2010/main" val="0"/>
+                        </a:ext>
+                      </a:extLst>
+                    </a:blip>
+                    <a:srcRect/>
+                    <a:stretch>
+                      <a:fillRect/>
+                    </a:stretch>
+                  </pic:blipFill>
+                  <pic:spPr bwMode="auto">
+                    <a:xfrm>
+                      <a:off x="0" y="0"/>
+                      <a:ext cx="5727700" cy="3867150"/>
+                    </a:xfrm>
+                    <a:prstGeom prst="rect">
+                      <a:avLst/>
+                    </a:prstGeom>
+                    <a:noFill/>
+                    <a:ln>
+                      <a:noFill/>
+                    </a:ln>
+                  </pic:spPr>
+                </pic:pic>
+              </a:graphicData>
+            </a:graphic>
+          </wp:inline>
+        </w:drawing>
+      </w:r>
+    </w:p>
+    <w:p/>
     <w:sectPr>
-      <w:footerReference w:type="default" r:id="rId23"/>
+      <w:footerReference w:type="default" r:id="rId25"/>
       <w:pgSz w:w="11906" w:h="16838"/>
       <w:pgMar w:top="1440" w:right="1440" w:bottom="1440" w:left="1440" w:header="708" w:footer="708" w:gutter="0"/>
       <w:cols w:space="708"/>

</xml_diff>